<commit_message>
Actividad didáctica y hallazgos realizados
</commit_message>
<xml_diff>
--- a/fuentes/722103_CF23_DU.docx
+++ b/fuentes/722103_CF23_DU.docx
@@ -1,6 +1,6 @@
 
 <file path=word/document.xml><?xml version="1.0" encoding="utf-8"?>
-<w:document xmlns:wpc="http://schemas.microsoft.com/office/word/2010/wordprocessingCanvas" xmlns:cx="http://schemas.microsoft.com/office/drawing/2014/chartex" xmlns:cx1="http://schemas.microsoft.com/office/drawing/2015/9/8/chartex" xmlns:cx2="http://schemas.microsoft.com/office/drawing/2015/10/21/chartex" xmlns:cx3="http://schemas.microsoft.com/office/drawing/2016/5/9/chartex" xmlns:cx4="http://schemas.microsoft.com/office/drawing/2016/5/10/chartex" xmlns:cx5="http://schemas.microsoft.com/office/drawing/2016/5/11/chartex" xmlns:cx6="http://schemas.microsoft.com/office/drawing/2016/5/12/chartex" xmlns:cx7="http://schemas.microsoft.com/office/drawing/2016/5/13/chartex" xmlns:cx8="http://schemas.microsoft.com/office/drawing/2016/5/14/chartex" xmlns:mc="http://schemas.openxmlformats.org/markup-compatibility/2006" xmlns:aink="http://schemas.microsoft.com/office/drawing/2016/ink" xmlns:am3d="http://schemas.microsoft.com/office/drawing/2017/model3d" xmlns:o="urn:schemas-microsoft-com:office:office" xmlns:oel="http://schemas.microsoft.com/office/2019/extlst" xmlns:r="http://schemas.openxmlformats.org/officeDocument/2006/relationships" xmlns:m="http://schemas.openxmlformats.org/officeDocument/2006/math" xmlns:v="urn:schemas-microsoft-com:vml" xmlns:wp14="http://schemas.microsoft.com/office/word/2010/wordprocessingDrawing" xmlns:wp="http://schemas.openxmlformats.org/drawingml/2006/wordprocessingDrawing" xmlns:w10="urn:schemas-microsoft-com:office:word" xmlns:w="http://schemas.openxmlformats.org/wordprocessingml/2006/main" xmlns:w14="http://schemas.microsoft.com/office/word/2010/wordml" xmlns:w15="http://schemas.microsoft.com/office/word/2012/wordml" xmlns:w16cex="http://schemas.microsoft.com/office/word/2018/wordml/cex" xmlns:w16cid="http://schemas.microsoft.com/office/word/2016/wordml/cid" xmlns:w16="http://schemas.microsoft.com/office/word/2018/wordml" xmlns:w16du="http://schemas.microsoft.com/office/word/2023/wordml/word16du" xmlns:w16sdtdh="http://schemas.microsoft.com/office/word/2020/wordml/sdtdatahash" xmlns:w16se="http://schemas.microsoft.com/office/word/2015/wordml/symex" xmlns:wpg="http://schemas.microsoft.com/office/word/2010/wordprocessingGroup" xmlns:wpi="http://schemas.microsoft.com/office/word/2010/wordprocessingInk" xmlns:wne="http://schemas.microsoft.com/office/word/2006/wordml" xmlns:wps="http://schemas.microsoft.com/office/word/2010/wordprocessingShape" mc:Ignorable="w14 w15 w16se w16cid w16 w16cex w16sdtdh w16du wp14">
+<w:document xmlns:wpc="http://schemas.microsoft.com/office/word/2010/wordprocessingCanvas" xmlns:cx="http://schemas.microsoft.com/office/drawing/2014/chartex" xmlns:cx1="http://schemas.microsoft.com/office/drawing/2015/9/8/chartex" xmlns:cx2="http://schemas.microsoft.com/office/drawing/2015/10/21/chartex" xmlns:cx3="http://schemas.microsoft.com/office/drawing/2016/5/9/chartex" xmlns:cx4="http://schemas.microsoft.com/office/drawing/2016/5/10/chartex" xmlns:cx5="http://schemas.microsoft.com/office/drawing/2016/5/11/chartex" xmlns:cx6="http://schemas.microsoft.com/office/drawing/2016/5/12/chartex" xmlns:cx7="http://schemas.microsoft.com/office/drawing/2016/5/13/chartex" xmlns:cx8="http://schemas.microsoft.com/office/drawing/2016/5/14/chartex" xmlns:mc="http://schemas.openxmlformats.org/markup-compatibility/2006" xmlns:aink="http://schemas.microsoft.com/office/drawing/2016/ink" xmlns:am3d="http://schemas.microsoft.com/office/drawing/2017/model3d" xmlns:o="urn:schemas-microsoft-com:office:office" xmlns:r="http://schemas.openxmlformats.org/officeDocument/2006/relationships" xmlns:m="http://schemas.openxmlformats.org/officeDocument/2006/math" xmlns:v="urn:schemas-microsoft-com:vml" xmlns:wp14="http://schemas.microsoft.com/office/word/2010/wordprocessingDrawing" xmlns:wp="http://schemas.openxmlformats.org/drawingml/2006/wordprocessingDrawing" xmlns:w10="urn:schemas-microsoft-com:office:word" xmlns:w="http://schemas.openxmlformats.org/wordprocessingml/2006/main" xmlns:w14="http://schemas.microsoft.com/office/word/2010/wordml" xmlns:w15="http://schemas.microsoft.com/office/word/2012/wordml" xmlns:w16cex="http://schemas.microsoft.com/office/word/2018/wordml/cex" xmlns:w16cid="http://schemas.microsoft.com/office/word/2016/wordml/cid" xmlns:w16="http://schemas.microsoft.com/office/word/2018/wordml" xmlns:w16sdtdh="http://schemas.microsoft.com/office/word/2020/wordml/sdtdatahash" xmlns:w16se="http://schemas.microsoft.com/office/word/2015/wordml/symex" xmlns:wpg="http://schemas.microsoft.com/office/word/2010/wordprocessingGroup" xmlns:wpi="http://schemas.microsoft.com/office/word/2010/wordprocessingInk" xmlns:wne="http://schemas.microsoft.com/office/word/2006/wordml" xmlns:wps="http://schemas.microsoft.com/office/word/2010/wordprocessingShape" mc:Ignorable="w14 w15 w16se w16cid w16 w16cex w16sdtdh wp14">
   <w:body>
     <w:p>
       <w:r>
@@ -199,7 +199,7 @@
               </wp:anchor>
             </w:drawing>
           </mc:Choice>
-          <mc:Fallback>
+          <mc:Fallback xmlns:oel="http://schemas.microsoft.com/office/2019/extlst" xmlns:w16du="http://schemas.microsoft.com/office/word/2023/wordml/word16du">
             <w:pict>
               <v:rect w14:anchorId="04BF2410" id="Rectángulo 3" o:spid="_x0000_s1026" alt="&quot;&quot;" style="position:absolute;margin-left:-55.7pt;margin-top:26.5pt;width:613.85pt;height:204pt;z-index:-251655168;visibility:visible;mso-wrap-style:square;mso-height-percent:0;mso-wrap-distance-left:9pt;mso-wrap-distance-top:0;mso-wrap-distance-right:9pt;mso-wrap-distance-bottom:0;mso-position-horizontal:absolute;mso-position-horizontal-relative:text;mso-position-vertical:absolute;mso-position-vertical-relative:text;mso-height-percent:0;mso-height-relative:margin;v-text-anchor:middle" o:gfxdata="UEsDBBQABgAIAAAAIQC2gziS/gAAAOEBAAATAAAAW0NvbnRlbnRfVHlwZXNdLnhtbJSRQU7DMBBF&#10;90jcwfIWJU67QAgl6YK0S0CoHGBkTxKLZGx5TGhvj5O2G0SRWNoz/78nu9wcxkFMGNg6quQqL6RA&#10;0s5Y6ir5vt9lD1JwBDIwOMJKHpHlpr69KfdHjyxSmriSfYz+USnWPY7AufNIadK6MEJMx9ApD/oD&#10;OlTrorhX2lFEilmcO2RdNtjC5xDF9pCuTyYBB5bi6bQ4syoJ3g9WQ0ymaiLzg5KdCXlKLjvcW893&#10;SUOqXwnz5DrgnHtJTxOsQfEKIT7DmDSUCaxw7Rqn8787ZsmRM9e2VmPeBN4uqYvTtW7jvijg9N/y&#10;JsXecLq0q+WD6m8AAAD//wMAUEsDBBQABgAIAAAAIQA4/SH/1gAAAJQBAAALAAAAX3JlbHMvLnJl&#10;bHOkkMFqwzAMhu+DvYPRfXGawxijTi+j0GvpHsDYimMaW0Yy2fr2M4PBMnrbUb/Q94l/f/hMi1qR&#10;JVI2sOt6UJgd+ZiDgffL8ekFlFSbvV0oo4EbChzGx4f9GRdb25HMsYhqlCwG5lrLq9biZkxWOiqY&#10;22YiTra2kYMu1l1tQD30/bPm3wwYN0x18gb45AdQl1tp5j/sFB2T0FQ7R0nTNEV3j6o9feQzro1i&#10;OWA14Fm+Q8a1a8+Bvu/d/dMb2JY5uiPbhG/ktn4cqGU/er3pcvwCAAD//wMAUEsDBBQABgAIAAAA&#10;IQBzho4mgwIAAGAFAAAOAAAAZHJzL2Uyb0RvYy54bWysVE1v2zAMvQ/YfxB0X+1kydoEdYqgRYcB&#10;RVesHXpWZCk2IIsapcTJfv0o+SNdV+wwLAdFEh8fyWdSl1eHxrC9Ql+DLfjkLOdMWQllbbcF//50&#10;++GCMx+ELYUBqwp+VJ5frd6/u2zdUk2hAlMqZERi/bJ1Ba9CcMss87JSjfBn4JQlowZsRKAjbrMS&#10;RUvsjcmmef4pawFLhyCV93R70xn5KvFrrWT4qrVXgZmCU24hrZjWTVyz1aVYblG4qpZ9GuIfsmhE&#10;bSnoSHUjgmA7rP+gamqJ4EGHMwlNBlrXUqUaqJpJ/qqax0o4lWohcbwbZfL/j1be7x/dA5IMrfNL&#10;T9tYxUFjE/8pP3ZIYh1HsdQhMEmX5+eL+cVizpkk23S+yC/yJGd2cnfow2cFDYubgiN9jSSS2N/5&#10;QCEJOkBiNA+mLm9rY9IBt5trg2wv4pfLP05mN/FjkctvMGMj2EJ068zxJjsVk3bhaFTEGftNaVaX&#10;lP40ZZL6TI1xhJTKhklnqkSpuvDznH5D9NiZ0SPlkggjs6b4I3dPMCA7koG7y7LHR1eV2nR0zv+W&#10;WOc8eqTIYMPo3NQW8C0CQ1X1kTv8IFInTVRpA+XxARlCNyTeyduavtud8OFBIE0FzQ9NevhKizbQ&#10;Fhz6HWcV4M+37iOempWsnLU0ZQX3P3YCFWfmi6U2XkxmsziW6TCbn0/pgC8tm5cWu2uugdphQm+K&#10;k2kb8cEMW43QPNODsI5RySSspNgFlwGHw3Xopp+eFKnW6wSjUXQi3NlHJyN5VDX25dPhWaDrmzdQ&#10;39/DMJFi+aqHO2z0tLDeBdB1avCTrr3eNMapcfonJ74TL88JdXoYV78AAAD//wMAUEsDBBQABgAI&#10;AAAAIQCBp6Dt3wAAAAwBAAAPAAAAZHJzL2Rvd25yZXYueG1sTI/BbsIwEETvSP0HaytxA8cFoiqN&#10;gyrUiFulQA89mnhJosbrYBtI/r7m1B5X+zTzJt+Opmc3dL6zJEEsE2BItdUdNRK+juXiFZgPirTq&#10;LaGECT1si6dZrjJt71Th7RAaFkPIZ0pCG8KQce7rFo3ySzsgxd/ZOqNCPF3DtVP3GG56/pIkKTeq&#10;o9jQqgF3LdY/h6uR8P2xw32Fl8/JuUlc6KzLqgxSzp/H9zdgAcfwB8NDP6pDEZ1O9kras17CQgix&#10;jqyEzSqOehBCpCtgJwnrVCTAi5z/H1H8AgAA//8DAFBLAQItABQABgAIAAAAIQC2gziS/gAAAOEB&#10;AAATAAAAAAAAAAAAAAAAAAAAAABbQ29udGVudF9UeXBlc10ueG1sUEsBAi0AFAAGAAgAAAAhADj9&#10;If/WAAAAlAEAAAsAAAAAAAAAAAAAAAAALwEAAF9yZWxzLy5yZWxzUEsBAi0AFAAGAAgAAAAhAHOG&#10;jiaDAgAAYAUAAA4AAAAAAAAAAAAAAAAALgIAAGRycy9lMm9Eb2MueG1sUEsBAi0AFAAGAAgAAAAh&#10;AIGnoO3fAAAADAEAAA8AAAAAAAAAAAAAAAAA3QQAAGRycy9kb3ducmV2LnhtbFBLBQYAAAAABAAE&#10;APMAAADpBQAAAAA=&#10;" fillcolor="#00314d" stroked="f" strokeweight="1pt"/>
             </w:pict>
@@ -300,7 +300,7 @@
                 <v:stroke joinstyle="miter"/>
                 <v:path gradientshapeok="t" o:connecttype="rect"/>
               </v:shapetype>
-              <v:shape id="Cuadro de texto 2" o:spid="_x0000_s1026" type="#_x0000_t202" alt="&quot;&quot;" style="position:absolute;left:0;text-align:left;margin-left:-19.8pt;margin-top:36.75pt;width:488.95pt;height:115.5pt;z-index:251663360;visibility:visible;mso-wrap-style:square;mso-width-percent:0;mso-height-percent:0;mso-wrap-distance-left:9pt;mso-wrap-distance-top:3.6pt;mso-wrap-distance-right:9pt;mso-wrap-distance-bottom:3.6pt;mso-position-horizontal:absolute;mso-position-horizontal-relative:text;mso-position-vertical:absolute;mso-position-vertical-relative:text;mso-width-percent:0;mso-height-percent:0;mso-width-relative:margin;mso-height-relative:margin;v-text-anchor:top" o:gfxdata="UEsDBBQABgAIAAAAIQC2gziS/gAAAOEBAAATAAAAW0NvbnRlbnRfVHlwZXNdLnhtbJSRQU7DMBBF&#10;90jcwfIWJU67QAgl6YK0S0CoHGBkTxKLZGx5TGhvj5O2G0SRWNoz/78nu9wcxkFMGNg6quQqL6RA&#10;0s5Y6ir5vt9lD1JwBDIwOMJKHpHlpr69KfdHjyxSmriSfYz+USnWPY7AufNIadK6MEJMx9ApD/oD&#10;OlTrorhX2lFEilmcO2RdNtjC5xDF9pCuTyYBB5bi6bQ4syoJ3g9WQ0ymaiLzg5KdCXlKLjvcW893&#10;SUOqXwnz5DrgnHtJTxOsQfEKIT7DmDSUCaxw7Rqn8787ZsmRM9e2VmPeBN4uqYvTtW7jvijg9N/y&#10;JsXecLq0q+WD6m8AAAD//wMAUEsDBBQABgAIAAAAIQA4/SH/1gAAAJQBAAALAAAAX3JlbHMvLnJl&#10;bHOkkMFqwzAMhu+DvYPRfXGawxijTi+j0GvpHsDYimMaW0Yy2fr2M4PBMnrbUb/Q94l/f/hMi1qR&#10;JVI2sOt6UJgd+ZiDgffL8ekFlFSbvV0oo4EbChzGx4f9GRdb25HMsYhqlCwG5lrLq9biZkxWOiqY&#10;22YiTra2kYMu1l1tQD30/bPm3wwYN0x18gb45AdQl1tp5j/sFB2T0FQ7R0nTNEV3j6o9feQzro1i&#10;OWA14Fm+Q8a1a8+Bvu/d/dMb2JY5uiPbhG/ktn4cqGU/er3pcvwCAAD//wMAUEsDBBQABgAIAAAA&#10;IQDfOrHZ3QEAAKQDAAAOAAAAZHJzL2Uyb0RvYy54bWysU8tu2zAQvBfoPxC815IMW00Ey0GaIEWB&#10;9AGk/QCKIi2hEpdd0pbcr++Skh23uQW9EOQud7gzO9zcjH3HDgpdC6bk2SLlTBkJdWt2Jf/x/eHd&#10;FWfOC1OLDowq+VE5frN9+2Yz2EItoYGuVsgIxLhisCVvvLdFkjjZqF64BVhlKKkBe+HpiLukRjEQ&#10;et8lyzTNkwGwtghSOUfR+ynJtxFfayX9V62d8qwrOfXm44pxrcKabDei2KGwTSvnNsQruuhFa+jR&#10;M9S98ILtsX0B1bcSwYH2Cwl9Alq3UkUOxCZL/2Hz1AirIhcSx9mzTO7/wcovhyf7DZkfP8BIA4wk&#10;nH0E+dMxA3eNMDt1iwhDo0RND2dBsmSwrphLg9SucAGkGj5DTUMWew8RaNTYB1WIJyN0GsDxLLoa&#10;PZMUzJfpdZ6vOZOUy1Z5frWOY0lEcSq36PxHBT0Lm5IjTTXCi8Oj86EdUZyuhNcMPLRdFyfbmb8C&#10;dHGKqGiNufrU/8TEj9VItSFYQX0kWgiTbcjmtGkAf3M2kGVK7n7tBSrOuk+GpLnOVqvgsXhYrd8v&#10;6YCXmeoyI4wkqJJ7zqbtnY++nBq+JQl1G8k9dzILT1aInGfbBq9dnuOt58+1/QMAAP//AwBQSwME&#10;FAAGAAgAAAAhAB0IzyDfAAAACgEAAA8AAABkcnMvZG93bnJldi54bWxMj8tOwzAQRfdI/IM1SOxa&#10;G9yUJmRSIRBbEOUhsXPjaRIRj6PYbcLfY1awHN2je8+U29n14kRj6DwjXC0VCOLa244bhLfXx8UG&#10;RIiGrek9E8I3BdhW52elKayf+IVOu9iIVMKhMAhtjEMhZahbciYs/UCcsoMfnYnpHBtpRzOlctfL&#10;a6XW0pmO00JrBrpvqf7aHR3C+9Ph82OlnpsHlw2Tn5Vkl0vEy4v57hZEpDn+wfCrn9ShSk57f2Qb&#10;RI+w0Pk6oQg3OgORgFxvNIg9glarDGRVyv8vVD8AAAD//wMAUEsBAi0AFAAGAAgAAAAhALaDOJL+&#10;AAAA4QEAABMAAAAAAAAAAAAAAAAAAAAAAFtDb250ZW50X1R5cGVzXS54bWxQSwECLQAUAAYACAAA&#10;ACEAOP0h/9YAAACUAQAACwAAAAAAAAAAAAAAAAAvAQAAX3JlbHMvLnJlbHNQSwECLQAUAAYACAAA&#10;ACEA3zqx2d0BAACkAwAADgAAAAAAAAAAAAAAAAAuAgAAZHJzL2Uyb0RvYy54bWxQSwECLQAUAAYA&#10;CAAAACEAHQjPIN8AAAAKAQAADwAAAAAAAAAAAAAAAAA3BAAAZHJzL2Rvd25yZXYueG1sUEsFBgAA&#10;AAAEAAQA8wAAAEMFAAAAAA==&#10;" filled="f" stroked="f">
+              <v:shape id="Cuadro de texto 2" o:spid="_x0000_s1026" type="#_x0000_t202" alt="&quot;&quot;" style="position:absolute;left:0;text-align:left;margin-left:-19.8pt;margin-top:36.75pt;width:488.95pt;height:115.5pt;z-index:251663360;visibility:visible;mso-wrap-style:square;mso-width-percent:0;mso-height-percent:0;mso-wrap-distance-left:9pt;mso-wrap-distance-top:3.6pt;mso-wrap-distance-right:9pt;mso-wrap-distance-bottom:3.6pt;mso-position-horizontal:absolute;mso-position-horizontal-relative:text;mso-position-vertical:absolute;mso-position-vertical-relative:text;mso-width-percent:0;mso-height-percent:0;mso-width-relative:margin;mso-height-relative:margin;v-text-anchor:top" o:gfxdata="UEsDBBQABgAIAAAAIQC2gziS/gAAAOEBAAATAAAAW0NvbnRlbnRfVHlwZXNdLnhtbJSRQU7DMBBF&#10;90jcwfIWJU67QAgl6YK0S0CoHGBkTxKLZGx5TGhvj5O2G0SRWNoz/78nu9wcxkFMGNg6quQqL6RA&#10;0s5Y6ir5vt9lD1JwBDIwOMJKHpHlpr69KfdHjyxSmriSfYz+USnWPY7AufNIadK6MEJMx9ApD/oD&#10;OlTrorhX2lFEilmcO2RdNtjC5xDF9pCuTyYBB5bi6bQ4syoJ3g9WQ0ymaiLzg5KdCXlKLjvcW893&#10;SUOqXwnz5DrgnHtJTxOsQfEKIT7DmDSUCaxw7Rqn8787ZsmRM9e2VmPeBN4uqYvTtW7jvijg9N/y&#10;JsXecLq0q+WD6m8AAAD//wMAUEsDBBQABgAIAAAAIQA4/SH/1gAAAJQBAAALAAAAX3JlbHMvLnJl&#10;bHOkkMFqwzAMhu+DvYPRfXGawxijTi+j0GvpHsDYimMaW0Yy2fr2M4PBMnrbUb/Q94l/f/hMi1qR&#10;JVI2sOt6UJgd+ZiDgffL8ekFlFSbvV0oo4EbChzGx4f9GRdb25HMsYhqlCwG5lrLq9biZkxWOiqY&#10;22YiTra2kYMu1l1tQD30/bPm3wwYN0x18gb45AdQl1tp5j/sFB2T0FQ7R0nTNEV3j6o9feQzro1i&#10;OWA14Fm+Q8a1a8+Bvu/d/dMb2JY5uiPbhG/ktn4cqGU/er3pcvwCAAD//wMAUEsDBBQABgAIAAAA&#10;IQDae1KK+QEAANIDAAAOAAAAZHJzL2Uyb0RvYy54bWysU9tu2zAMfR+wfxD0vjg2Erc14hRdig4D&#10;ugvQ7QMYWY6N2aJGKbGzrx8lp1m2vRV9ESSSOjqHPFrdjn0nDppci6aU6WwuhTYKq9bsSvn928O7&#10;aymcB1NBh0aX8qidvF2/fbMabKEzbLCrNAkGMa4YbCkb722RJE41ugc3Q6sNJ2ukHjwfaZdUBAOj&#10;912Szed5MiBVllBp5zh6PyXlOuLXtVb+S1077UVXSubm40px3YY1Wa+g2BHYplUnGvACFj20hh89&#10;Q92DB7Gn9j+ovlWEDms/U9gnWNet0lEDq0nn/6h5asDqqIWb4+y5Te71YNXnw1cSbVXKLL2SwkDP&#10;Q9rsoSIUlRZejx5FFto0WFdw9ZPlej++x5HHHSU7+4jqhxMGNw2Ynb4jwqHRUDHNNNxMLq5OOC6A&#10;bIdPWPFrsPcYgcaa+tBD7opgdB7X8Twi5iEUB/NsfpPnSykU59JFnl8v4xATKJ6vW3L+g8ZehE0p&#10;iT0Q4eHw6HygA8VzSXjN4EPbddEHnfkrwIVTREcjnW4HMYH/pMSP2/HUnC1WR5ZFOJmMPwVvGqRf&#10;UgxssFK6n3sgLUX30XBrbtLFIjgyHhbLq4wPdJnZXmbAKIYqpZdi2m58dPFE+I5bWLdRXKA3MTk1&#10;no0TNZ9MHpx5eY5Vf77i+jcAAAD//wMAUEsDBBQABgAIAAAAIQAdCM8g3wAAAAoBAAAPAAAAZHJz&#10;L2Rvd25yZXYueG1sTI/LTsMwEEX3SPyDNUjsWhvclCZkUiEQWxDlIbFz42kSEY+j2G3C32NWsBzd&#10;o3vPlNvZ9eJEY+g8I1wtFQji2tuOG4S318fFBkSIhq3pPRPCNwXYVudnpSmsn/iFTrvYiFTCoTAI&#10;bYxDIWWoW3ImLP1AnLKDH52J6RwbaUczpXLXy2ul1tKZjtNCawa6b6n+2h0dwvvT4fNjpZ6bB5cN&#10;k5+VZJdLxMuL+e4WRKQ5/sHwq5/UoUpOe39kG0SPsND5OqEINzoDkYBcbzSIPYJWqwxkVcr/L1Q/&#10;AAAA//8DAFBLAQItABQABgAIAAAAIQC2gziS/gAAAOEBAAATAAAAAAAAAAAAAAAAAAAAAABbQ29u&#10;dGVudF9UeXBlc10ueG1sUEsBAi0AFAAGAAgAAAAhADj9If/WAAAAlAEAAAsAAAAAAAAAAAAAAAAA&#10;LwEAAF9yZWxzLy5yZWxzUEsBAi0AFAAGAAgAAAAhANp7Uor5AQAA0gMAAA4AAAAAAAAAAAAAAAAA&#10;LgIAAGRycy9lMm9Eb2MueG1sUEsBAi0AFAAGAAgAAAAhAB0IzyDfAAAACgEAAA8AAAAAAAAAAAAA&#10;AAAAUwQAAGRycy9kb3ducmV2LnhtbFBLBQYAAAAABAAEAPMAAABfBQAAAAA=&#10;" filled="f" stroked="f">
                 <v:textbox>
                   <w:txbxContent>
                     <w:p>
@@ -422,7 +422,7 @@
     </w:p>
     <w:p>
       <w:pPr>
-        <w:jc w:val="center"/>
+        <w:ind w:left="3539"/>
       </w:pPr>
       <w:r>
         <w:rPr>
@@ -526,7 +526,7 @@
           <w:r>
             <w:fldChar w:fldCharType="separate"/>
           </w:r>
-          <w:hyperlink w:anchor="_Toc172307430" w:history="1">
+          <w:hyperlink w:anchor="_Toc173749608" w:history="1">
             <w:r>
               <w:rPr>
                 <w:rStyle w:val="Hipervnculo"/>
@@ -553,7 +553,7 @@
                 <w:noProof/>
                 <w:webHidden/>
               </w:rPr>
-              <w:instrText xml:space="preserve"> PAGEREF _Toc172307430 \h </w:instrText>
+              <w:instrText xml:space="preserve"> PAGEREF _Toc173749608 \h </w:instrText>
             </w:r>
             <w:r>
               <w:rPr>
@@ -600,7 +600,7 @@
               <w14:ligatures w14:val="none"/>
             </w:rPr>
           </w:pPr>
-          <w:hyperlink w:anchor="_Toc172307431" w:history="1">
+          <w:hyperlink w:anchor="_Toc173749609" w:history="1">
             <w:r>
               <w:rPr>
                 <w:rStyle w:val="Hipervnculo"/>
@@ -645,7 +645,7 @@
                 <w:noProof/>
                 <w:webHidden/>
               </w:rPr>
-              <w:instrText xml:space="preserve"> PAGEREF _Toc172307431 \h </w:instrText>
+              <w:instrText xml:space="preserve"> PAGEREF _Toc173749609 \h </w:instrText>
             </w:r>
             <w:r>
               <w:rPr>
@@ -692,7 +692,7 @@
               <w14:ligatures w14:val="none"/>
             </w:rPr>
           </w:pPr>
-          <w:hyperlink w:anchor="_Toc172307432" w:history="1">
+          <w:hyperlink w:anchor="_Toc173749610" w:history="1">
             <w:r>
               <w:rPr>
                 <w:rStyle w:val="Hipervnculo"/>
@@ -737,7 +737,7 @@
                 <w:noProof/>
                 <w:webHidden/>
               </w:rPr>
-              <w:instrText xml:space="preserve"> PAGEREF _Toc172307432 \h </w:instrText>
+              <w:instrText xml:space="preserve"> PAGEREF _Toc173749610 \h </w:instrText>
             </w:r>
             <w:r>
               <w:rPr>
@@ -784,7 +784,7 @@
               <w14:ligatures w14:val="none"/>
             </w:rPr>
           </w:pPr>
-          <w:hyperlink w:anchor="_Toc172307433" w:history="1">
+          <w:hyperlink w:anchor="_Toc173749611" w:history="1">
             <w:r>
               <w:rPr>
                 <w:rStyle w:val="Hipervnculo"/>
@@ -829,7 +829,7 @@
                 <w:noProof/>
                 <w:webHidden/>
               </w:rPr>
-              <w:instrText xml:space="preserve"> PAGEREF _Toc172307433 \h </w:instrText>
+              <w:instrText xml:space="preserve"> PAGEREF _Toc173749611 \h </w:instrText>
             </w:r>
             <w:r>
               <w:rPr>
@@ -876,7 +876,7 @@
               <w14:ligatures w14:val="none"/>
             </w:rPr>
           </w:pPr>
-          <w:hyperlink w:anchor="_Toc172307434" w:history="1">
+          <w:hyperlink w:anchor="_Toc173749612" w:history="1">
             <w:r>
               <w:rPr>
                 <w:rStyle w:val="Hipervnculo"/>
@@ -921,7 +921,7 @@
                 <w:noProof/>
                 <w:webHidden/>
               </w:rPr>
-              <w:instrText xml:space="preserve"> PAGEREF _Toc172307434 \h </w:instrText>
+              <w:instrText xml:space="preserve"> PAGEREF _Toc173749612 \h </w:instrText>
             </w:r>
             <w:r>
               <w:rPr>
@@ -941,7 +941,7 @@
                 <w:noProof/>
                 <w:webHidden/>
               </w:rPr>
-              <w:t>12</w:t>
+              <w:t>13</w:t>
             </w:r>
             <w:r>
               <w:rPr>
@@ -968,7 +968,7 @@
               <w14:ligatures w14:val="none"/>
             </w:rPr>
           </w:pPr>
-          <w:hyperlink w:anchor="_Toc172307435" w:history="1">
+          <w:hyperlink w:anchor="_Toc173749613" w:history="1">
             <w:r>
               <w:rPr>
                 <w:rStyle w:val="Hipervnculo"/>
@@ -1013,7 +1013,7 @@
                 <w:noProof/>
                 <w:webHidden/>
               </w:rPr>
-              <w:instrText xml:space="preserve"> PAGEREF _Toc172307435 \h </w:instrText>
+              <w:instrText xml:space="preserve"> PAGEREF _Toc173749613 \h </w:instrText>
             </w:r>
             <w:r>
               <w:rPr>
@@ -1059,7 +1059,7 @@
               <w14:ligatures w14:val="none"/>
             </w:rPr>
           </w:pPr>
-          <w:hyperlink w:anchor="_Toc172307436" w:history="1">
+          <w:hyperlink w:anchor="_Toc173749614" w:history="1">
             <w:r>
               <w:rPr>
                 <w:rStyle w:val="Hipervnculo"/>
@@ -1086,7 +1086,7 @@
                 <w:noProof/>
                 <w:webHidden/>
               </w:rPr>
-              <w:instrText xml:space="preserve"> PAGEREF _Toc172307436 \h </w:instrText>
+              <w:instrText xml:space="preserve"> PAGEREF _Toc173749614 \h </w:instrText>
             </w:r>
             <w:r>
               <w:rPr>
@@ -1106,7 +1106,7 @@
                 <w:noProof/>
                 <w:webHidden/>
               </w:rPr>
-              <w:t>18</w:t>
+              <w:t>19</w:t>
             </w:r>
             <w:r>
               <w:rPr>
@@ -1133,7 +1133,7 @@
               <w14:ligatures w14:val="none"/>
             </w:rPr>
           </w:pPr>
-          <w:hyperlink w:anchor="_Toc172307437" w:history="1">
+          <w:hyperlink w:anchor="_Toc173749615" w:history="1">
             <w:r>
               <w:rPr>
                 <w:rStyle w:val="Hipervnculo"/>
@@ -1178,7 +1178,7 @@
                 <w:noProof/>
                 <w:webHidden/>
               </w:rPr>
-              <w:instrText xml:space="preserve"> PAGEREF _Toc172307437 \h </w:instrText>
+              <w:instrText xml:space="preserve"> PAGEREF _Toc173749615 \h </w:instrText>
             </w:r>
             <w:r>
               <w:rPr>
@@ -1224,7 +1224,7 @@
               <w14:ligatures w14:val="none"/>
             </w:rPr>
           </w:pPr>
-          <w:hyperlink w:anchor="_Toc172307438" w:history="1">
+          <w:hyperlink w:anchor="_Toc173749616" w:history="1">
             <w:r>
               <w:rPr>
                 <w:rStyle w:val="Hipervnculo"/>
@@ -1251,7 +1251,7 @@
                 <w:noProof/>
                 <w:webHidden/>
               </w:rPr>
-              <w:instrText xml:space="preserve"> PAGEREF _Toc172307438 \h </w:instrText>
+              <w:instrText xml:space="preserve"> PAGEREF _Toc173749616 \h </w:instrText>
             </w:r>
             <w:r>
               <w:rPr>
@@ -1297,7 +1297,7 @@
               <w14:ligatures w14:val="none"/>
             </w:rPr>
           </w:pPr>
-          <w:hyperlink w:anchor="_Toc172307439" w:history="1">
+          <w:hyperlink w:anchor="_Toc173749617" w:history="1">
             <w:r>
               <w:rPr>
                 <w:rStyle w:val="Hipervnculo"/>
@@ -1324,7 +1324,7 @@
                 <w:noProof/>
                 <w:webHidden/>
               </w:rPr>
-              <w:instrText xml:space="preserve"> PAGEREF _Toc172307439 \h </w:instrText>
+              <w:instrText xml:space="preserve"> PAGEREF _Toc173749617 \h </w:instrText>
             </w:r>
             <w:r>
               <w:rPr>
@@ -1370,7 +1370,7 @@
               <w14:ligatures w14:val="none"/>
             </w:rPr>
           </w:pPr>
-          <w:hyperlink w:anchor="_Toc172307440" w:history="1">
+          <w:hyperlink w:anchor="_Toc173749618" w:history="1">
             <w:r>
               <w:rPr>
                 <w:rStyle w:val="Hipervnculo"/>
@@ -1397,7 +1397,7 @@
                 <w:noProof/>
                 <w:webHidden/>
               </w:rPr>
-              <w:instrText xml:space="preserve"> PAGEREF _Toc172307440 \h </w:instrText>
+              <w:instrText xml:space="preserve"> PAGEREF _Toc173749618 \h </w:instrText>
             </w:r>
             <w:r>
               <w:rPr>
@@ -1443,7 +1443,7 @@
               <w14:ligatures w14:val="none"/>
             </w:rPr>
           </w:pPr>
-          <w:hyperlink w:anchor="_Toc172307441" w:history="1">
+          <w:hyperlink w:anchor="_Toc173749619" w:history="1">
             <w:r>
               <w:rPr>
                 <w:rStyle w:val="Hipervnculo"/>
@@ -1470,7 +1470,7 @@
                 <w:noProof/>
                 <w:webHidden/>
               </w:rPr>
-              <w:instrText xml:space="preserve"> PAGEREF _Toc172307441 \h </w:instrText>
+              <w:instrText xml:space="preserve"> PAGEREF _Toc173749619 \h </w:instrText>
             </w:r>
             <w:r>
               <w:rPr>
@@ -1516,7 +1516,7 @@
               <w14:ligatures w14:val="none"/>
             </w:rPr>
           </w:pPr>
-          <w:hyperlink w:anchor="_Toc172307442" w:history="1">
+          <w:hyperlink w:anchor="_Toc173749620" w:history="1">
             <w:r>
               <w:rPr>
                 <w:rStyle w:val="Hipervnculo"/>
@@ -1543,7 +1543,7 @@
                 <w:noProof/>
                 <w:webHidden/>
               </w:rPr>
-              <w:instrText xml:space="preserve"> PAGEREF _Toc172307442 \h </w:instrText>
+              <w:instrText xml:space="preserve"> PAGEREF _Toc173749620 \h </w:instrText>
             </w:r>
             <w:r>
               <w:rPr>
@@ -1563,7 +1563,7 @@
                 <w:noProof/>
                 <w:webHidden/>
               </w:rPr>
-              <w:t>32</w:t>
+              <w:t>33</w:t>
             </w:r>
             <w:r>
               <w:rPr>
@@ -1609,7 +1609,7 @@
       <w:pPr>
         <w:pStyle w:val="Titulosgenerales"/>
       </w:pPr>
-      <w:bookmarkStart w:id="0" w:name="_Toc172307430"/>
+      <w:bookmarkStart w:id="0" w:name="_Toc173749608"/>
       <w:r>
         <w:lastRenderedPageBreak/>
         <w:t>Introducción</w:t>
@@ -1644,10 +1644,25 @@
         <w:t xml:space="preserve"> </w:t>
       </w:r>
       <w:r>
-        <w:t>Monitoreo</w:t>
-      </w:r>
-      <w:r>
-        <w:t xml:space="preserve"> del Proceso de Propagación Vegetal</w:t>
+        <w:t xml:space="preserve">Monitoreo del </w:t>
+      </w:r>
+      <w:r>
+        <w:t>p</w:t>
+      </w:r>
+      <w:r>
+        <w:t xml:space="preserve">roceso de </w:t>
+      </w:r>
+      <w:r>
+        <w:t>p</w:t>
+      </w:r>
+      <w:r>
+        <w:t xml:space="preserve">ropagación </w:t>
+      </w:r>
+      <w:r>
+        <w:t>v</w:t>
+      </w:r>
+      <w:r>
+        <w:t>egetal</w:t>
       </w:r>
     </w:p>
     <w:p>
@@ -1746,11 +1761,6 @@
         <w:rPr>
           <w:b/>
         </w:rPr>
-      </w:r>
-      <w:r>
-        <w:rPr>
-          <w:b/>
-        </w:rPr>
         <w:fldChar w:fldCharType="separate"/>
       </w:r>
       <w:r>
@@ -1832,7 +1842,25 @@
               <w:t xml:space="preserve">Síntesis del video: </w:t>
             </w:r>
             <w:r>
-              <w:t>Monitoreo del Proceso de Propagación Vegetal</w:t>
+              <w:t xml:space="preserve">Monitoreo del </w:t>
+            </w:r>
+            <w:r>
+              <w:t>p</w:t>
+            </w:r>
+            <w:r>
+              <w:t xml:space="preserve">roceso de </w:t>
+            </w:r>
+            <w:r>
+              <w:t>p</w:t>
+            </w:r>
+            <w:r>
+              <w:t xml:space="preserve">ropagación </w:t>
+            </w:r>
+            <w:r>
+              <w:t>v</w:t>
+            </w:r>
+            <w:r>
+              <w:t>egetal</w:t>
             </w:r>
           </w:p>
         </w:tc>
@@ -1862,13 +1890,34 @@
               <w:t xml:space="preserve">Apreciado aprendiz, bienvenido al componente formativo denominado: </w:t>
             </w:r>
             <w:r>
-              <w:t>Monitoreo del Proceso de Propagación Vegetal</w:t>
-            </w:r>
-            <w:r>
-              <w:t xml:space="preserve">, en este, se abordarán temáticas relacionadas con, la normatividad ambiental, las acciones que son necesarias para llevar a cabo el proceso de propagación, las cuales inicial desde el momento de la implementación del lugar o sitio donde se realizará la propagación, por ejemplo, los viveros, los cuales deben contar con ciertas condiciones y características en cuanto al terreno, la infraestructura, el personal que labora allí, la aplicación de buenas prácticas agrícolas. Todo esto con el fin de llevar de forma adecuada el proceso de propagación, además, se debe realizar una supervisión más técnica mediante el diligenciamiento de todos los documentos y registros de actividades propias de la propagación y al final, una evaluación de el tamaño de la planta, la biomasa seca y verde, el área foliar a obtener la plata, el porcentaje de incidencias y </w:t>
-            </w:r>
-            <w:r>
-              <w:t>severidad de las enfermedades que presentan y enfermedades que presentan, todo esto con el fin de aplicar medidas y acciones de mejora y así lograr aplicar criterios de evaluación para lograr la sustentabilidad en la propagación vegetal.</w:t>
+              <w:t xml:space="preserve">Monitoreo del </w:t>
+            </w:r>
+            <w:r>
+              <w:t>p</w:t>
+            </w:r>
+            <w:r>
+              <w:t xml:space="preserve">roceso de </w:t>
+            </w:r>
+            <w:r>
+              <w:t>p</w:t>
+            </w:r>
+            <w:r>
+              <w:t xml:space="preserve">ropagación </w:t>
+            </w:r>
+            <w:r>
+              <w:t>v</w:t>
+            </w:r>
+            <w:r>
+              <w:t>egetal</w:t>
+            </w:r>
+            <w:r>
+              <w:t xml:space="preserve">, en este, se abordarán temáticas relacionadas con, la normatividad ambiental, las acciones que son necesarias para llevar a cabo el proceso de propagación, las cuales inicial desde el momento de la implementación del lugar o sitio donde se realizará la propagación, por ejemplo, los viveros, los cuales deben contar con ciertas condiciones y características en cuanto al terreno, la infraestructura, el personal que labora allí, la aplicación de buenas prácticas agrícolas. Todo esto con el fin de llevar de forma adecuada el proceso de propagación, además, se debe realizar una supervisión más técnica mediante el diligenciamiento de todos los documentos y registros de actividades propias de la propagación y al final, una evaluación del tamaño de la planta, la biomasa seca y verde, el área foliar a obtener la plata, el porcentaje de incidencias y </w:t>
+            </w:r>
+            <w:r>
+              <w:t>gravedad</w:t>
+            </w:r>
+            <w:r>
+              <w:t xml:space="preserve"> de las enfermedades que presentan y enfermedades que presentan, todo esto con el fin de aplicar medidas y acciones de mejora y así lograr aplicar criterios de evaluación para lograr la sustentabilidad en la propagación vegetal.</w:t>
             </w:r>
             <w:r>
               <w:t xml:space="preserve"> </w:t>
@@ -1880,17 +1929,8 @@
     <w:p>
       <w:pPr>
         <w:pStyle w:val="Ttulo1"/>
-        <w:numPr>
-          <w:ilvl w:val="0"/>
-          <w:numId w:val="0"/>
-        </w:numPr>
-      </w:pPr>
-    </w:p>
-    <w:p>
-      <w:pPr>
-        <w:pStyle w:val="Ttulo1"/>
-      </w:pPr>
-      <w:bookmarkStart w:id="1" w:name="_Toc172307431"/>
+      </w:pPr>
+      <w:bookmarkStart w:id="1" w:name="_Toc173749609"/>
       <w:r>
         <w:t>Normatividad ambiental vigente para la propagación vegetal</w:t>
       </w:r>
@@ -1898,11 +1938,11 @@
     </w:p>
     <w:p>
       <w:r>
-        <w:t xml:space="preserve">Es necesario conocer la normatividad ambiental vigente, que corresponde y da lugar a las actividades de control, supervisión y monitoreo de la propagación vegetal, siendo el Instituto Colombiano Agropecuario ICA, el encargado de realizar procesos de seguimiento y control debido a que es una institución con una naturaleza jurídica y </w:t>
+        <w:t xml:space="preserve">Es necesario conocer la normatividad ambiental vigente, que corresponde y da lugar a las actividades de control, supervisión y monitoreo de la propagación vegetal, siendo el Instituto Colombiano Agropecuario ICA, el encargado de realizar procesos de seguimiento y control debido a que es una institución con una naturaleza jurídica y establecimiento público del orden nacional con autonomía administrativa y patrimonio </w:t>
       </w:r>
       <w:r>
         <w:lastRenderedPageBreak/>
-        <w:t>establecimiento público del orden nacional con autonomía administrativa y patrimonio independiente, perteneciente al Sistema Nacional de Ciencia y Tecnología, adscrito al Ministerio de Agricultura y Desarrollo Rural según lo establecido en el Decreto 1562 de 1962.</w:t>
+        <w:t>independiente, perteneciente al Sistema Nacional de Ciencia y Tecnología, adscrito al Ministerio de Agricultura y Desarrollo Rural según lo establecido en el Decreto 1562 de 1962.</w:t>
       </w:r>
     </w:p>
     <w:p>
@@ -1912,12 +1952,29 @@
     </w:p>
     <w:p>
       <w:r>
-        <w:t>Y específicamente a expedido la resolución No. 0780006 del 2020, que dispone los requerimientos para el registro de viveros y/o huertos básicos destinados a la producción y comercialización de material vegetal de propagación para la siembra en el país, con el objetivo implementar las medidas establecidas en el control a la sanidad vegetal, la supervisión de las condiciones fitosanitarias de cultivos y viveros; precisado así la importancia económica y social de las plagas y enfermedades que se puedan generar en el desarrollo de estas actividades. (ICA, 2020).</w:t>
-      </w:r>
-    </w:p>
-    <w:p>
-      <w:r>
-        <w:t>Debido a que el instituto Colombiano Agropecuario, también es el encargado de desarrollar políticas y planes que protejan la sanidad, producción y productividad agropecuaria del país, a través de diferentes protocolos, estos se establecen para:</w:t>
+        <w:t xml:space="preserve">Y específicamente </w:t>
+      </w:r>
+      <w:r>
+        <w:t>h</w:t>
+      </w:r>
+      <w:r>
+        <w:t>a expedido la resolución No. 0780006 del 2020, que dispone los requerimientos para el registro de viveros y/o huertos básicos destinados a la producción y comercialización de material vegetal de propagación para la siembra en el país, con el objetivo implementar las medidas establecidas en el control a la sanidad vegetal, la supervisión de las condiciones fitosanitarias de cultivos y viveros; precisado así la importancia económica y social de las plagas y enfermedades que se puedan generar en el desarrollo de estas actividades. (ICA, 2020).</w:t>
+      </w:r>
+    </w:p>
+    <w:p>
+      <w:r>
+        <w:t>Para ampliar la información acerca de normatividad para el registro de viveros y/o huertos destinados a la producción y la propagación del material vegetal a través de la siembra que se lleva a cabo en el país explora la resolución No. 0780006 del 2020.</w:t>
+      </w:r>
+    </w:p>
+    <w:p>
+      <w:r>
+        <w:t xml:space="preserve">Debido a que el </w:t>
+      </w:r>
+      <w:r>
+        <w:t>I</w:t>
+      </w:r>
+      <w:r>
+        <w:t>nstituto Colombiano Agropecuario, también es el encargado de desarrollar políticas y planes que protejan la sanidad, producción y productividad agropecuaria del país, a través de diferentes protocolos, estos se establecen para:</w:t>
       </w:r>
     </w:p>
     <w:p>
@@ -1941,6 +1998,7 @@
         </w:numPr>
       </w:pPr>
       <w:r>
+        <w:lastRenderedPageBreak/>
         <w:t>El manejo y la supervisión de las plagas y enfermedades que se evidencian en las importaciones.</w:t>
       </w:r>
     </w:p>
@@ -1953,7 +2011,6 @@
         </w:numPr>
       </w:pPr>
       <w:r>
-        <w:lastRenderedPageBreak/>
         <w:t>Las exportaciones.</w:t>
       </w:r>
     </w:p>
@@ -1995,7 +2052,7 @@
       <w:pPr>
         <w:pStyle w:val="Ttulo2"/>
       </w:pPr>
-      <w:bookmarkStart w:id="2" w:name="_Toc172307432"/>
+      <w:bookmarkStart w:id="2" w:name="_Toc173749610"/>
       <w:r>
         <w:t>Requerimientos en la implementación de viveros y áreas de propagación vegetal</w:t>
       </w:r>
@@ -2011,21 +2068,54 @@
         <w:rPr>
           <w:lang w:val="es-419" w:eastAsia="es-CO"/>
         </w:rPr>
-        <w:t>Para llevar a cabo un adecuado monitoreo de la propagación vegetal, se requiere desde el momento de la selección, ubicación y construcción del lugar donde se va a llevar a cabo el proceso, cumplir con ciertos requisitos, para la implementación de estos sitios o áreas de propagación como por ejemplo los viveros estén acorde a la normatividad y cuenten con medidas sanitarias idóneas para que permitan la obtención de materia vegetal apropiado.</w:t>
-      </w:r>
-    </w:p>
-    <w:p>
-      <w:pPr>
-        <w:rPr>
-          <w:lang w:val="es-419" w:eastAsia="es-CO"/>
-        </w:rPr>
-      </w:pPr>
+        <w:t xml:space="preserve">Para llevar a cabo un adecuado monitoreo de la propagación vegetal, se requiere desde el momento de la selección, ubicación y construcción del lugar donde se va a llevar a cabo el proceso, cumplir con ciertos requisitos, para la implementación de estos sitios o áreas de propagación como por ejemplo los viveros estén acorde a la </w:t>
+      </w:r>
       <w:r>
         <w:rPr>
           <w:lang w:val="es-419" w:eastAsia="es-CO"/>
         </w:rPr>
         <w:lastRenderedPageBreak/>
+        <w:t>normatividad y cuenten con medidas sanitarias idóneas para que permitan la obtención de materia vegetal apropiado.</w:t>
+      </w:r>
+    </w:p>
+    <w:p>
+      <w:pPr>
+        <w:rPr>
+          <w:lang w:val="es-419" w:eastAsia="es-CO"/>
+        </w:rPr>
+      </w:pPr>
+      <w:r>
+        <w:rPr>
+          <w:lang w:val="es-419" w:eastAsia="es-CO"/>
+        </w:rPr>
         <w:t>Siendo fundamental que el diseño de los viveros se realice de acuerdo con el tipo de plantas a propagar u comercializar, ya que pueden ser forestales, frutales y ornamentales. Según Rovira (2012), entre los tipos de viveros más habituales y que pueden aportar a diferentes proyectos o necesidades de la población de la zona, se encuentran:</w:t>
+      </w:r>
+    </w:p>
+    <w:p>
+      <w:pPr>
+        <w:pStyle w:val="Prrafodelista"/>
+        <w:ind w:left="1429" w:firstLine="0"/>
+        <w:rPr>
+          <w:b/>
+          <w:bCs/>
+          <w:lang w:val="es-419" w:eastAsia="es-CO"/>
+        </w:rPr>
+      </w:pPr>
+      <w:r>
+        <w:rPr>
+          <w:b/>
+          <w:bCs/>
+          <w:lang w:val="es-419" w:eastAsia="es-CO"/>
+        </w:rPr>
+        <w:t>Tipos de viveros</w:t>
+      </w:r>
+      <w:r>
+        <w:rPr>
+          <w:b/>
+          <w:bCs/>
+          <w:lang w:val="es-419" w:eastAsia="es-CO"/>
+        </w:rPr>
+        <w:t>:</w:t>
       </w:r>
     </w:p>
     <w:p>
@@ -2047,15 +2137,15 @@
           <w:bCs/>
           <w:lang w:val="es-419" w:eastAsia="es-CO"/>
         </w:rPr>
-        <w:t>Tipos de viveros</w:t>
-      </w:r>
-      <w:r>
-        <w:rPr>
-          <w:b/>
-          <w:bCs/>
-          <w:lang w:val="es-419" w:eastAsia="es-CO"/>
-        </w:rPr>
-        <w:t>: temporal o volante</w:t>
+        <w:t>T</w:t>
+      </w:r>
+      <w:r>
+        <w:rPr>
+          <w:b/>
+          <w:bCs/>
+          <w:lang w:val="es-419" w:eastAsia="es-CO"/>
+        </w:rPr>
+        <w:t>emporal o volante</w:t>
       </w:r>
       <w:r>
         <w:rPr>
@@ -2081,7 +2171,31 @@
         <w:rPr>
           <w:lang w:val="es-419" w:eastAsia="es-CO"/>
         </w:rPr>
-        <w:t xml:space="preserve"> área para la actividad de propagación de las especies seleccionadas según su necesidad. Ejemplo (Una plantación forestal, actividades de reforestación, proyectos de áreas protegidas).</w:t>
+        <w:t xml:space="preserve"> área para la actividad de propagación de las especies seleccionadas según su necesidad. Ejemplo</w:t>
+      </w:r>
+      <w:r>
+        <w:rPr>
+          <w:lang w:val="es-419" w:eastAsia="es-CO"/>
+        </w:rPr>
+        <w:t>:</w:t>
+      </w:r>
+      <w:r>
+        <w:rPr>
+          <w:lang w:val="es-419" w:eastAsia="es-CO"/>
+        </w:rPr>
+        <w:t xml:space="preserve"> </w:t>
+      </w:r>
+      <w:r>
+        <w:rPr>
+          <w:lang w:val="es-419" w:eastAsia="es-CO"/>
+        </w:rPr>
+        <w:t>u</w:t>
+      </w:r>
+      <w:r>
+        <w:rPr>
+          <w:lang w:val="es-419" w:eastAsia="es-CO"/>
+        </w:rPr>
+        <w:t>na plantación forestal, actividades de reforestación, proyectos de áreas protegidas.</w:t>
       </w:r>
     </w:p>
     <w:p>
@@ -2107,7 +2221,19 @@
         <w:rPr>
           <w:lang w:val="es-419" w:eastAsia="es-CO"/>
         </w:rPr>
-        <w:t>: son los encargados de abastecer programas o proyectos específicos. Ejemplo: (Las corporaciones autónomas, alcaldías).</w:t>
+        <w:t xml:space="preserve">: son los encargados de abastecer programas o proyectos específicos. Ejemplo: </w:t>
+      </w:r>
+      <w:r>
+        <w:rPr>
+          <w:lang w:val="es-419" w:eastAsia="es-CO"/>
+        </w:rPr>
+        <w:t>l</w:t>
+      </w:r>
+      <w:r>
+        <w:rPr>
+          <w:lang w:val="es-419" w:eastAsia="es-CO"/>
+        </w:rPr>
+        <w:t>as corporaciones autónomas, alcaldías.</w:t>
       </w:r>
     </w:p>
     <w:p>
@@ -2141,7 +2267,19 @@
         <w:rPr>
           <w:lang w:val="es-419" w:eastAsia="es-CO"/>
         </w:rPr>
-        <w:t xml:space="preserve"> se realizan con fines de producción o desarrollo social en una comunidad específica; su prioridad es producir según la necesidad y actividad de la zona. Ejemplo (Viveros de escolares, familiares, veredales).</w:t>
+        <w:t xml:space="preserve"> se realizan con fines de producción o desarrollo social en una comunidad específica; su prioridad es producir según la necesidad y actividad de la zona. Ejemplo</w:t>
+      </w:r>
+      <w:r>
+        <w:rPr>
+          <w:lang w:val="es-419" w:eastAsia="es-CO"/>
+        </w:rPr>
+        <w:t>: v</w:t>
+      </w:r>
+      <w:r>
+        <w:rPr>
+          <w:lang w:val="es-419" w:eastAsia="es-CO"/>
+        </w:rPr>
+        <w:t>iveros de escolares, familiares, veredales.</w:t>
       </w:r>
     </w:p>
     <w:p>
@@ -2175,33 +2313,51 @@
         <w:rPr>
           <w:lang w:val="es-419" w:eastAsia="es-CO"/>
         </w:rPr>
-        <w:t xml:space="preserve"> su producción es para la venta y comercialización de diferentes especies de manera permanente; el cual requiere de infraestructura formal.</w:t>
-      </w:r>
-    </w:p>
-    <w:p>
-      <w:pPr>
-        <w:rPr>
-          <w:lang w:val="es-419" w:eastAsia="es-CO"/>
-        </w:rPr>
-      </w:pPr>
-      <w:r>
-        <w:rPr>
-          <w:lang w:val="es-419" w:eastAsia="es-CO"/>
-        </w:rPr>
-        <w:t>Adicionalmente al tipo de vivero, para la implementación requiere tener en cuenta los cultivos de zona, la temperatura y demanda de clientes; como también el espacio y ubicación del sitio de propagación tenga un fácil acceso para la población y cuente con zonas apropiadas, con una topografía que no presente deslizamientos o erosiones que puedan afectar la producción, de manera que la ubicación permita tener una zona de exposición a luz solar y adicionalmente facilite y permita acondicionar sistemas para llevar a cabo procesos como el riego y drenaje.</w:t>
-      </w:r>
-    </w:p>
-    <w:p>
-      <w:pPr>
-        <w:rPr>
-          <w:lang w:val="es-419" w:eastAsia="es-CO"/>
-        </w:rPr>
-      </w:pPr>
+        <w:t xml:space="preserve"> su producción es para la venta y comercialización de diferentes especies de manera permanente; </w:t>
+      </w:r>
+      <w:r>
+        <w:rPr>
+          <w:lang w:val="es-419" w:eastAsia="es-CO"/>
+        </w:rPr>
+        <w:t>la</w:t>
+      </w:r>
+      <w:r>
+        <w:rPr>
+          <w:lang w:val="es-419" w:eastAsia="es-CO"/>
+        </w:rPr>
+        <w:t xml:space="preserve"> cual requiere de infraestructura formal.</w:t>
+      </w:r>
+    </w:p>
+    <w:p>
+      <w:pPr>
+        <w:rPr>
+          <w:lang w:val="es-419" w:eastAsia="es-CO"/>
+        </w:rPr>
+      </w:pPr>
+      <w:r>
+        <w:rPr>
+          <w:lang w:val="es-419" w:eastAsia="es-CO"/>
+        </w:rPr>
+        <w:t xml:space="preserve">Adicionalmente al tipo de vivero, para la implementación requiere tener en cuenta los cultivos de zona, la temperatura y demanda de clientes; como también el espacio y ubicación del sitio de propagación tenga un fácil acceso para la población y cuente con zonas apropiadas, con una topografía que no presente deslizamientos o erosiones que puedan afectar la producción, de manera que la ubicación permita tener una zona de </w:t>
+      </w:r>
       <w:r>
         <w:rPr>
           <w:lang w:val="es-419" w:eastAsia="es-CO"/>
         </w:rPr>
         <w:lastRenderedPageBreak/>
+        <w:t>exposición a luz solar y adicionalmente facilite y permita acondicionar sistemas para llevar a cabo procesos como el riego y drenaje.</w:t>
+      </w:r>
+    </w:p>
+    <w:p>
+      <w:pPr>
+        <w:rPr>
+          <w:lang w:val="es-419" w:eastAsia="es-CO"/>
+        </w:rPr>
+      </w:pPr>
+      <w:r>
+        <w:rPr>
+          <w:lang w:val="es-419" w:eastAsia="es-CO"/>
+        </w:rPr>
         <w:t>Así mismo, se requiere que el lugar seleccionado que permita la propagación vegetal y espacios destinados para logística además de las instalaciones donde se presente delimitación, señalizaciones, cubiertas de luminosidad, luz solar, fuentes de agua para riego, zona segura de animales u otros agentes que dañan la producción, zonas de desinfección de calzado y lavado de manos al ingreso de cada proceso para prevenir enfermedades fitosanitarias del material vegetal de propagación, ya que todos estos son factores que influyen en el buen desarrollo de la planta.</w:t>
       </w:r>
     </w:p>
@@ -2258,7 +2414,19 @@
         <w:rPr>
           <w:lang w:val="es-419" w:eastAsia="es-CO"/>
         </w:rPr>
-        <w:t>s el área donde se ubica y se protege el material vegetal de propagación como lo son las plantas madre, las cuales fueron previamente seleccionadas de acuerdo a sus aspectos fisiológicos, genéticos y de fitosanidad para reproducirlas.</w:t>
+        <w:t>s el área donde se ubica y se protege el material vegetal de propagación</w:t>
+      </w:r>
+      <w:r>
+        <w:rPr>
+          <w:lang w:val="es-419" w:eastAsia="es-CO"/>
+        </w:rPr>
+        <w:t>,</w:t>
+      </w:r>
+      <w:r>
+        <w:rPr>
+          <w:lang w:val="es-419" w:eastAsia="es-CO"/>
+        </w:rPr>
+        <w:t xml:space="preserve"> como lo son las plantas madre, las cuales fueron previamente seleccionadas de acuerdo a sus aspectos fisiológicos, genéticos y de fitosanidad para reproducirlas.</w:t>
       </w:r>
     </w:p>
     <w:p>
@@ -2281,7 +2449,23 @@
           <w:bCs/>
           <w:lang w:val="es-419" w:eastAsia="es-CO"/>
         </w:rPr>
-        <w:t>Área de Germinación</w:t>
+        <w:t xml:space="preserve">Área de </w:t>
+      </w:r>
+      <w:r>
+        <w:rPr>
+          <w:b/>
+          <w:bCs/>
+          <w:lang w:val="es-419" w:eastAsia="es-CO"/>
+        </w:rPr>
+        <w:t>g</w:t>
+      </w:r>
+      <w:r>
+        <w:rPr>
+          <w:b/>
+          <w:bCs/>
+          <w:lang w:val="es-419" w:eastAsia="es-CO"/>
+        </w:rPr>
+        <w:t>erminación</w:t>
       </w:r>
       <w:r>
         <w:rPr>
@@ -2324,7 +2508,23 @@
           <w:bCs/>
           <w:lang w:val="es-419" w:eastAsia="es-CO"/>
         </w:rPr>
-        <w:t>Área de Enraizamiento</w:t>
+        <w:t xml:space="preserve">Área de </w:t>
+      </w:r>
+      <w:r>
+        <w:rPr>
+          <w:b/>
+          <w:bCs/>
+          <w:lang w:val="es-419" w:eastAsia="es-CO"/>
+        </w:rPr>
+        <w:t>e</w:t>
+      </w:r>
+      <w:r>
+        <w:rPr>
+          <w:b/>
+          <w:bCs/>
+          <w:lang w:val="es-419" w:eastAsia="es-CO"/>
+        </w:rPr>
+        <w:t>nraizamiento</w:t>
       </w:r>
       <w:r>
         <w:rPr>
@@ -2367,7 +2567,23 @@
           <w:bCs/>
           <w:lang w:val="es-419" w:eastAsia="es-CO"/>
         </w:rPr>
-        <w:t>Área de Crecimiento</w:t>
+        <w:t xml:space="preserve">Área de </w:t>
+      </w:r>
+      <w:r>
+        <w:rPr>
+          <w:b/>
+          <w:bCs/>
+          <w:lang w:val="es-419" w:eastAsia="es-CO"/>
+        </w:rPr>
+        <w:t>c</w:t>
+      </w:r>
+      <w:r>
+        <w:rPr>
+          <w:b/>
+          <w:bCs/>
+          <w:lang w:val="es-419" w:eastAsia="es-CO"/>
+        </w:rPr>
+        <w:t>recimiento</w:t>
       </w:r>
       <w:r>
         <w:rPr>
@@ -2381,7 +2597,26 @@
         <w:rPr>
           <w:lang w:val="es-419" w:eastAsia="es-CO"/>
         </w:rPr>
-        <w:t>son destinadas las plantas que superaron el proceso de injertación y superan una altura de 5cm, serán supervisadas de manera permanente en aspectos como riego, nutrición (abonos), insectos, hongos y bacterias que las puedan afectar; luego</w:t>
+        <w:t>son destinadas las plantas que superaron el proceso de injertación y superan una altura de 5</w:t>
+      </w:r>
+      <w:r>
+        <w:rPr>
+          <w:lang w:val="es-419" w:eastAsia="es-CO"/>
+        </w:rPr>
+        <w:t xml:space="preserve"> </w:t>
+      </w:r>
+      <w:r>
+        <w:rPr>
+          <w:lang w:val="es-419" w:eastAsia="es-CO"/>
+        </w:rPr>
+        <w:t xml:space="preserve">cm, serán supervisadas de manera permanente en aspectos como riego, nutrición (abonos), insectos, hongos y </w:t>
+      </w:r>
+      <w:r>
+        <w:rPr>
+          <w:lang w:val="es-419" w:eastAsia="es-CO"/>
+        </w:rPr>
+        <w:lastRenderedPageBreak/>
+        <w:t>bacterias que las puedan afectar; luego</w:t>
       </w:r>
       <w:r>
         <w:rPr>
@@ -2416,8 +2651,23 @@
           <w:bCs/>
           <w:lang w:val="es-419" w:eastAsia="es-CO"/>
         </w:rPr>
-        <w:lastRenderedPageBreak/>
-        <w:t>Área de Descarte</w:t>
+        <w:t xml:space="preserve">Área de </w:t>
+      </w:r>
+      <w:r>
+        <w:rPr>
+          <w:b/>
+          <w:bCs/>
+          <w:lang w:val="es-419" w:eastAsia="es-CO"/>
+        </w:rPr>
+        <w:t>d</w:t>
+      </w:r>
+      <w:r>
+        <w:rPr>
+          <w:b/>
+          <w:bCs/>
+          <w:lang w:val="es-419" w:eastAsia="es-CO"/>
+        </w:rPr>
+        <w:t>escarte</w:t>
       </w:r>
       <w:r>
         <w:rPr>
@@ -2509,7 +2759,39 @@
           <w:bCs/>
           <w:lang w:val="es-419" w:eastAsia="es-CO"/>
         </w:rPr>
-        <w:t>Área de Servicios y Oficinas</w:t>
+        <w:t xml:space="preserve">Área de </w:t>
+      </w:r>
+      <w:r>
+        <w:rPr>
+          <w:b/>
+          <w:bCs/>
+          <w:lang w:val="es-419" w:eastAsia="es-CO"/>
+        </w:rPr>
+        <w:t>s</w:t>
+      </w:r>
+      <w:r>
+        <w:rPr>
+          <w:b/>
+          <w:bCs/>
+          <w:lang w:val="es-419" w:eastAsia="es-CO"/>
+        </w:rPr>
+        <w:t xml:space="preserve">ervicios y </w:t>
+      </w:r>
+      <w:r>
+        <w:rPr>
+          <w:b/>
+          <w:bCs/>
+          <w:lang w:val="es-419" w:eastAsia="es-CO"/>
+        </w:rPr>
+        <w:t>o</w:t>
+      </w:r>
+      <w:r>
+        <w:rPr>
+          <w:b/>
+          <w:bCs/>
+          <w:lang w:val="es-419" w:eastAsia="es-CO"/>
+        </w:rPr>
+        <w:t>ficinas</w:t>
       </w:r>
     </w:p>
     <w:p>
@@ -2567,24 +2849,11 @@
     <w:p>
       <w:pPr>
         <w:pStyle w:val="Prrafodelista"/>
-        <w:numPr>
-          <w:ilvl w:val="0"/>
-          <w:numId w:val="9"/>
-        </w:numPr>
-        <w:rPr>
-          <w:b/>
-          <w:bCs/>
-          <w:lang w:val="es-419" w:eastAsia="es-CO"/>
-        </w:rPr>
-      </w:pPr>
-      <w:r>
-        <w:rPr>
-          <w:b/>
-          <w:bCs/>
-          <w:lang w:val="es-419" w:eastAsia="es-CO"/>
-        </w:rPr>
-        <w:t>Bodega de almacenamiento</w:t>
-      </w:r>
+        <w:ind w:left="1429" w:firstLine="0"/>
+        <w:rPr>
+          <w:lang w:val="es-419" w:eastAsia="es-CO"/>
+        </w:rPr>
+      </w:pPr>
     </w:p>
     <w:p>
       <w:pPr>
@@ -2594,12 +2863,15 @@
           <w:lang w:val="es-419" w:eastAsia="es-CO"/>
         </w:rPr>
       </w:pPr>
-      <w:r>
-        <w:rPr>
-          <w:lang w:val="es-419" w:eastAsia="es-CO"/>
-        </w:rPr>
-        <w:t>Esta zona debe estar previamente identificada para las herramientas utilizadas en cada actividad de la propagación, las cuales serán almacenadas en condiciones limpias y organizadas; que permita su accesibilidad.</w:t>
-      </w:r>
+    </w:p>
+    <w:p>
+      <w:pPr>
+        <w:pStyle w:val="Prrafodelista"/>
+        <w:ind w:left="1429" w:firstLine="0"/>
+        <w:rPr>
+          <w:lang w:val="es-419" w:eastAsia="es-CO"/>
+        </w:rPr>
+      </w:pPr>
     </w:p>
     <w:p>
       <w:pPr>
@@ -2620,7 +2892,8 @@
           <w:bCs/>
           <w:lang w:val="es-419" w:eastAsia="es-CO"/>
         </w:rPr>
-        <w:t>Área de cuarentena</w:t>
+        <w:lastRenderedPageBreak/>
+        <w:t>Bodega de almacenamiento</w:t>
       </w:r>
     </w:p>
     <w:p>
@@ -2635,7 +2908,55 @@
         <w:rPr>
           <w:lang w:val="es-419" w:eastAsia="es-CO"/>
         </w:rPr>
-        <w:lastRenderedPageBreak/>
+        <w:t>Esta zona debe estar previamente identificada para las herramientas utilizadas en cada actividad de la propagación, las cuales serán almacenadas en condiciones limpias y organizadas; que permita</w:t>
+      </w:r>
+      <w:r>
+        <w:rPr>
+          <w:lang w:val="es-419" w:eastAsia="es-CO"/>
+        </w:rPr>
+        <w:t>n</w:t>
+      </w:r>
+      <w:r>
+        <w:rPr>
+          <w:lang w:val="es-419" w:eastAsia="es-CO"/>
+        </w:rPr>
+        <w:t xml:space="preserve"> su accesibilidad.</w:t>
+      </w:r>
+    </w:p>
+    <w:p>
+      <w:pPr>
+        <w:pStyle w:val="Prrafodelista"/>
+        <w:numPr>
+          <w:ilvl w:val="0"/>
+          <w:numId w:val="9"/>
+        </w:numPr>
+        <w:rPr>
+          <w:b/>
+          <w:bCs/>
+          <w:lang w:val="es-419" w:eastAsia="es-CO"/>
+        </w:rPr>
+      </w:pPr>
+      <w:r>
+        <w:rPr>
+          <w:b/>
+          <w:bCs/>
+          <w:lang w:val="es-419" w:eastAsia="es-CO"/>
+        </w:rPr>
+        <w:t>Área de cuarentena</w:t>
+      </w:r>
+    </w:p>
+    <w:p>
+      <w:pPr>
+        <w:pStyle w:val="Prrafodelista"/>
+        <w:ind w:left="1429" w:firstLine="0"/>
+        <w:rPr>
+          <w:lang w:val="es-419" w:eastAsia="es-CO"/>
+        </w:rPr>
+      </w:pPr>
+      <w:r>
+        <w:rPr>
+          <w:lang w:val="es-419" w:eastAsia="es-CO"/>
+        </w:rPr>
         <w:t>Debe estar previamente identificada para los confinamientos de artículos reglamentados, plagas u organismos benéficos para inspección, prueba, tratamiento, observación o investigación definidos por el profesional técnico.</w:t>
       </w:r>
     </w:p>
@@ -2661,7 +2982,7 @@
       <w:r>
         <w:t xml:space="preserve"> </w:t>
       </w:r>
-      <w:bookmarkStart w:id="4" w:name="_Toc172307433"/>
+      <w:bookmarkStart w:id="4" w:name="_Toc173749611"/>
       <w:r>
         <w:t>Calidad del material vegetal de propagación</w:t>
       </w:r>
@@ -2669,11 +2990,19 @@
     </w:p>
     <w:p>
       <w:r>
-        <w:t>La calidad del material vegetal se define con los factores que benefician o afectan a la planta en cada una de sus funciones como: respiración, digestión, absorción de nutrientes, transpiración, fotosíntesis, enraizamiento y productividad. Al brindar los mejores factores a la planta aporta a la sostenibilidad ambiental, responsabilidad social, seguridad alimentaria y a cada uno de los procedimientos de calidad en la cadena de producción.</w:t>
-      </w:r>
-    </w:p>
-    <w:p>
-      <w:r>
+        <w:t>La calidad del material vegetal se define con los factores que benefician o afectan a la planta en cada una de sus funciones como: respiración, digestión, absorción de nutrientes, transpiración, fotosíntesis, enraizamiento y productividad. Al brindar los mejores factores a la planta</w:t>
+      </w:r>
+      <w:r>
+        <w:t>,</w:t>
+      </w:r>
+      <w:r>
+        <w:t xml:space="preserve"> aporta a la sostenibilidad ambiental, responsabilidad social, seguridad alimentaria y a cada uno de los procedimientos de calidad en la cadena de producción.</w:t>
+      </w:r>
+    </w:p>
+    <w:p/>
+    <w:p>
+      <w:r>
+        <w:lastRenderedPageBreak/>
         <w:t>Por tanto, dentro de los factores que afectan la calidad del material vegetal, se encuentran:</w:t>
       </w:r>
     </w:p>
@@ -2712,7 +3041,6 @@
           <w:b/>
           <w:bCs/>
         </w:rPr>
-        <w:lastRenderedPageBreak/>
         <w:t>Factor fisiológico:</w:t>
       </w:r>
       <w:r>
@@ -2775,8 +3103,9 @@
       <w:pPr>
         <w:pStyle w:val="Ttulo1"/>
       </w:pPr>
-      <w:bookmarkStart w:id="5" w:name="_Toc172307434"/>
-      <w:r>
+      <w:bookmarkStart w:id="5" w:name="_Toc173749612"/>
+      <w:r>
+        <w:lastRenderedPageBreak/>
         <w:t>Monitoreo y supervisión técnica del proceso de propagación vegetativa</w:t>
       </w:r>
       <w:bookmarkEnd w:id="5"/>
@@ -2804,7 +3133,6 @@
         <w:rPr>
           <w:lang w:val="es-419" w:eastAsia="es-CO"/>
         </w:rPr>
-        <w:lastRenderedPageBreak/>
         <w:t>De acuerdo con la Resolución No.0780006 del 25/11/2009, el monitoreo y la supervisión técnica debe ser realizada por un profesional del área de conocimiento de ingeniería agrícola, agronomía, forestal, agroindustrial o demás profesiones que tenga la competencia para realizar actividades de manejo fitosanitario y producción de plantas de viveros, siendo contratado directamente por el vivero como asistente técnico y/o según corresponda la funcionalidad del mismo.</w:t>
       </w:r>
     </w:p>
@@ -2853,7 +3181,40 @@
           <w:bCs/>
           <w:lang w:val="es-419" w:eastAsia="es-CO"/>
         </w:rPr>
-        <w:t>Porcentaje de Enraizamiento o Sobrevivencia</w:t>
+        <w:lastRenderedPageBreak/>
+        <w:t xml:space="preserve">Porcentaje de </w:t>
+      </w:r>
+      <w:r>
+        <w:rPr>
+          <w:b/>
+          <w:bCs/>
+          <w:lang w:val="es-419" w:eastAsia="es-CO"/>
+        </w:rPr>
+        <w:t>e</w:t>
+      </w:r>
+      <w:r>
+        <w:rPr>
+          <w:b/>
+          <w:bCs/>
+          <w:lang w:val="es-419" w:eastAsia="es-CO"/>
+        </w:rPr>
+        <w:t xml:space="preserve">nraizamiento o </w:t>
+      </w:r>
+      <w:r>
+        <w:rPr>
+          <w:b/>
+          <w:bCs/>
+          <w:lang w:val="es-419" w:eastAsia="es-CO"/>
+        </w:rPr>
+        <w:t>s</w:t>
+      </w:r>
+      <w:r>
+        <w:rPr>
+          <w:b/>
+          <w:bCs/>
+          <w:lang w:val="es-419" w:eastAsia="es-CO"/>
+        </w:rPr>
+        <w:t>obrevivencia</w:t>
       </w:r>
     </w:p>
     <w:p>
@@ -2906,7 +3267,6 @@
               <w:sz w:val="20"/>
               <w:szCs w:val="20"/>
             </w:rPr>
-            <w:lastRenderedPageBreak/>
             <m:t>% Porcentaje de enraizamiento</m:t>
           </m:r>
           <m:r>
@@ -2966,13 +3326,6 @@
     </w:p>
     <w:p>
       <w:pPr>
-        <w:rPr>
-          <w:lang w:val="es-419" w:eastAsia="es-CO"/>
-        </w:rPr>
-      </w:pPr>
-    </w:p>
-    <w:p>
-      <w:pPr>
         <w:pStyle w:val="Prrafodelista"/>
         <w:numPr>
           <w:ilvl w:val="0"/>
@@ -2990,7 +3343,39 @@
           <w:bCs/>
           <w:lang w:val="es-419" w:eastAsia="es-CO"/>
         </w:rPr>
-        <w:t>Presencia de Plagas y Enfermedades</w:t>
+        <w:t xml:space="preserve">Presencia de </w:t>
+      </w:r>
+      <w:r>
+        <w:rPr>
+          <w:b/>
+          <w:bCs/>
+          <w:lang w:val="es-419" w:eastAsia="es-CO"/>
+        </w:rPr>
+        <w:t>p</w:t>
+      </w:r>
+      <w:r>
+        <w:rPr>
+          <w:b/>
+          <w:bCs/>
+          <w:lang w:val="es-419" w:eastAsia="es-CO"/>
+        </w:rPr>
+        <w:t xml:space="preserve">lagas y </w:t>
+      </w:r>
+      <w:r>
+        <w:rPr>
+          <w:b/>
+          <w:bCs/>
+          <w:lang w:val="es-419" w:eastAsia="es-CO"/>
+        </w:rPr>
+        <w:t>e</w:t>
+      </w:r>
+      <w:r>
+        <w:rPr>
+          <w:b/>
+          <w:bCs/>
+          <w:lang w:val="es-419" w:eastAsia="es-CO"/>
+        </w:rPr>
+        <w:t>nfermedades</w:t>
       </w:r>
     </w:p>
     <w:p>
@@ -3237,6 +3622,7 @@
           <w:szCs w:val="28"/>
           <w:lang w:val="en-US"/>
         </w:rPr>
+        <w:lastRenderedPageBreak/>
         <w:t>Severidad</w:t>
       </w:r>
       <w:proofErr w:type="spellEnd"/>
@@ -3466,14 +3852,7 @@
         <w:rPr>
           <w:lang w:val="es-419" w:eastAsia="es-CO"/>
         </w:rPr>
-        <w:t xml:space="preserve">Ahora bien, es de recordar que, durante el monitoreo, se deben adoptar las medidas necesarias y las recomendaciones establecidas por la normatividad referentes a fitosanidad, con el objetivo de proteger el área de propagación vegetal de la </w:t>
-      </w:r>
-      <w:r>
-        <w:rPr>
-          <w:lang w:val="es-419" w:eastAsia="es-CO"/>
-        </w:rPr>
-        <w:lastRenderedPageBreak/>
-        <w:t>contaminación, de las enfermedades o plagas evidenciadas en otras áreas; y conlleven a un incremento de afectación en otros procesos.</w:t>
+        <w:t>Ahora bien, es de recordar que, durante el monitoreo, se deben adoptar las medidas necesarias y las recomendaciones establecidas por la normatividad referentes a fitosanidad, con el objetivo de proteger el área de propagación vegetal de la contaminación, de las enfermedades o plagas evidenciadas en otras áreas; y conlleven a un incremento de afectación en otros procesos.</w:t>
       </w:r>
     </w:p>
     <w:p>
@@ -3497,7 +3876,7 @@
           <w:numId w:val="6"/>
         </w:numPr>
       </w:pPr>
-      <w:bookmarkStart w:id="6" w:name="_Toc172307435"/>
+      <w:bookmarkStart w:id="6" w:name="_Toc173749613"/>
       <w:r>
         <w:t>Monitoreo de buenas prácticas agrícolas</w:t>
       </w:r>
@@ -3526,29 +3905,28 @@
         <w:rPr>
           <w:lang w:eastAsia="es-CO"/>
         </w:rPr>
-        <w:t>Con la implementación de las buenas prácticas agrícolas (BPA), se promueve hacer las cosas bien y dar garantía de ello, debido a que estas están enfocadas a la obtención de productos seguros y de calidad, producidos de manera sostenible, logrando beneficiar no solo a los agricultores y sus familias, sino que también a los consumidores y la población en general, por medio de actividades direccionadas a cuatro sectores o elementos que son la seguridad de las personas, el medio ambiente, la inocuidad de los alimentos y el bienestar animal.</w:t>
-      </w:r>
-    </w:p>
-    <w:p>
-      <w:pPr>
-        <w:rPr>
-          <w:lang w:eastAsia="es-CO"/>
-        </w:rPr>
-      </w:pPr>
+        <w:t xml:space="preserve">Con la implementación de las buenas prácticas agrícolas (BPA), se promueve hacer las cosas bien y dar garantía de ello, debido a que estas están enfocadas a la obtención de productos seguros y de calidad, producidos de manera sostenible, logrando beneficiar no solo a los agricultores y sus familias, sino que también a los consumidores y la población en general, por medio de actividades direccionadas a cuatro sectores o </w:t>
+      </w:r>
       <w:r>
         <w:rPr>
           <w:lang w:eastAsia="es-CO"/>
         </w:rPr>
         <w:lastRenderedPageBreak/>
+        <w:t>elementos que son la seguridad de las personas, el medio ambiente, la inocuidad de los alimentos y el bienestar animal.</w:t>
+      </w:r>
+    </w:p>
+    <w:p>
+      <w:pPr>
+        <w:rPr>
+          <w:lang w:eastAsia="es-CO"/>
+        </w:rPr>
+      </w:pPr>
+      <w:r>
+        <w:rPr>
+          <w:lang w:eastAsia="es-CO"/>
+        </w:rPr>
         <w:t>Estas prácticas agrícolas promueven condiciones que aportan al cuidado, preservación del medio ambiente, bienestar animal y seguridad de las personas, como se comparte a continuación:</w:t>
       </w:r>
-    </w:p>
-    <w:p>
-      <w:pPr>
-        <w:rPr>
-          <w:lang w:eastAsia="es-CO"/>
-        </w:rPr>
-      </w:pPr>
     </w:p>
     <w:p>
       <w:pPr>
@@ -3779,6 +4157,12 @@
         </w:rPr>
         <w:t>1. Cuidado de animales</w:t>
       </w:r>
+      <w:r>
+        <w:rPr>
+          <w:lang w:eastAsia="es-CO"/>
+        </w:rPr>
+        <w:t>.</w:t>
+      </w:r>
     </w:p>
     <w:p>
       <w:pPr>
@@ -3793,39 +4177,25 @@
         </w:rPr>
         <w:t>2. Alimentación adecuada</w:t>
       </w:r>
-    </w:p>
-    <w:p>
-      <w:pPr>
-        <w:rPr>
-          <w:lang w:eastAsia="es-CO"/>
-        </w:rPr>
-      </w:pPr>
-      <w:r>
-        <w:rPr>
-          <w:lang w:eastAsia="es-CO"/>
-        </w:rPr>
-        <w:t xml:space="preserve">Para lo cual, como lo indica </w:t>
-      </w:r>
-      <w:proofErr w:type="spellStart"/>
-      <w:r>
-        <w:rPr>
-          <w:lang w:eastAsia="es-CO"/>
-        </w:rPr>
-        <w:t>Rombouts</w:t>
-      </w:r>
-      <w:proofErr w:type="spellEnd"/>
-      <w:r>
-        <w:rPr>
-          <w:lang w:eastAsia="es-CO"/>
-        </w:rPr>
-        <w:t xml:space="preserve"> &amp; Rivera (2014), se hace necesario y se exige la implementación de procedimientos de trazabilidad, de registro y gestión de </w:t>
-      </w:r>
+      <w:r>
+        <w:rPr>
+          <w:lang w:eastAsia="es-CO"/>
+        </w:rPr>
+        <w:t>.</w:t>
+      </w:r>
+    </w:p>
+    <w:p>
+      <w:pPr>
+        <w:rPr>
+          <w:lang w:eastAsia="es-CO"/>
+        </w:rPr>
+      </w:pPr>
       <w:r>
         <w:rPr>
           <w:lang w:eastAsia="es-CO"/>
         </w:rPr>
         <w:lastRenderedPageBreak/>
-        <w:t>solicitudes y peticiones, estándares y procedimientos de calidad en la cadena de producción, además de acciones de mejora que permitan alcanzar la eficiencia, productividad, sostenibilidad ambiental y responsabilidad social.</w:t>
+        <w:t>Para lo cual, como lo indica Rombouts &amp; Rivera (2014), se hace necesario y se exige la implementación de procedimientos de trazabilidad, de registro y gestión de solicitudes y peticiones, estándares y procedimientos de calidad en la cadena de producción, además de acciones de mejora que permitan alcanzar la eficiencia, productividad, sostenibilidad ambiental y responsabilidad social.</w:t>
       </w:r>
     </w:p>
     <w:p>
@@ -3858,7 +4228,23 @@
           <w:bCs/>
           <w:lang w:eastAsia="es-CO"/>
         </w:rPr>
-        <w:t>Protección a Trabajadores</w:t>
+        <w:t xml:space="preserve">Protección a </w:t>
+      </w:r>
+      <w:r>
+        <w:rPr>
+          <w:b/>
+          <w:bCs/>
+          <w:lang w:eastAsia="es-CO"/>
+        </w:rPr>
+        <w:t>t</w:t>
+      </w:r>
+      <w:r>
+        <w:rPr>
+          <w:b/>
+          <w:bCs/>
+          <w:lang w:eastAsia="es-CO"/>
+        </w:rPr>
+        <w:t>rabajadores</w:t>
       </w:r>
       <w:r>
         <w:rPr>
@@ -3898,7 +4284,23 @@
           <w:bCs/>
           <w:lang w:eastAsia="es-CO"/>
         </w:rPr>
-        <w:t>Medidas de Higiene</w:t>
+        <w:t xml:space="preserve">Medidas de </w:t>
+      </w:r>
+      <w:r>
+        <w:rPr>
+          <w:b/>
+          <w:bCs/>
+          <w:lang w:eastAsia="es-CO"/>
+        </w:rPr>
+        <w:t>h</w:t>
+      </w:r>
+      <w:r>
+        <w:rPr>
+          <w:b/>
+          <w:bCs/>
+          <w:lang w:eastAsia="es-CO"/>
+        </w:rPr>
+        <w:t>igiene</w:t>
       </w:r>
       <w:r>
         <w:rPr>
@@ -4027,6 +4429,7 @@
           <w:bCs/>
           <w:lang w:eastAsia="es-CO"/>
         </w:rPr>
+        <w:lastRenderedPageBreak/>
         <w:t>Bodega de insumos</w:t>
       </w:r>
       <w:r>
@@ -4047,14 +4450,7 @@
         <w:rPr>
           <w:lang w:eastAsia="es-CO"/>
         </w:rPr>
-        <w:t xml:space="preserve">ebe existir un lugar previamente señalizado donde se guarden los insumos como agroquímicos y fertilizantes, los cuales deben </w:t>
-      </w:r>
-      <w:r>
-        <w:rPr>
-          <w:lang w:eastAsia="es-CO"/>
-        </w:rPr>
-        <w:lastRenderedPageBreak/>
-        <w:t>estar debidamente separados y aislados de las semillas, plantas, forrajes, productos cosechados.</w:t>
+        <w:t>ebe existir un lugar previamente señalizado donde se guarden los insumos como agroquímicos y fertilizantes, los cuales deben estar debidamente separados y aislados de las semillas, plantas, forrajes, productos cosechados.</w:t>
       </w:r>
     </w:p>
     <w:p>
@@ -4134,7 +4530,19 @@
         <w:rPr>
           <w:lang w:eastAsia="es-CO"/>
         </w:rPr>
-        <w:t>eniendo presente lo anterior, cabe mencionar como desde la resolución 2184 de 2019 se indica los parámetros para realizar la separación de residuos en la fuente, con un color especifico (código de colores; blanco, negro y verde), para los contenedores de basura, canecas de reciclaje y bolsas que se utilicen. Así:</w:t>
+        <w:t>eniendo presente lo anterior, cabe mencionar como desde la resolución 2184 de 2019 se indica los parámetros para realizar la separación de residuos en la fuente, con un color especifico</w:t>
+      </w:r>
+      <w:r>
+        <w:rPr>
+          <w:lang w:eastAsia="es-CO"/>
+        </w:rPr>
+        <w:t xml:space="preserve">, </w:t>
+      </w:r>
+      <w:r>
+        <w:rPr>
+          <w:lang w:eastAsia="es-CO"/>
+        </w:rPr>
+        <w:t>(código de colores; blanco, negro y verde), para los contenedores de basura, canecas de reciclaje y bolsas que se utilicen. Así:</w:t>
       </w:r>
     </w:p>
     <w:p>
@@ -4171,7 +4579,23 @@
           <w:bCs/>
           <w:lang w:eastAsia="es-CO"/>
         </w:rPr>
-        <w:t>Residuos Aprovechables</w:t>
+        <w:t xml:space="preserve">Residuos </w:t>
+      </w:r>
+      <w:r>
+        <w:rPr>
+          <w:b/>
+          <w:bCs/>
+          <w:lang w:eastAsia="es-CO"/>
+        </w:rPr>
+        <w:t>a</w:t>
+      </w:r>
+      <w:r>
+        <w:rPr>
+          <w:b/>
+          <w:bCs/>
+          <w:lang w:eastAsia="es-CO"/>
+        </w:rPr>
+        <w:t>provechables</w:t>
       </w:r>
       <w:r>
         <w:rPr>
@@ -4203,7 +4627,23 @@
           <w:bCs/>
           <w:lang w:eastAsia="es-CO"/>
         </w:rPr>
-        <w:t>Residuos Orgánicos</w:t>
+        <w:t xml:space="preserve">Residuos </w:t>
+      </w:r>
+      <w:r>
+        <w:rPr>
+          <w:b/>
+          <w:bCs/>
+          <w:lang w:eastAsia="es-CO"/>
+        </w:rPr>
+        <w:t>o</w:t>
+      </w:r>
+      <w:r>
+        <w:rPr>
+          <w:b/>
+          <w:bCs/>
+          <w:lang w:eastAsia="es-CO"/>
+        </w:rPr>
+        <w:t>rgánicos</w:t>
       </w:r>
       <w:r>
         <w:rPr>
@@ -4243,7 +4683,39 @@
           <w:bCs/>
           <w:lang w:eastAsia="es-CO"/>
         </w:rPr>
-        <w:t>Residuos No Aprovechables</w:t>
+        <w:t xml:space="preserve">Residuos </w:t>
+      </w:r>
+      <w:r>
+        <w:rPr>
+          <w:b/>
+          <w:bCs/>
+          <w:lang w:eastAsia="es-CO"/>
+        </w:rPr>
+        <w:t>n</w:t>
+      </w:r>
+      <w:r>
+        <w:rPr>
+          <w:b/>
+          <w:bCs/>
+          <w:lang w:eastAsia="es-CO"/>
+        </w:rPr>
+        <w:t xml:space="preserve">o </w:t>
+      </w:r>
+      <w:r>
+        <w:rPr>
+          <w:b/>
+          <w:bCs/>
+          <w:lang w:eastAsia="es-CO"/>
+        </w:rPr>
+        <w:t>a</w:t>
+      </w:r>
+      <w:r>
+        <w:rPr>
+          <w:b/>
+          <w:bCs/>
+          <w:lang w:eastAsia="es-CO"/>
+        </w:rPr>
+        <w:t>provechables</w:t>
       </w:r>
       <w:r>
         <w:rPr>
@@ -4263,7 +4735,14 @@
         <w:rPr>
           <w:lang w:eastAsia="es-CO"/>
         </w:rPr>
-        <w:t>on depositados en las canecas con color negro y son definidos como agentes contaminantes de que no pueden recibir otro uso. Ejemplo (residuos de baños, envoltura de alimentos no plásticos, colillas de cigarrillo)</w:t>
+        <w:t xml:space="preserve">on depositados en las canecas con color negro y son definidos como agentes contaminantes de que no pueden recibir otro </w:t>
+      </w:r>
+      <w:r>
+        <w:rPr>
+          <w:lang w:eastAsia="es-CO"/>
+        </w:rPr>
+        <w:lastRenderedPageBreak/>
+        <w:t>uso. Ejemplo (residuos de baños, envoltura de alimentos no plásticos, colillas de cigarrillo)</w:t>
       </w:r>
       <w:r>
         <w:rPr>
@@ -4280,9 +4759,8 @@
           <w:numId w:val="0"/>
         </w:numPr>
       </w:pPr>
-      <w:bookmarkStart w:id="7" w:name="_Toc172307436"/>
-      <w:r>
-        <w:lastRenderedPageBreak/>
+      <w:bookmarkStart w:id="7" w:name="_Toc173749614"/>
+      <w:r>
         <w:t>2.2 Documentación</w:t>
       </w:r>
       <w:bookmarkEnd w:id="7"/>
@@ -4374,7 +4852,23 @@
           <w:bCs/>
           <w:lang w:eastAsia="es-CO"/>
         </w:rPr>
-        <w:t xml:space="preserve">Constancia Vegetal: </w:t>
+        <w:t xml:space="preserve">Constancia </w:t>
+      </w:r>
+      <w:r>
+        <w:rPr>
+          <w:b/>
+          <w:bCs/>
+          <w:lang w:eastAsia="es-CO"/>
+        </w:rPr>
+        <w:t>v</w:t>
+      </w:r>
+      <w:r>
+        <w:rPr>
+          <w:b/>
+          <w:bCs/>
+          <w:lang w:eastAsia="es-CO"/>
+        </w:rPr>
+        <w:t xml:space="preserve">egetal: </w:t>
       </w:r>
       <w:r>
         <w:rPr>
@@ -4412,7 +4906,23 @@
           <w:bCs/>
           <w:lang w:eastAsia="es-CO"/>
         </w:rPr>
-        <w:t>Licencia Fitosanitaria:</w:t>
+        <w:t xml:space="preserve">Licencia </w:t>
+      </w:r>
+      <w:r>
+        <w:rPr>
+          <w:b/>
+          <w:bCs/>
+          <w:lang w:eastAsia="es-CO"/>
+        </w:rPr>
+        <w:t>f</w:t>
+      </w:r>
+      <w:r>
+        <w:rPr>
+          <w:b/>
+          <w:bCs/>
+          <w:lang w:eastAsia="es-CO"/>
+        </w:rPr>
+        <w:t>itosanitaria:</w:t>
       </w:r>
       <w:r>
         <w:rPr>
@@ -4461,14 +4971,8 @@
         <w:rPr>
           <w:lang w:eastAsia="es-CO"/>
         </w:rPr>
-        <w:t xml:space="preserve">Pero, de igual manera, existen diferentes actividades que se realicen día a día (internamente), que son necesarias registrar para ejercer un monitoreo en la propagación del material vegetal, las cuales podrán ser diseñadas de acuerdo a la </w:t>
-      </w:r>
-      <w:r>
-        <w:rPr>
-          <w:lang w:eastAsia="es-CO"/>
-        </w:rPr>
         <w:lastRenderedPageBreak/>
-        <w:t>necesidad y procesos que se llevan a cabo en el huerto básico de productores y/o viveros.</w:t>
+        <w:t>Pero, de igual manera, existen diferentes actividades que se realicen día a día (internamente), que son necesarias registrar para ejercer un monitoreo en la propagación del material vegetal, las cuales podrán ser diseñadas de acuerdo a la necesidad y procesos que se llevan a cabo en el huerto básico de productores y/o viveros.</w:t>
       </w:r>
     </w:p>
     <w:p>
@@ -4867,7 +5371,23 @@
           <w:bCs/>
           <w:lang w:eastAsia="es-CO"/>
         </w:rPr>
-        <w:t xml:space="preserve">Registro de Siembra: </w:t>
+        <w:t xml:space="preserve">Registro de </w:t>
+      </w:r>
+      <w:r>
+        <w:rPr>
+          <w:b/>
+          <w:bCs/>
+          <w:lang w:eastAsia="es-CO"/>
+        </w:rPr>
+        <w:t>s</w:t>
+      </w:r>
+      <w:r>
+        <w:rPr>
+          <w:b/>
+          <w:bCs/>
+          <w:lang w:eastAsia="es-CO"/>
+        </w:rPr>
+        <w:t xml:space="preserve">iembra: </w:t>
       </w:r>
       <w:r>
         <w:rPr>
@@ -4891,34 +5411,6 @@
     </w:p>
     <w:p>
       <w:pPr>
-        <w:rPr>
-          <w:lang w:eastAsia="es-CO"/>
-        </w:rPr>
-      </w:pPr>
-    </w:p>
-    <w:p>
-      <w:pPr>
-        <w:rPr>
-          <w:lang w:eastAsia="es-CO"/>
-        </w:rPr>
-      </w:pPr>
-    </w:p>
-    <w:p>
-      <w:pPr>
-        <w:rPr>
-          <w:lang w:eastAsia="es-CO"/>
-        </w:rPr>
-      </w:pPr>
-    </w:p>
-    <w:p>
-      <w:pPr>
-        <w:rPr>
-          <w:lang w:eastAsia="es-CO"/>
-        </w:rPr>
-      </w:pPr>
-    </w:p>
-    <w:p>
-      <w:pPr>
         <w:pStyle w:val="Tabla"/>
         <w:rPr>
           <w:lang w:eastAsia="es-CO"/>
@@ -4928,6 +5420,7 @@
         <w:rPr>
           <w:lang w:eastAsia="es-CO"/>
         </w:rPr>
+        <w:lastRenderedPageBreak/>
         <w:t>Ejemplo de registro de siembras</w:t>
       </w:r>
     </w:p>
@@ -4959,12 +5452,12 @@
         <w:tblDescription w:val="Tabla que describe la fecha, área de propagación,número de lote,variedad, número de plantas, observaciones y responsable."/>
       </w:tblPr>
       <w:tblGrid>
-        <w:gridCol w:w="1364"/>
-        <w:gridCol w:w="1608"/>
-        <w:gridCol w:w="1750"/>
-        <w:gridCol w:w="1168"/>
-        <w:gridCol w:w="1051"/>
-        <w:gridCol w:w="1701"/>
+        <w:gridCol w:w="1413"/>
+        <w:gridCol w:w="1559"/>
+        <w:gridCol w:w="1985"/>
+        <w:gridCol w:w="1417"/>
+        <w:gridCol w:w="851"/>
+        <w:gridCol w:w="1417"/>
         <w:gridCol w:w="1559"/>
       </w:tblGrid>
       <w:tr>
@@ -4973,7 +5466,7 @@
         </w:trPr>
         <w:tc>
           <w:tcPr>
-            <w:tcW w:w="1364" w:type="dxa"/>
+            <w:tcW w:w="1413" w:type="dxa"/>
           </w:tcPr>
           <w:p>
             <w:pPr>
@@ -4998,7 +5491,7 @@
         </w:tc>
         <w:tc>
           <w:tcPr>
-            <w:tcW w:w="1608" w:type="dxa"/>
+            <w:tcW w:w="1559" w:type="dxa"/>
           </w:tcPr>
           <w:p>
             <w:pPr>
@@ -5023,7 +5516,7 @@
         </w:tc>
         <w:tc>
           <w:tcPr>
-            <w:tcW w:w="1750" w:type="dxa"/>
+            <w:tcW w:w="1985" w:type="dxa"/>
           </w:tcPr>
           <w:p>
             <w:pPr>
@@ -5042,13 +5535,27 @@
                 <w:sz w:val="24"/>
                 <w:szCs w:val="24"/>
               </w:rPr>
-              <w:t>No. Lote</w:t>
-            </w:r>
-          </w:p>
-        </w:tc>
-        <w:tc>
-          <w:tcPr>
-            <w:tcW w:w="1168" w:type="dxa"/>
+              <w:t xml:space="preserve">No. </w:t>
+            </w:r>
+            <w:r>
+              <w:rPr>
+                <w:sz w:val="24"/>
+                <w:szCs w:val="24"/>
+              </w:rPr>
+              <w:t>l</w:t>
+            </w:r>
+            <w:r>
+              <w:rPr>
+                <w:sz w:val="24"/>
+                <w:szCs w:val="24"/>
+              </w:rPr>
+              <w:t>ote</w:t>
+            </w:r>
+          </w:p>
+        </w:tc>
+        <w:tc>
+          <w:tcPr>
+            <w:tcW w:w="1417" w:type="dxa"/>
           </w:tcPr>
           <w:p>
             <w:pPr>
@@ -5073,7 +5580,7 @@
         </w:tc>
         <w:tc>
           <w:tcPr>
-            <w:tcW w:w="1051" w:type="dxa"/>
+            <w:tcW w:w="851" w:type="dxa"/>
           </w:tcPr>
           <w:p>
             <w:pPr>
@@ -5098,7 +5605,7 @@
         </w:tc>
         <w:tc>
           <w:tcPr>
-            <w:tcW w:w="1701" w:type="dxa"/>
+            <w:tcW w:w="1417" w:type="dxa"/>
           </w:tcPr>
           <w:p>
             <w:pPr>
@@ -5153,7 +5660,7 @@
         </w:trPr>
         <w:tc>
           <w:tcPr>
-            <w:tcW w:w="1364" w:type="dxa"/>
+            <w:tcW w:w="1413" w:type="dxa"/>
           </w:tcPr>
           <w:p>
             <w:pPr>
@@ -5172,7 +5679,7 @@
         </w:tc>
         <w:tc>
           <w:tcPr>
-            <w:tcW w:w="1608" w:type="dxa"/>
+            <w:tcW w:w="1559" w:type="dxa"/>
           </w:tcPr>
           <w:p>
             <w:pPr>
@@ -5191,7 +5698,7 @@
         </w:tc>
         <w:tc>
           <w:tcPr>
-            <w:tcW w:w="1750" w:type="dxa"/>
+            <w:tcW w:w="1985" w:type="dxa"/>
           </w:tcPr>
           <w:p>
             <w:pPr>
@@ -5210,7 +5717,7 @@
         </w:tc>
         <w:tc>
           <w:tcPr>
-            <w:tcW w:w="1168" w:type="dxa"/>
+            <w:tcW w:w="1417" w:type="dxa"/>
           </w:tcPr>
           <w:p>
             <w:pPr>
@@ -5229,7 +5736,7 @@
         </w:tc>
         <w:tc>
           <w:tcPr>
-            <w:tcW w:w="1051" w:type="dxa"/>
+            <w:tcW w:w="851" w:type="dxa"/>
           </w:tcPr>
           <w:p>
             <w:pPr>
@@ -5248,7 +5755,7 @@
         </w:tc>
         <w:tc>
           <w:tcPr>
-            <w:tcW w:w="1701" w:type="dxa"/>
+            <w:tcW w:w="1417" w:type="dxa"/>
           </w:tcPr>
           <w:p>
             <w:pPr>
@@ -5262,6 +5769,12 @@
                 <w:szCs w:val="24"/>
               </w:rPr>
               <w:t>Se realiza siembra sin novedad</w:t>
+            </w:r>
+            <w:r>
+              <w:rPr>
+                <w:szCs w:val="24"/>
+              </w:rPr>
+              <w:t>.</w:t>
             </w:r>
           </w:p>
         </w:tc>
@@ -5288,7 +5801,7 @@
       <w:tr>
         <w:tc>
           <w:tcPr>
-            <w:tcW w:w="1364" w:type="dxa"/>
+            <w:tcW w:w="1413" w:type="dxa"/>
           </w:tcPr>
           <w:p>
             <w:pPr>
@@ -5307,7 +5820,7 @@
         </w:tc>
         <w:tc>
           <w:tcPr>
-            <w:tcW w:w="1608" w:type="dxa"/>
+            <w:tcW w:w="1559" w:type="dxa"/>
           </w:tcPr>
           <w:p>
             <w:pPr>
@@ -5326,7 +5839,7 @@
         </w:tc>
         <w:tc>
           <w:tcPr>
-            <w:tcW w:w="1750" w:type="dxa"/>
+            <w:tcW w:w="1985" w:type="dxa"/>
           </w:tcPr>
           <w:p>
             <w:pPr>
@@ -5345,7 +5858,7 @@
         </w:tc>
         <w:tc>
           <w:tcPr>
-            <w:tcW w:w="1168" w:type="dxa"/>
+            <w:tcW w:w="1417" w:type="dxa"/>
           </w:tcPr>
           <w:p>
             <w:pPr>
@@ -5364,7 +5877,7 @@
         </w:tc>
         <w:tc>
           <w:tcPr>
-            <w:tcW w:w="1051" w:type="dxa"/>
+            <w:tcW w:w="851" w:type="dxa"/>
           </w:tcPr>
           <w:p>
             <w:pPr>
@@ -5383,7 +5896,7 @@
         </w:tc>
         <w:tc>
           <w:tcPr>
-            <w:tcW w:w="1701" w:type="dxa"/>
+            <w:tcW w:w="1417" w:type="dxa"/>
           </w:tcPr>
           <w:p>
             <w:pPr>
@@ -5396,7 +5909,25 @@
               <w:rPr>
                 <w:szCs w:val="24"/>
               </w:rPr>
-              <w:t>Se evidencio que se encontraban con bastante presencia de humedad</w:t>
+              <w:t>Se evidenci</w:t>
+            </w:r>
+            <w:r>
+              <w:rPr>
+                <w:szCs w:val="24"/>
+              </w:rPr>
+              <w:t>ó</w:t>
+            </w:r>
+            <w:r>
+              <w:rPr>
+                <w:szCs w:val="24"/>
+              </w:rPr>
+              <w:t xml:space="preserve"> que se encontraban con bastante presencia de humedad</w:t>
+            </w:r>
+            <w:r>
+              <w:rPr>
+                <w:szCs w:val="24"/>
+              </w:rPr>
+              <w:t>.</w:t>
             </w:r>
           </w:p>
         </w:tc>
@@ -5457,7 +5988,39 @@
           <w:bCs/>
           <w:lang w:eastAsia="es-CO"/>
         </w:rPr>
-        <w:t xml:space="preserve">Registro de Abonos y Fertilizantes: </w:t>
+        <w:t xml:space="preserve">Registro de </w:t>
+      </w:r>
+      <w:r>
+        <w:rPr>
+          <w:b/>
+          <w:bCs/>
+          <w:lang w:eastAsia="es-CO"/>
+        </w:rPr>
+        <w:t>a</w:t>
+      </w:r>
+      <w:r>
+        <w:rPr>
+          <w:b/>
+          <w:bCs/>
+          <w:lang w:eastAsia="es-CO"/>
+        </w:rPr>
+        <w:t xml:space="preserve">bonos y </w:t>
+      </w:r>
+      <w:r>
+        <w:rPr>
+          <w:b/>
+          <w:bCs/>
+          <w:lang w:eastAsia="es-CO"/>
+        </w:rPr>
+        <w:t>f</w:t>
+      </w:r>
+      <w:r>
+        <w:rPr>
+          <w:b/>
+          <w:bCs/>
+          <w:lang w:eastAsia="es-CO"/>
+        </w:rPr>
+        <w:t xml:space="preserve">ertilizantes: </w:t>
       </w:r>
       <w:r>
         <w:rPr>
@@ -5509,20 +6072,6 @@
     </w:p>
     <w:p>
       <w:pPr>
-        <w:rPr>
-          <w:lang w:eastAsia="es-CO"/>
-        </w:rPr>
-      </w:pPr>
-    </w:p>
-    <w:p>
-      <w:pPr>
-        <w:rPr>
-          <w:lang w:eastAsia="es-CO"/>
-        </w:rPr>
-      </w:pPr>
-    </w:p>
-    <w:p>
-      <w:pPr>
         <w:pStyle w:val="Tabla"/>
         <w:rPr>
           <w:lang w:eastAsia="es-CO"/>
@@ -5532,7 +6081,44 @@
         <w:rPr>
           <w:lang w:eastAsia="es-CO"/>
         </w:rPr>
-        <w:t>Ejemplo de Registro de Abonos y Fertilizantes</w:t>
+        <w:lastRenderedPageBreak/>
+        <w:t xml:space="preserve">Ejemplo de </w:t>
+      </w:r>
+      <w:r>
+        <w:rPr>
+          <w:lang w:eastAsia="es-CO"/>
+        </w:rPr>
+        <w:t>r</w:t>
+      </w:r>
+      <w:r>
+        <w:rPr>
+          <w:lang w:eastAsia="es-CO"/>
+        </w:rPr>
+        <w:t xml:space="preserve">egistro de </w:t>
+      </w:r>
+      <w:r>
+        <w:rPr>
+          <w:lang w:eastAsia="es-CO"/>
+        </w:rPr>
+        <w:t>a</w:t>
+      </w:r>
+      <w:r>
+        <w:rPr>
+          <w:lang w:eastAsia="es-CO"/>
+        </w:rPr>
+        <w:t xml:space="preserve">bonos y </w:t>
+      </w:r>
+      <w:r>
+        <w:rPr>
+          <w:lang w:eastAsia="es-CO"/>
+        </w:rPr>
+        <w:t>f</w:t>
+      </w:r>
+      <w:r>
+        <w:rPr>
+          <w:lang w:eastAsia="es-CO"/>
+        </w:rPr>
+        <w:t>ertilizantes</w:t>
       </w:r>
     </w:p>
     <w:p>
@@ -5556,20 +6142,22 @@
     <w:tbl>
       <w:tblPr>
         <w:tblStyle w:val="SENA"/>
-        <w:tblW w:w="10343" w:type="dxa"/>
+        <w:tblW w:w="10774" w:type="dxa"/>
+        <w:tblInd w:w="-289" w:type="dxa"/>
+        <w:tblLayout w:type="fixed"/>
         <w:tblLook w:val="04A0" w:firstRow="1" w:lastRow="0" w:firstColumn="1" w:lastColumn="0" w:noHBand="0" w:noVBand="1"/>
         <w:tblCaption w:val="Ejemplo de registro de abonos y fertilizantes"/>
         <w:tblDescription w:val="Tabla describe la fecha, área de propagación, producto, inorgánico, órganico, dosis aplicada,responsable y observaciones."/>
       </w:tblPr>
       <w:tblGrid>
         <w:gridCol w:w="1278"/>
-        <w:gridCol w:w="1353"/>
-        <w:gridCol w:w="1505"/>
-        <w:gridCol w:w="1185"/>
-        <w:gridCol w:w="1039"/>
-        <w:gridCol w:w="979"/>
-        <w:gridCol w:w="1372"/>
-        <w:gridCol w:w="1632"/>
+        <w:gridCol w:w="1396"/>
+        <w:gridCol w:w="1561"/>
+        <w:gridCol w:w="1011"/>
+        <w:gridCol w:w="1134"/>
+        <w:gridCol w:w="1417"/>
+        <w:gridCol w:w="1418"/>
+        <w:gridCol w:w="1559"/>
       </w:tblGrid>
       <w:tr>
         <w:trPr>
@@ -5578,7 +6166,7 @@
         </w:trPr>
         <w:tc>
           <w:tcPr>
-            <w:tcW w:w="1257" w:type="dxa"/>
+            <w:tcW w:w="1278" w:type="dxa"/>
           </w:tcPr>
           <w:p>
             <w:pPr>
@@ -5601,7 +6189,7 @@
         </w:tc>
         <w:tc>
           <w:tcPr>
-            <w:tcW w:w="1331" w:type="dxa"/>
+            <w:tcW w:w="1396" w:type="dxa"/>
           </w:tcPr>
           <w:p>
             <w:pPr>
@@ -5624,7 +6212,7 @@
         </w:tc>
         <w:tc>
           <w:tcPr>
-            <w:tcW w:w="1481" w:type="dxa"/>
+            <w:tcW w:w="1561" w:type="dxa"/>
           </w:tcPr>
           <w:p>
             <w:pPr>
@@ -5647,7 +6235,7 @@
         </w:tc>
         <w:tc>
           <w:tcPr>
-            <w:tcW w:w="1167" w:type="dxa"/>
+            <w:tcW w:w="1011" w:type="dxa"/>
           </w:tcPr>
           <w:p>
             <w:pPr>
@@ -5670,7 +6258,7 @@
         </w:tc>
         <w:tc>
           <w:tcPr>
-            <w:tcW w:w="1023" w:type="dxa"/>
+            <w:tcW w:w="1134" w:type="dxa"/>
           </w:tcPr>
           <w:p>
             <w:pPr>
@@ -5693,7 +6281,7 @@
         </w:tc>
         <w:tc>
           <w:tcPr>
-            <w:tcW w:w="965" w:type="dxa"/>
+            <w:tcW w:w="1417" w:type="dxa"/>
           </w:tcPr>
           <w:p>
             <w:pPr>
@@ -5738,7 +6326,7 @@
         </w:tc>
         <w:tc>
           <w:tcPr>
-            <w:tcW w:w="1350" w:type="dxa"/>
+            <w:tcW w:w="1418" w:type="dxa"/>
           </w:tcPr>
           <w:p>
             <w:pPr>
@@ -5761,7 +6349,7 @@
         </w:tc>
         <w:tc>
           <w:tcPr>
-            <w:tcW w:w="1769" w:type="dxa"/>
+            <w:tcW w:w="1559" w:type="dxa"/>
           </w:tcPr>
           <w:p>
             <w:pPr>
@@ -5787,7 +6375,7 @@
         </w:trPr>
         <w:tc>
           <w:tcPr>
-            <w:tcW w:w="1257" w:type="dxa"/>
+            <w:tcW w:w="1278" w:type="dxa"/>
           </w:tcPr>
           <w:p>
             <w:pPr>
@@ -5806,7 +6394,7 @@
         </w:tc>
         <w:tc>
           <w:tcPr>
-            <w:tcW w:w="1331" w:type="dxa"/>
+            <w:tcW w:w="1396" w:type="dxa"/>
           </w:tcPr>
           <w:p>
             <w:pPr>
@@ -5825,7 +6413,7 @@
         </w:tc>
         <w:tc>
           <w:tcPr>
-            <w:tcW w:w="1481" w:type="dxa"/>
+            <w:tcW w:w="1561" w:type="dxa"/>
           </w:tcPr>
           <w:p>
             <w:pPr>
@@ -5838,21 +6426,19 @@
               <w:rPr>
                 <w:sz w:val="22"/>
               </w:rPr>
-              <w:t xml:space="preserve">Caldo </w:t>
-            </w:r>
-            <w:proofErr w:type="spellStart"/>
+              <w:t>Caldo Sulfocalcico</w:t>
+            </w:r>
             <w:r>
               <w:rPr>
                 <w:sz w:val="22"/>
               </w:rPr>
-              <w:t>Sulfocalcico</w:t>
-            </w:r>
-            <w:proofErr w:type="spellEnd"/>
-          </w:p>
-        </w:tc>
-        <w:tc>
-          <w:tcPr>
-            <w:tcW w:w="1167" w:type="dxa"/>
+              <w:t>.</w:t>
+            </w:r>
+          </w:p>
+        </w:tc>
+        <w:tc>
+          <w:tcPr>
+            <w:tcW w:w="1011" w:type="dxa"/>
           </w:tcPr>
           <w:p>
             <w:pPr>
@@ -5871,7 +6457,7 @@
         </w:tc>
         <w:tc>
           <w:tcPr>
-            <w:tcW w:w="1023" w:type="dxa"/>
+            <w:tcW w:w="1134" w:type="dxa"/>
           </w:tcPr>
           <w:p>
             <w:pPr>
@@ -5884,7 +6470,7 @@
         </w:tc>
         <w:tc>
           <w:tcPr>
-            <w:tcW w:w="965" w:type="dxa"/>
+            <w:tcW w:w="1417" w:type="dxa"/>
           </w:tcPr>
           <w:p>
             <w:pPr>
@@ -5903,7 +6489,7 @@
         </w:tc>
         <w:tc>
           <w:tcPr>
-            <w:tcW w:w="1350" w:type="dxa"/>
+            <w:tcW w:w="1418" w:type="dxa"/>
           </w:tcPr>
           <w:p>
             <w:pPr>
@@ -5922,7 +6508,7 @@
         </w:tc>
         <w:tc>
           <w:tcPr>
-            <w:tcW w:w="1769" w:type="dxa"/>
+            <w:tcW w:w="1559" w:type="dxa"/>
           </w:tcPr>
           <w:p>
             <w:pPr>
@@ -5946,7 +6532,7 @@
         </w:trPr>
         <w:tc>
           <w:tcPr>
-            <w:tcW w:w="1257" w:type="dxa"/>
+            <w:tcW w:w="1278" w:type="dxa"/>
           </w:tcPr>
           <w:p>
             <w:pPr>
@@ -5965,7 +6551,7 @@
         </w:tc>
         <w:tc>
           <w:tcPr>
-            <w:tcW w:w="1331" w:type="dxa"/>
+            <w:tcW w:w="1396" w:type="dxa"/>
           </w:tcPr>
           <w:p>
             <w:pPr>
@@ -5984,7 +6570,7 @@
         </w:tc>
         <w:tc>
           <w:tcPr>
-            <w:tcW w:w="1481" w:type="dxa"/>
+            <w:tcW w:w="1561" w:type="dxa"/>
           </w:tcPr>
           <w:p>
             <w:pPr>
@@ -5993,19 +6579,82 @@
                 <w:sz w:val="22"/>
               </w:rPr>
             </w:pPr>
+            <w:r>
+              <w:rPr>
+                <w:sz w:val="22"/>
+              </w:rPr>
+              <w:t>Pyraclostrobin</w:t>
+            </w:r>
+            <w:r>
+              <w:rPr>
+                <w:sz w:val="22"/>
+              </w:rPr>
+              <w:t>.</w:t>
+            </w:r>
+          </w:p>
+        </w:tc>
+        <w:tc>
+          <w:tcPr>
+            <w:tcW w:w="1011" w:type="dxa"/>
+          </w:tcPr>
+          <w:p>
+            <w:pPr>
+              <w:pStyle w:val="TextoTablas"/>
+              <w:rPr>
+                <w:sz w:val="22"/>
+              </w:rPr>
+            </w:pPr>
+          </w:p>
+        </w:tc>
+        <w:tc>
+          <w:tcPr>
+            <w:tcW w:w="1134" w:type="dxa"/>
+          </w:tcPr>
+          <w:p>
+            <w:pPr>
+              <w:pStyle w:val="TextoTablas"/>
+              <w:rPr>
+                <w:sz w:val="22"/>
+              </w:rPr>
+            </w:pPr>
+            <w:r>
+              <w:rPr>
+                <w:sz w:val="22"/>
+              </w:rPr>
+              <w:t>X</w:t>
+            </w:r>
+          </w:p>
+        </w:tc>
+        <w:tc>
+          <w:tcPr>
+            <w:tcW w:w="1417" w:type="dxa"/>
+          </w:tcPr>
+          <w:p>
+            <w:pPr>
+              <w:pStyle w:val="TextoTablas"/>
+              <w:rPr>
+                <w:sz w:val="22"/>
+              </w:rPr>
+            </w:pPr>
+            <w:r>
+              <w:rPr>
+                <w:sz w:val="22"/>
+              </w:rPr>
+              <w:t xml:space="preserve">10 </w:t>
+            </w:r>
             <w:proofErr w:type="spellStart"/>
             <w:r>
               <w:rPr>
                 <w:sz w:val="22"/>
               </w:rPr>
-              <w:t>Pyraclostrobin</w:t>
+              <w:t>cc</w:t>
             </w:r>
             <w:proofErr w:type="spellEnd"/>
           </w:p>
         </w:tc>
         <w:tc>
           <w:tcPr>
-            <w:tcW w:w="1167" w:type="dxa"/>
+            <w:tcW w:w="1418" w:type="dxa"/>
           </w:tcPr>
           <w:p>
             <w:pPr>
@@ -6014,76 +6663,17 @@
                 <w:sz w:val="22"/>
               </w:rPr>
             </w:pPr>
-          </w:p>
-        </w:tc>
-        <w:tc>
-          <w:tcPr>
-            <w:tcW w:w="1023" w:type="dxa"/>
-          </w:tcPr>
-          <w:p>
-            <w:pPr>
-              <w:pStyle w:val="TextoTablas"/>
+            <w:r>
               <w:rPr>
                 <w:sz w:val="22"/>
               </w:rPr>
-            </w:pPr>
-            <w:r>
-              <w:rPr>
-                <w:sz w:val="22"/>
-              </w:rPr>
-              <w:t>X</w:t>
-            </w:r>
-          </w:p>
-        </w:tc>
-        <w:tc>
-          <w:tcPr>
-            <w:tcW w:w="965" w:type="dxa"/>
-          </w:tcPr>
-          <w:p>
-            <w:pPr>
-              <w:pStyle w:val="TextoTablas"/>
-              <w:rPr>
-                <w:sz w:val="22"/>
-              </w:rPr>
-            </w:pPr>
-            <w:r>
-              <w:rPr>
-                <w:sz w:val="22"/>
-              </w:rPr>
-              <w:t xml:space="preserve">10 </w:t>
-            </w:r>
-            <w:proofErr w:type="spellStart"/>
-            <w:r>
-              <w:rPr>
-                <w:sz w:val="22"/>
-              </w:rPr>
-              <w:t>cc</w:t>
-            </w:r>
-            <w:proofErr w:type="spellEnd"/>
-          </w:p>
-        </w:tc>
-        <w:tc>
-          <w:tcPr>
-            <w:tcW w:w="1350" w:type="dxa"/>
-          </w:tcPr>
-          <w:p>
-            <w:pPr>
-              <w:pStyle w:val="TextoTablas"/>
-              <w:rPr>
-                <w:sz w:val="22"/>
-              </w:rPr>
-            </w:pPr>
-            <w:r>
-              <w:rPr>
-                <w:sz w:val="22"/>
-              </w:rPr>
               <w:t>Fernando Ramírez</w:t>
             </w:r>
           </w:p>
         </w:tc>
         <w:tc>
           <w:tcPr>
-            <w:tcW w:w="1769" w:type="dxa"/>
+            <w:tcW w:w="1559" w:type="dxa"/>
           </w:tcPr>
           <w:p>
             <w:pPr>
@@ -6136,7 +6726,7 @@
       <w:pPr>
         <w:pStyle w:val="Ttulo1"/>
       </w:pPr>
-      <w:bookmarkStart w:id="8" w:name="_Toc172307437"/>
+      <w:bookmarkStart w:id="8" w:name="_Toc173749615"/>
       <w:r>
         <w:t>Acciones de mejora para el monitoreo de la propagación vegetal</w:t>
       </w:r>
@@ -6152,38 +6742,94 @@
         <w:rPr>
           <w:lang w:val="es-419" w:eastAsia="es-CO"/>
         </w:rPr>
+        <w:t xml:space="preserve">Las acciones de mejora son establecidas, de acuerdo </w:t>
+      </w:r>
+      <w:r>
+        <w:rPr>
+          <w:lang w:val="es-419" w:eastAsia="es-CO"/>
+        </w:rPr>
+        <w:t>con</w:t>
+      </w:r>
+      <w:r>
+        <w:rPr>
+          <w:lang w:val="es-419" w:eastAsia="es-CO"/>
+        </w:rPr>
+        <w:t xml:space="preserve"> las acciones correctivas o preventivas, identificadas a través de inconformidades o áreas potenciales de una actividad; que llevan a fortalecer las áreas de oportunidad para brindar un mejor producto.</w:t>
+      </w:r>
+    </w:p>
+    <w:p>
+      <w:pPr>
+        <w:rPr>
+          <w:lang w:val="es-419" w:eastAsia="es-CO"/>
+        </w:rPr>
+      </w:pPr>
+      <w:r>
+        <w:rPr>
+          <w:lang w:val="es-419" w:eastAsia="es-CO"/>
+        </w:rPr>
         <w:lastRenderedPageBreak/>
-        <w:t>Las acciones de mejora son establecidas, de acuerdo a las acciones correctivas o preventivas, identificadas a través de inconformidades o áreas potenciales de una actividad; que conllevan a fortalecer las áreas de oportunidad para brindar un mejor producto.</w:t>
-      </w:r>
-    </w:p>
-    <w:p>
-      <w:pPr>
-        <w:rPr>
-          <w:lang w:val="es-419" w:eastAsia="es-CO"/>
-        </w:rPr>
-      </w:pPr>
-      <w:r>
-        <w:rPr>
-          <w:lang w:val="es-419" w:eastAsia="es-CO"/>
-        </w:rPr>
-        <w:t>En las actividades de monitoreo se hace necesario identificar, analizar y generar acciones de mejora, que le permita avanzar en cada uno de los procesos donde se evidencian debilidades. Teniendo por ejemplo que algunos de los métodos para evaluar los niveles de sustentabilidad en las actividades de propagación del material vegetal son el marco de evaluación de sustentabilidad con su respectivo monitoreo y evaluación de la sustentabilidad.</w:t>
-      </w:r>
-    </w:p>
-    <w:p>
-      <w:pPr>
-        <w:rPr>
-          <w:b/>
-          <w:bCs/>
-          <w:lang w:val="es-419" w:eastAsia="es-CO"/>
-        </w:rPr>
-      </w:pPr>
-      <w:r>
-        <w:rPr>
-          <w:b/>
-          <w:bCs/>
-          <w:lang w:val="es-419" w:eastAsia="es-CO"/>
-        </w:rPr>
-        <w:t>Marco de Evaluación de Sustentabilidad</w:t>
+        <w:t>En las actividades de monitoreo se hace necesario identificar, analizar y generar acciones de mejora, que le permita</w:t>
+      </w:r>
+      <w:r>
+        <w:rPr>
+          <w:lang w:val="es-419" w:eastAsia="es-CO"/>
+        </w:rPr>
+        <w:t>n</w:t>
+      </w:r>
+      <w:r>
+        <w:rPr>
+          <w:lang w:val="es-419" w:eastAsia="es-CO"/>
+        </w:rPr>
+        <w:t xml:space="preserve"> avanzar en cada uno de los procesos donde se evidencian debilidades. Teniendo por ejemplo que algunos de los métodos para evaluar los niveles de sustentabilidad en las actividades de propagación del material vegetal son el marco de evaluación de sustentabilidad con su respectivo monitoreo y evaluación de la sustentabilidad.</w:t>
+      </w:r>
+    </w:p>
+    <w:p>
+      <w:pPr>
+        <w:rPr>
+          <w:b/>
+          <w:bCs/>
+          <w:lang w:val="es-419" w:eastAsia="es-CO"/>
+        </w:rPr>
+      </w:pPr>
+      <w:r>
+        <w:rPr>
+          <w:b/>
+          <w:bCs/>
+          <w:lang w:val="es-419" w:eastAsia="es-CO"/>
+        </w:rPr>
+        <w:t xml:space="preserve">Marco de </w:t>
+      </w:r>
+      <w:r>
+        <w:rPr>
+          <w:b/>
+          <w:bCs/>
+          <w:lang w:val="es-419" w:eastAsia="es-CO"/>
+        </w:rPr>
+        <w:t>e</w:t>
+      </w:r>
+      <w:r>
+        <w:rPr>
+          <w:b/>
+          <w:bCs/>
+          <w:lang w:val="es-419" w:eastAsia="es-CO"/>
+        </w:rPr>
+        <w:t xml:space="preserve">valuación de </w:t>
+      </w:r>
+      <w:r>
+        <w:rPr>
+          <w:b/>
+          <w:bCs/>
+          <w:lang w:val="es-419" w:eastAsia="es-CO"/>
+        </w:rPr>
+        <w:t>s</w:t>
+      </w:r>
+      <w:r>
+        <w:rPr>
+          <w:b/>
+          <w:bCs/>
+          <w:lang w:val="es-419" w:eastAsia="es-CO"/>
+        </w:rPr>
+        <w:t>ustentabilidad</w:t>
       </w:r>
     </w:p>
     <w:p>
@@ -6209,55 +6855,55 @@
         <w:rPr>
           <w:lang w:val="es-419" w:eastAsia="es-CO"/>
         </w:rPr>
-        <w:t xml:space="preserve">Ahora bien, los sistemas de manejo sustentables son aquellos que permanecen cambiando, los cuales deben tener la capacidad de ser productivos, de autorregularse y de transformarse, sin perder su funcionalidad; a su vez estas capacidades podrán ser analizadas mediante los atributos o propiedades sistémicas fundamentales que son </w:t>
+        <w:t>Ahora bien, los sistemas de manejo sustentables son aquellos que permanecen cambiando, los cuales deben tener la capacidad de ser productivos, de autorregularse y de transformarse, sin perder su funcionalidad; a su vez estas capacidades podrán ser analizadas mediante los atributos o propiedades sistémicas fundamentales que son productividad, resiliencia, confiabilidad, estabilidad, autogestión, equidad y adaptabilidad. (</w:t>
+      </w:r>
+      <w:proofErr w:type="spellStart"/>
+      <w:r>
+        <w:rPr>
+          <w:lang w:val="es-419" w:eastAsia="es-CO"/>
+        </w:rPr>
+        <w:t>Astier</w:t>
+      </w:r>
+      <w:proofErr w:type="spellEnd"/>
+      <w:r>
+        <w:rPr>
+          <w:lang w:val="es-419" w:eastAsia="es-CO"/>
+        </w:rPr>
+        <w:t>, M., Masera, O. R., &amp; Galván-</w:t>
+      </w:r>
+      <w:proofErr w:type="spellStart"/>
+      <w:r>
+        <w:rPr>
+          <w:lang w:val="es-419" w:eastAsia="es-CO"/>
+        </w:rPr>
+        <w:t>Miyoshi</w:t>
+      </w:r>
+      <w:proofErr w:type="spellEnd"/>
+      <w:r>
+        <w:rPr>
+          <w:lang w:val="es-419" w:eastAsia="es-CO"/>
+        </w:rPr>
+        <w:t>, Y. 2008. p17-18).</w:t>
+      </w:r>
+    </w:p>
+    <w:p>
+      <w:pPr>
+        <w:rPr>
+          <w:lang w:val="es-419" w:eastAsia="es-CO"/>
+        </w:rPr>
+      </w:pPr>
+      <w:r>
+        <w:rPr>
+          <w:lang w:val="es-419" w:eastAsia="es-CO"/>
+        </w:rPr>
+        <w:t xml:space="preserve">Es así como este análisis constante aporta a la evaluación de sustentabilidad, la cual permite que, por medio de la identificación de fortalezas y debilidades, que permite </w:t>
       </w:r>
       <w:r>
         <w:rPr>
           <w:lang w:val="es-419" w:eastAsia="es-CO"/>
         </w:rPr>
         <w:lastRenderedPageBreak/>
-        <w:t>productividad, resiliencia, confiabilidad, estabilidad, autogestión, equidad y adaptabilidad. (</w:t>
-      </w:r>
-      <w:proofErr w:type="spellStart"/>
-      <w:r>
-        <w:rPr>
-          <w:lang w:val="es-419" w:eastAsia="es-CO"/>
-        </w:rPr>
-        <w:t>Astier</w:t>
-      </w:r>
-      <w:proofErr w:type="spellEnd"/>
-      <w:r>
-        <w:rPr>
-          <w:lang w:val="es-419" w:eastAsia="es-CO"/>
-        </w:rPr>
-        <w:t>, M., Masera, O. R., &amp; Galván-</w:t>
-      </w:r>
-      <w:proofErr w:type="spellStart"/>
-      <w:r>
-        <w:rPr>
-          <w:lang w:val="es-419" w:eastAsia="es-CO"/>
-        </w:rPr>
-        <w:t>Miyoshi</w:t>
-      </w:r>
-      <w:proofErr w:type="spellEnd"/>
-      <w:r>
-        <w:rPr>
-          <w:lang w:val="es-419" w:eastAsia="es-CO"/>
-        </w:rPr>
-        <w:t>, Y. 2008. p17-18).</w:t>
-      </w:r>
-    </w:p>
-    <w:p>
-      <w:pPr>
-        <w:rPr>
-          <w:lang w:val="es-419" w:eastAsia="es-CO"/>
-        </w:rPr>
-      </w:pPr>
-      <w:r>
-        <w:rPr>
-          <w:lang w:val="es-419" w:eastAsia="es-CO"/>
-        </w:rPr>
-        <w:t>Es así como este análisis constante aporta a la evaluación de sustentabilidad, la cual permite que, por medio de la identificación de fortalezas y debilidades, que permite realizar un análisis de los factores que pueden llegar a incidir en la adecuada sustentabilidad de los procesos de propagación.</w:t>
+        <w:t>realizar un análisis de los factores que pueden llegar a incidir en la adecuada sustentabilidad de los procesos de propagación.</w:t>
       </w:r>
     </w:p>
     <w:p>
@@ -6350,8 +6996,8 @@
         <w:tblDescription w:val="Tabla que describe la problemática e indicadores."/>
       </w:tblPr>
       <w:tblGrid>
-        <w:gridCol w:w="3832"/>
-        <w:gridCol w:w="3827"/>
+        <w:gridCol w:w="4688"/>
+        <w:gridCol w:w="4379"/>
       </w:tblGrid>
       <w:tr>
         <w:trPr>
@@ -6360,7 +7006,7 @@
         </w:trPr>
         <w:tc>
           <w:tcPr>
-            <w:tcW w:w="3832" w:type="dxa"/>
+            <w:tcW w:w="4688" w:type="dxa"/>
           </w:tcPr>
           <w:p>
             <w:pPr>
@@ -6385,7 +7031,7 @@
         </w:tc>
         <w:tc>
           <w:tcPr>
-            <w:tcW w:w="3827" w:type="dxa"/>
+            <w:tcW w:w="4379" w:type="dxa"/>
           </w:tcPr>
           <w:p>
             <w:pPr>
@@ -6416,7 +7062,7 @@
         </w:trPr>
         <w:tc>
           <w:tcPr>
-            <w:tcW w:w="3832" w:type="dxa"/>
+            <w:tcW w:w="4688" w:type="dxa"/>
           </w:tcPr>
           <w:p>
             <w:pPr>
@@ -6427,8 +7073,6 @@
             </w:pPr>
             <w:r>
               <w:rPr>
-                <w:b/>
-                <w:bCs/>
                 <w:szCs w:val="24"/>
               </w:rPr>
               <w:t>Aumento de los hongos</w:t>
@@ -6443,7 +7087,7 @@
         </w:tc>
         <w:tc>
           <w:tcPr>
-            <w:tcW w:w="3827" w:type="dxa"/>
+            <w:tcW w:w="4379" w:type="dxa"/>
           </w:tcPr>
           <w:p>
             <w:pPr>
@@ -6473,7 +7117,7 @@
         </w:trPr>
         <w:tc>
           <w:tcPr>
-            <w:tcW w:w="3832" w:type="dxa"/>
+            <w:tcW w:w="4688" w:type="dxa"/>
           </w:tcPr>
           <w:p>
             <w:pPr>
@@ -6498,7 +7142,7 @@
         </w:tc>
         <w:tc>
           <w:tcPr>
-            <w:tcW w:w="3827" w:type="dxa"/>
+            <w:tcW w:w="4379" w:type="dxa"/>
           </w:tcPr>
           <w:p>
             <w:pPr>
@@ -6566,43 +7210,43 @@
           <w:szCs w:val="28"/>
           <w:lang w:val="es-419" w:eastAsia="es-CO"/>
         </w:rPr>
-        <w:t xml:space="preserve">que los indicadores serán definidos de acuerdo a las necesidades y debilidades identificadas por los actores de los procesos económicos, </w:t>
+        <w:t>que los indicadores serán definidos de acuerdo a las necesidades y debilidades identificadas por los actores de los procesos económicos, ambientales y sociales; y, el proceso de medición y monitoreo es definido de acuerdo a las variables más adaptables para cada actividad</w:t>
       </w:r>
       <w:r>
         <w:rPr>
           <w:szCs w:val="28"/>
           <w:lang w:val="es-419" w:eastAsia="es-CO"/>
         </w:rPr>
+        <w:t>,</w:t>
+      </w:r>
+      <w:r>
+        <w:rPr>
+          <w:szCs w:val="28"/>
+          <w:lang w:val="es-419" w:eastAsia="es-CO"/>
+        </w:rPr>
+        <w:t xml:space="preserve"> teniendo en cuenta factores como tiempo, análisis de información y/o aplicación de ciertas variables que permita generar un avance direccionado a la sustentabilidad. Para ello </w:t>
+      </w:r>
+      <w:r>
+        <w:rPr>
+          <w:szCs w:val="28"/>
+          <w:lang w:val="es-419" w:eastAsia="es-CO"/>
+        </w:rPr>
+        <w:t xml:space="preserve">se puede apreciar en </w:t>
+      </w:r>
+      <w:r>
+        <w:rPr>
+          <w:szCs w:val="28"/>
+          <w:lang w:val="es-419" w:eastAsia="es-CO"/>
+        </w:rPr>
+        <w:t xml:space="preserve">el siguiente </w:t>
+      </w:r>
+      <w:r>
+        <w:rPr>
+          <w:szCs w:val="28"/>
+          <w:lang w:val="es-419" w:eastAsia="es-CO"/>
+        </w:rPr>
         <w:lastRenderedPageBreak/>
-        <w:t>ambientales y sociales; y, el proceso de medición y monitoreo es definido de acuerdo a las variables más adaptables para cada actividad</w:t>
-      </w:r>
-      <w:r>
-        <w:rPr>
-          <w:szCs w:val="28"/>
-          <w:lang w:val="es-419" w:eastAsia="es-CO"/>
-        </w:rPr>
-        <w:t>,</w:t>
-      </w:r>
-      <w:r>
-        <w:rPr>
-          <w:szCs w:val="28"/>
-          <w:lang w:val="es-419" w:eastAsia="es-CO"/>
-        </w:rPr>
-        <w:t xml:space="preserve"> teniendo en cuenta factores como tiempo, análisis de información y/o aplicación de ciertas variables que permita generar un avance direccionado a la sustentabilidad. Para ello </w:t>
-      </w:r>
-      <w:r>
-        <w:rPr>
-          <w:szCs w:val="28"/>
-          <w:lang w:val="es-419" w:eastAsia="es-CO"/>
-        </w:rPr>
-        <w:t xml:space="preserve">se puede apreciar en </w:t>
-      </w:r>
-      <w:r>
-        <w:rPr>
-          <w:szCs w:val="28"/>
-          <w:lang w:val="es-419" w:eastAsia="es-CO"/>
-        </w:rPr>
-        <w:t>el siguiente ejemplo de evaluación de sustentabilidad a un vivero de plantas ornamentales de tipo comercial.</w:t>
+        <w:t>ejemplo de evaluación de sustentabilidad a un vivero de plantas ornamentales de tipo comercial.</w:t>
       </w:r>
     </w:p>
     <w:p>
@@ -7268,7 +7912,6 @@
               <w:rPr>
                 <w:sz w:val="22"/>
               </w:rPr>
-              <w:lastRenderedPageBreak/>
               <w:t>Autogestión</w:t>
             </w:r>
             <w:r>
@@ -7386,14 +8029,21 @@
         <w:rPr>
           <w:lang w:val="es-419" w:eastAsia="es-CO"/>
         </w:rPr>
-        <w:t>Por tanto, en lo referente a la evaluación de sustentabilidad, se tiene que, al conocer las debilidades y fortalezas de cada atributo, definido por el marco de evaluación MESMIS; se logra analizar e identificar la manera correcta de realizar un monitoreo de esa debilidad. Dado a esto, se definen los indicadores, necesarios para dar un valor de importancia según la actividad del vivero o producto. Y para el caso específico del proceso de propagación de material vegetal, la evaluación de sustentabilidad se puede realizar, por ejemplo, a un vivero de plantas ornamentales de tipo comercial, encontrando que presenta algunas desventajas en las etapas de crecimiento de las plantas y pérdidas económicas.</w:t>
+        <w:t xml:space="preserve">Por tanto, en lo referente a la evaluación de sustentabilidad, se tiene que, al conocer las debilidades y fortalezas de cada atributo, definido por el marco de </w:t>
+      </w:r>
+      <w:r>
+        <w:rPr>
+          <w:lang w:val="es-419" w:eastAsia="es-CO"/>
+        </w:rPr>
+        <w:lastRenderedPageBreak/>
+        <w:t>evaluación MESMIS; se logra analizar e identificar la manera correcta de realizar un monitoreo de esa debilidad. Dado a esto, se definen los indicadores, necesarios para dar un valor de importancia según la actividad del vivero o producto. Y para el caso específico del proceso de propagación de material vegetal, la evaluación de sustentabilidad se puede realizar, por ejemplo, a un vivero de plantas ornamentales de tipo comercial, encontrando que presenta algunas desventajas en las etapas de crecimiento de las plantas y pérdidas económicas.</w:t>
       </w:r>
     </w:p>
     <w:p>
       <w:pPr>
         <w:pStyle w:val="Titulosgenerales"/>
       </w:pPr>
-      <w:bookmarkStart w:id="9" w:name="_Toc172307438"/>
+      <w:bookmarkStart w:id="9" w:name="_Toc173749616"/>
       <w:r>
         <w:lastRenderedPageBreak/>
         <w:t>Síntesis</w:t>
@@ -7413,7 +8063,19 @@
         <w:rPr>
           <w:lang w:val="es-419" w:eastAsia="es-CO"/>
         </w:rPr>
-        <w:t xml:space="preserve">En este componente se consolida el material de estudio para que el aprendiz identifique las bases técnicas y practicas necesarias para ejercer un adecuado monitoreo a las actividades de propagación vegetal, que pueden ser evidenciadas en un huerto básico, viveros y/o proyectos de investigación donde sea llevada a cabo la reproducción asexual de las plantas para diferentes usos. </w:t>
+        <w:t>En este componente se consolida el material de estudio para que el aprendiz identifique las bases técnicas y pr</w:t>
+      </w:r>
+      <w:r>
+        <w:rPr>
+          <w:lang w:val="es-419" w:eastAsia="es-CO"/>
+        </w:rPr>
+        <w:t>á</w:t>
+      </w:r>
+      <w:r>
+        <w:rPr>
+          <w:lang w:val="es-419" w:eastAsia="es-CO"/>
+        </w:rPr>
+        <w:t xml:space="preserve">cticas necesarias para ejercer un adecuado monitoreo a las actividades de propagación vegetal, que pueden ser evidenciadas en un huerto básico, viveros y/o proyectos de investigación donde sea llevada a cabo la reproducción asexual de las plantas para diferentes usos. </w:t>
       </w:r>
       <w:r>
         <w:rPr>
@@ -7554,33 +8216,29 @@
       <w:pPr>
         <w:ind w:left="-142" w:firstLine="284"/>
         <w:rPr>
+          <w:lang w:val="es-419" w:eastAsia="es-CO"/>
+        </w:rPr>
+      </w:pPr>
+      <w:r>
+        <w:rPr>
           <w:noProof/>
           <w:lang w:val="es-419" w:eastAsia="es-CO"/>
         </w:rPr>
-      </w:pPr>
-    </w:p>
-    <w:p>
-      <w:pPr>
-        <w:ind w:left="-142" w:firstLine="284"/>
-        <w:rPr>
-          <w:lang w:val="es-419" w:eastAsia="es-CO"/>
-        </w:rPr>
-      </w:pPr>
-      <w:r>
-        <w:rPr>
-          <w:b/>
-          <w:bCs/>
+        <w:t xml:space="preserve">Para un mayor </w:t>
+      </w:r>
+      <w:r>
+        <w:rPr>
           <w:noProof/>
           <w:lang w:val="es-419" w:eastAsia="es-CO"/>
         </w:rPr>
-        <w:t>Sintesis.</w:t>
+        <w:t>detalle</w:t>
       </w:r>
       <w:r>
         <w:rPr>
           <w:noProof/>
           <w:lang w:val="es-419" w:eastAsia="es-CO"/>
         </w:rPr>
-        <w:t xml:space="preserve"> Para una mayor visualización de la </w:t>
+        <w:t xml:space="preserve"> de la </w:t>
       </w:r>
       <w:r>
         <w:rPr>
@@ -7589,13 +8247,31 @@
           <w:noProof/>
           <w:lang w:val="es-419" w:eastAsia="es-CO"/>
         </w:rPr>
-        <w:t>sintesis</w:t>
-      </w:r>
-      <w:r>
-        <w:rPr>
+        <w:t>s</w:t>
+      </w:r>
+      <w:r>
+        <w:rPr>
+          <w:b/>
+          <w:bCs/>
           <w:noProof/>
           <w:lang w:val="es-419" w:eastAsia="es-CO"/>
         </w:rPr>
+        <w:t>í</w:t>
+      </w:r>
+      <w:r>
+        <w:rPr>
+          <w:b/>
+          <w:bCs/>
+          <w:noProof/>
+          <w:lang w:val="es-419" w:eastAsia="es-CO"/>
+        </w:rPr>
+        <w:t>ntesis</w:t>
+      </w:r>
+      <w:r>
+        <w:rPr>
+          <w:noProof/>
+          <w:lang w:val="es-419" w:eastAsia="es-CO"/>
+        </w:rPr>
         <w:t>, consulte en la carpeta de anexos.</w:t>
       </w:r>
     </w:p>
@@ -7618,7 +8294,7 @@
       <w:pPr>
         <w:pStyle w:val="Titulosgenerales"/>
       </w:pPr>
-      <w:bookmarkStart w:id="10" w:name="_Toc172307439"/>
+      <w:bookmarkStart w:id="10" w:name="_Toc173749617"/>
       <w:r>
         <w:lastRenderedPageBreak/>
         <w:t>Material complementario</w:t>
@@ -7914,11 +8590,9 @@
             <w:pPr>
               <w:pStyle w:val="TextoTablas"/>
             </w:pPr>
-            <w:proofErr w:type="spellStart"/>
-            <w:r>
-              <w:t>Capitulo</w:t>
-            </w:r>
-            <w:proofErr w:type="spellEnd"/>
+            <w:r>
+              <w:t>Capítulo</w:t>
+            </w:r>
             <w:r>
               <w:t xml:space="preserve"> 14</w:t>
             </w:r>
@@ -7972,7 +8646,7 @@
       <w:pPr>
         <w:pStyle w:val="Titulosgenerales"/>
       </w:pPr>
-      <w:bookmarkStart w:id="11" w:name="_Toc172307440"/>
+      <w:bookmarkStart w:id="11" w:name="_Toc173749618"/>
       <w:r>
         <w:lastRenderedPageBreak/>
         <w:t>Glosario</w:t>
@@ -8102,7 +8776,23 @@
           <w:bCs/>
           <w:lang w:val="es-419" w:eastAsia="es-CO"/>
         </w:rPr>
-        <w:t>Sanidad Vegetal:</w:t>
+        <w:t xml:space="preserve">Sanidad </w:t>
+      </w:r>
+      <w:r>
+        <w:rPr>
+          <w:b/>
+          <w:bCs/>
+          <w:lang w:val="es-419" w:eastAsia="es-CO"/>
+        </w:rPr>
+        <w:t>v</w:t>
+      </w:r>
+      <w:r>
+        <w:rPr>
+          <w:b/>
+          <w:bCs/>
+          <w:lang w:val="es-419" w:eastAsia="es-CO"/>
+        </w:rPr>
+        <w:t>egetal:</w:t>
       </w:r>
       <w:r>
         <w:rPr>
@@ -8143,7 +8833,7 @@
       <w:pPr>
         <w:pStyle w:val="Titulosgenerales"/>
       </w:pPr>
-      <w:bookmarkStart w:id="12" w:name="_Toc172307441"/>
+      <w:bookmarkStart w:id="12" w:name="_Toc173749619"/>
       <w:r>
         <w:lastRenderedPageBreak/>
         <w:t>Referencias bibliográficas</w:t>
@@ -8171,6 +8861,21 @@
         </w:rPr>
         <w:t>.</w:t>
       </w:r>
+      <w:r>
+        <w:rPr>
+          <w:lang w:val="es-419" w:eastAsia="es-CO"/>
+        </w:rPr>
+        <w:t xml:space="preserve"> </w:t>
+      </w:r>
+      <w:hyperlink r:id="rId19" w:history="1">
+        <w:r>
+          <w:rPr>
+            <w:rStyle w:val="Hipervnculo"/>
+            <w:lang w:val="es-419" w:eastAsia="es-CO"/>
+          </w:rPr>
+          <w:t>https://repositoriosdigitales.mincyt.gob.ar/vufind/Record/SEDICI_53f6362bd48a838f7830eae3364f7ae4</w:t>
+        </w:r>
+      </w:hyperlink>
     </w:p>
     <w:p>
       <w:pPr>
@@ -8220,10 +8925,53 @@
         </w:rPr>
         <w:t>) i9788461256419). Valencia: SEAE.</w:t>
       </w:r>
-    </w:p>
-    <w:p>
-      <w:pPr>
-        <w:rPr>
+      <w:r>
+        <w:rPr>
+          <w:lang w:val="es-419" w:eastAsia="es-CO"/>
+        </w:rPr>
+        <w:t xml:space="preserve"> </w:t>
+      </w:r>
+      <w:hyperlink r:id="rId20" w:history="1">
+        <w:r>
+          <w:rPr>
+            <w:rStyle w:val="Hipervnculo"/>
+            <w:lang w:val="es-419" w:eastAsia="es-CO"/>
+          </w:rPr>
+          <w:t>https://repositoriosdigitales.mincyt.gob.ar/vufind/Record/SEDICI_53f6362bd48a838f7830eae3364f7ae4</w:t>
+        </w:r>
+      </w:hyperlink>
+    </w:p>
+    <w:p>
+      <w:pPr>
+        <w:rPr>
+          <w:lang w:val="es-419" w:eastAsia="es-CO"/>
+        </w:rPr>
+      </w:pPr>
+      <w:proofErr w:type="spellStart"/>
+      <w:r>
+        <w:rPr>
+          <w:lang w:val="es-419" w:eastAsia="es-CO"/>
+        </w:rPr>
+        <w:t>Bakkes</w:t>
+      </w:r>
+      <w:proofErr w:type="spellEnd"/>
+      <w:r>
+        <w:rPr>
+          <w:lang w:val="es-419" w:eastAsia="es-CO"/>
+        </w:rPr>
+        <w:t xml:space="preserve"> et al.,1994</w:t>
+      </w:r>
+      <w:r>
+        <w:rPr>
+          <w:lang w:val="es-419" w:eastAsia="es-CO"/>
+        </w:rPr>
+        <w:t>.</w:t>
+      </w:r>
+    </w:p>
+    <w:p>
+      <w:pPr>
+        <w:rPr>
+          <w:rStyle w:val="Hipervnculo"/>
           <w:lang w:val="es-419" w:eastAsia="es-CO"/>
         </w:rPr>
       </w:pPr>
@@ -8239,6 +8987,64 @@
         </w:rPr>
         <w:t>.</w:t>
       </w:r>
+      <w:r>
+        <w:rPr>
+          <w:lang w:val="es-419" w:eastAsia="es-CO"/>
+        </w:rPr>
+        <w:t xml:space="preserve"> </w:t>
+      </w:r>
+      <w:hyperlink r:id="rId21" w:history="1">
+        <w:r>
+          <w:rPr>
+            <w:rStyle w:val="Hipervnculo"/>
+            <w:lang w:val="es-419" w:eastAsia="es-CO"/>
+          </w:rPr>
+          <w:t>https://openknowledge.fao.org/server/api/core/bitstreams/5e3902ba-cea5-4029-ad97-dcf21cc1ec4e/content</w:t>
+        </w:r>
+      </w:hyperlink>
+    </w:p>
+    <w:p>
+      <w:pPr>
+        <w:rPr>
+          <w:lang w:val="es-419" w:eastAsia="es-CO"/>
+        </w:rPr>
+      </w:pPr>
+      <w:r>
+        <w:rPr>
+          <w:lang w:val="es-419" w:eastAsia="es-CO"/>
+        </w:rPr>
+        <w:t xml:space="preserve">Instituto Colombiano Agropecuario. (2021.). Página principal. </w:t>
+      </w:r>
+      <w:hyperlink r:id="rId22" w:history="1">
+        <w:r>
+          <w:rPr>
+            <w:rStyle w:val="Hipervnculo"/>
+            <w:lang w:val="es-419" w:eastAsia="es-CO"/>
+          </w:rPr>
+          <w:t>https://www.ica.gov.co</w:t>
+        </w:r>
+      </w:hyperlink>
+    </w:p>
+    <w:p>
+      <w:pPr>
+        <w:rPr>
+          <w:lang w:val="es-419" w:eastAsia="es-CO"/>
+        </w:rPr>
+      </w:pPr>
+      <w:proofErr w:type="spellStart"/>
+      <w:r>
+        <w:rPr>
+          <w:lang w:val="es-419" w:eastAsia="es-CO"/>
+        </w:rPr>
+        <w:t>Macagual</w:t>
+      </w:r>
+      <w:proofErr w:type="spellEnd"/>
+      <w:r>
+        <w:rPr>
+          <w:lang w:val="es-419" w:eastAsia="es-CO"/>
+        </w:rPr>
+        <w:t>, 2002. Factor fisiológico.</w:t>
+      </w:r>
     </w:p>
     <w:p>
       <w:pPr>
@@ -8271,6 +9077,7 @@
         <w:rPr>
           <w:lang w:val="es-419" w:eastAsia="es-CO"/>
         </w:rPr>
+        <w:lastRenderedPageBreak/>
         <w:t>Actipan</w:t>
       </w:r>
       <w:proofErr w:type="spellEnd"/>
@@ -8294,6 +9101,34 @@
         </w:rPr>
         <w:t>, 4(2), 139-163.</w:t>
       </w:r>
+      <w:r>
+        <w:rPr>
+          <w:lang w:val="es-419" w:eastAsia="es-CO"/>
+        </w:rPr>
+        <w:t xml:space="preserve"> </w:t>
+      </w:r>
+      <w:hyperlink r:id="rId23" w:history="1">
+        <w:r>
+          <w:rPr>
+            <w:rStyle w:val="Hipervnculo"/>
+            <w:lang w:val="es-419" w:eastAsia="es-CO"/>
+          </w:rPr>
+          <w:t>https://raximhai.uaim.edu.mx/index.php/rx/article/view/1040</w:t>
+        </w:r>
+      </w:hyperlink>
+    </w:p>
+    <w:p>
+      <w:pPr>
+        <w:rPr>
+          <w:lang w:val="es-419" w:eastAsia="es-CO"/>
+        </w:rPr>
+      </w:pPr>
+      <w:r>
+        <w:rPr>
+          <w:lang w:eastAsia="es-CO"/>
+        </w:rPr>
+        <w:t>Rombouts &amp; Rivera (2014).</w:t>
+      </w:r>
     </w:p>
     <w:p>
       <w:pPr>
@@ -8356,6 +9191,22 @@
           <w:lang w:val="es-419" w:eastAsia="es-CO"/>
         </w:rPr>
       </w:pPr>
+      <w:hyperlink r:id="rId24" w:history="1">
+        <w:r>
+          <w:rPr>
+            <w:rStyle w:val="Hipervnculo"/>
+            <w:lang w:val="es-419" w:eastAsia="es-CO"/>
+          </w:rPr>
+          <w:t>https://repositorio.una.ac.cr/handle/11056/13489</w:t>
+        </w:r>
+      </w:hyperlink>
+    </w:p>
+    <w:p>
+      <w:pPr>
+        <w:rPr>
+          <w:lang w:val="es-419" w:eastAsia="es-CO"/>
+        </w:rPr>
+      </w:pPr>
     </w:p>
     <w:p>
       <w:pPr>
@@ -8368,7 +9219,7 @@
       <w:pPr>
         <w:pStyle w:val="Titulosgenerales"/>
       </w:pPr>
-      <w:bookmarkStart w:id="13" w:name="_Toc172307442"/>
+      <w:bookmarkStart w:id="13" w:name="_Toc173749620"/>
       <w:r>
         <w:lastRenderedPageBreak/>
         <w:t>Créditos</w:t>
@@ -8779,7 +9630,7 @@
               <w:pStyle w:val="TextoTablas"/>
             </w:pPr>
             <w:r>
-              <w:t>Nelson Vera</w:t>
+              <w:t>Francisco José Lizcano Reyes</w:t>
             </w:r>
           </w:p>
         </w:tc>
@@ -8792,7 +9643,7 @@
               <w:pStyle w:val="TextoTablas"/>
             </w:pPr>
             <w:r>
-              <w:t>Producción audiovisual</w:t>
+              <w:t>Responsable del equipo</w:t>
             </w:r>
           </w:p>
         </w:tc>
@@ -8805,7 +9656,7 @@
               <w:pStyle w:val="TextoTablas"/>
             </w:pPr>
             <w:r>
-              <w:t>Regional Atlántico - Centro Para El Desarrollo Agroecológico Y Agroindustrial Sabanalarga</w:t>
+              <w:t>Centro Industrial del Diseño y la Manufactura Regional Santander</w:t>
             </w:r>
           </w:p>
         </w:tc>
@@ -8823,7 +9674,7 @@
               <w:pStyle w:val="TextoTablas"/>
             </w:pPr>
             <w:r>
-              <w:t>Liborio de Jesús Castañeda Valencia</w:t>
+              <w:t>Nelson Vera</w:t>
             </w:r>
           </w:p>
         </w:tc>
@@ -8836,15 +9687,7 @@
               <w:pStyle w:val="TextoTablas"/>
             </w:pPr>
             <w:r>
-              <w:t xml:space="preserve">Desarrollo </w:t>
-            </w:r>
-            <w:proofErr w:type="spellStart"/>
-            <w:r>
-              <w:t>Fullstack</w:t>
-            </w:r>
-            <w:proofErr w:type="spellEnd"/>
-            <w:r>
-              <w:t xml:space="preserve"> Junior</w:t>
+              <w:t>Producción audiovisual</w:t>
             </w:r>
           </w:p>
         </w:tc>
@@ -8872,7 +9715,7 @@
               <w:pStyle w:val="TextoTablas"/>
             </w:pPr>
             <w:r>
-              <w:t>Luis Álvarez</w:t>
+              <w:t>Liborio de Jesús Castañeda Valencia</w:t>
             </w:r>
           </w:p>
         </w:tc>
@@ -8885,7 +9728,15 @@
               <w:pStyle w:val="TextoTablas"/>
             </w:pPr>
             <w:r>
-              <w:t>Diseño de contenidos digitales</w:t>
+              <w:t xml:space="preserve">Desarrollo </w:t>
+            </w:r>
+            <w:proofErr w:type="spellStart"/>
+            <w:r>
+              <w:t>Fullstack</w:t>
+            </w:r>
+            <w:proofErr w:type="spellEnd"/>
+            <w:r>
+              <w:t xml:space="preserve"> Junior</w:t>
             </w:r>
           </w:p>
         </w:tc>
@@ -8916,7 +9767,7 @@
               <w:pStyle w:val="TextoTablas"/>
             </w:pPr>
             <w:r>
-              <w:t>Alexander Acosta</w:t>
+              <w:t>Luis Álvarez</w:t>
             </w:r>
           </w:p>
         </w:tc>
@@ -8929,7 +9780,7 @@
               <w:pStyle w:val="TextoTablas"/>
             </w:pPr>
             <w:r>
-              <w:t>Producción audiovisual</w:t>
+              <w:t>Diseño de contenidos digitales</w:t>
             </w:r>
           </w:p>
         </w:tc>
@@ -8958,7 +9809,7 @@
             </w:pPr>
             <w:r>
               <w:lastRenderedPageBreak/>
-              <w:t>Carmen Martínez</w:t>
+              <w:t>Alexander Acosta</w:t>
             </w:r>
           </w:p>
         </w:tc>
@@ -9002,7 +9853,7 @@
               <w:pStyle w:val="TextoTablas"/>
             </w:pPr>
             <w:r>
-              <w:t>Fabian Cuartas</w:t>
+              <w:t>Carmen Martínez</w:t>
             </w:r>
           </w:p>
         </w:tc>
@@ -9015,7 +9866,7 @@
               <w:pStyle w:val="TextoTablas"/>
             </w:pPr>
             <w:r>
-              <w:t>Validación de diseño y contenido</w:t>
+              <w:t>Producción audiovisual</w:t>
             </w:r>
           </w:p>
         </w:tc>
@@ -9043,7 +9894,7 @@
               <w:pStyle w:val="TextoTablas"/>
             </w:pPr>
             <w:r>
-              <w:t>Gilberto Herrera</w:t>
+              <w:t>Fabian Cuartas</w:t>
             </w:r>
           </w:p>
         </w:tc>
@@ -9087,7 +9938,7 @@
               <w:pStyle w:val="TextoTablas"/>
             </w:pPr>
             <w:r>
-              <w:t>Carolina Coca Salazar</w:t>
+              <w:t>Gilberto Herrera</w:t>
             </w:r>
           </w:p>
         </w:tc>
@@ -9100,7 +9951,7 @@
               <w:pStyle w:val="TextoTablas"/>
             </w:pPr>
             <w:r>
-              <w:t>Evaluador para contenidos inclusivos y accesibles</w:t>
+              <w:t>Validación de diseño y contenido</w:t>
             </w:r>
           </w:p>
         </w:tc>
@@ -9128,15 +9979,7 @@
               <w:pStyle w:val="TextoTablas"/>
             </w:pPr>
             <w:r>
-              <w:t xml:space="preserve">Luz </w:t>
-            </w:r>
-            <w:proofErr w:type="spellStart"/>
-            <w:r>
-              <w:t>Karime</w:t>
-            </w:r>
-            <w:proofErr w:type="spellEnd"/>
-            <w:r>
-              <w:t xml:space="preserve"> Amaya</w:t>
+              <w:t>Carolina Coca Salazar</w:t>
             </w:r>
           </w:p>
         </w:tc>
@@ -9149,12 +9992,6 @@
               <w:pStyle w:val="TextoTablas"/>
             </w:pPr>
             <w:r>
-              <w:rPr>
-                <w:rStyle w:val="normaltextrun"/>
-                <w:rFonts w:cs="Calibri"/>
-                <w:color w:val="000000"/>
-                <w:shd w:val="clear" w:color="auto" w:fill="FFFFFF"/>
-              </w:rPr>
               <w:t>Evaluador para contenidos inclusivos y accesibles</w:t>
             </w:r>
           </w:p>
@@ -9186,13 +10023,8 @@
               <w:pStyle w:val="TextoTablas"/>
             </w:pPr>
             <w:r>
-              <w:t xml:space="preserve">Jairo Valencia </w:t>
-            </w:r>
-            <w:proofErr w:type="spellStart"/>
-            <w:r>
-              <w:t>Ebrat</w:t>
-            </w:r>
-            <w:proofErr w:type="spellEnd"/>
+              <w:t>Luz Karime Amaya</w:t>
+            </w:r>
           </w:p>
         </w:tc>
         <w:tc>
@@ -9202,20 +10034,72 @@
           <w:p>
             <w:pPr>
               <w:pStyle w:val="TextoTablas"/>
+            </w:pPr>
+            <w:r>
               <w:rPr>
                 <w:rStyle w:val="normaltextrun"/>
                 <w:rFonts w:cs="Calibri"/>
                 <w:color w:val="000000"/>
                 <w:shd w:val="clear" w:color="auto" w:fill="FFFFFF"/>
               </w:rPr>
-            </w:pPr>
-            <w:r>
+              <w:t>Evaluador para contenidos inclusivos y accesibles</w:t>
+            </w:r>
+          </w:p>
+        </w:tc>
+        <w:tc>
+          <w:tcPr>
+            <w:tcW w:w="3969" w:type="dxa"/>
+          </w:tcPr>
+          <w:p>
+            <w:pPr>
+              <w:pStyle w:val="TextoTablas"/>
+            </w:pPr>
+            <w:r>
+              <w:t>Regional Atlántico - Centro Para El Desarrollo Agroecológico Y Agroindustrial Sabanalarga</w:t>
+            </w:r>
+          </w:p>
+        </w:tc>
+      </w:tr>
+      <w:tr>
+        <w:tc>
+          <w:tcPr>
+            <w:tcW w:w="2830" w:type="dxa"/>
+          </w:tcPr>
+          <w:p>
+            <w:pPr>
+              <w:pStyle w:val="TextoTablas"/>
+            </w:pPr>
+            <w:r>
+              <w:t xml:space="preserve">Jairo Valencia </w:t>
+            </w:r>
+            <w:proofErr w:type="spellStart"/>
+            <w:r>
+              <w:t>Ebrat</w:t>
+            </w:r>
+            <w:proofErr w:type="spellEnd"/>
+          </w:p>
+        </w:tc>
+        <w:tc>
+          <w:tcPr>
+            <w:tcW w:w="3261" w:type="dxa"/>
+          </w:tcPr>
+          <w:p>
+            <w:pPr>
+              <w:pStyle w:val="TextoTablas"/>
               <w:rPr>
                 <w:rStyle w:val="normaltextrun"/>
                 <w:rFonts w:cs="Calibri"/>
                 <w:color w:val="000000"/>
                 <w:shd w:val="clear" w:color="auto" w:fill="FFFFFF"/>
               </w:rPr>
+            </w:pPr>
+            <w:r>
+              <w:rPr>
+                <w:rStyle w:val="normaltextrun"/>
+                <w:rFonts w:cs="Calibri"/>
+                <w:color w:val="000000"/>
+                <w:shd w:val="clear" w:color="auto" w:fill="FFFFFF"/>
+              </w:rPr>
               <w:t>Validación de recursos digitales</w:t>
             </w:r>
           </w:p>
@@ -9252,8 +10136,8 @@
       </w:pPr>
     </w:p>
     <w:sectPr>
-      <w:headerReference w:type="default" r:id="rId19"/>
-      <w:footerReference w:type="default" r:id="rId20"/>
+      <w:headerReference w:type="default" r:id="rId25"/>
+      <w:footerReference w:type="default" r:id="rId26"/>
       <w:pgSz w:w="12240" w:h="15840"/>
       <w:pgMar w:top="1701" w:right="1134" w:bottom="1134" w:left="993" w:header="709" w:footer="737" w:gutter="0"/>
       <w:pgNumType w:start="4"/>
@@ -9265,7 +10149,7 @@
 </file>
 
 <file path=word/endnotes.xml><?xml version="1.0" encoding="utf-8"?>
-<w:endnotes xmlns:wpc="http://schemas.microsoft.com/office/word/2010/wordprocessingCanvas" xmlns:cx="http://schemas.microsoft.com/office/drawing/2014/chartex" xmlns:cx1="http://schemas.microsoft.com/office/drawing/2015/9/8/chartex" xmlns:cx2="http://schemas.microsoft.com/office/drawing/2015/10/21/chartex" xmlns:cx3="http://schemas.microsoft.com/office/drawing/2016/5/9/chartex" xmlns:cx4="http://schemas.microsoft.com/office/drawing/2016/5/10/chartex" xmlns:cx5="http://schemas.microsoft.com/office/drawing/2016/5/11/chartex" xmlns:cx6="http://schemas.microsoft.com/office/drawing/2016/5/12/chartex" xmlns:cx7="http://schemas.microsoft.com/office/drawing/2016/5/13/chartex" xmlns:cx8="http://schemas.microsoft.com/office/drawing/2016/5/14/chartex" xmlns:mc="http://schemas.openxmlformats.org/markup-compatibility/2006" xmlns:aink="http://schemas.microsoft.com/office/drawing/2016/ink" xmlns:am3d="http://schemas.microsoft.com/office/drawing/2017/model3d" xmlns:o="urn:schemas-microsoft-com:office:office" xmlns:oel="http://schemas.microsoft.com/office/2019/extlst" xmlns:r="http://schemas.openxmlformats.org/officeDocument/2006/relationships" xmlns:m="http://schemas.openxmlformats.org/officeDocument/2006/math" xmlns:v="urn:schemas-microsoft-com:vml" xmlns:wp14="http://schemas.microsoft.com/office/word/2010/wordprocessingDrawing" xmlns:wp="http://schemas.openxmlformats.org/drawingml/2006/wordprocessingDrawing" xmlns:w10="urn:schemas-microsoft-com:office:word" xmlns:w="http://schemas.openxmlformats.org/wordprocessingml/2006/main" xmlns:w14="http://schemas.microsoft.com/office/word/2010/wordml" xmlns:w15="http://schemas.microsoft.com/office/word/2012/wordml" xmlns:w16cex="http://schemas.microsoft.com/office/word/2018/wordml/cex" xmlns:w16cid="http://schemas.microsoft.com/office/word/2016/wordml/cid" xmlns:w16="http://schemas.microsoft.com/office/word/2018/wordml" xmlns:w16du="http://schemas.microsoft.com/office/word/2023/wordml/word16du" xmlns:w16sdtdh="http://schemas.microsoft.com/office/word/2020/wordml/sdtdatahash" xmlns:w16se="http://schemas.microsoft.com/office/word/2015/wordml/symex" xmlns:wpg="http://schemas.microsoft.com/office/word/2010/wordprocessingGroup" xmlns:wpi="http://schemas.microsoft.com/office/word/2010/wordprocessingInk" xmlns:wne="http://schemas.microsoft.com/office/word/2006/wordml" xmlns:wps="http://schemas.microsoft.com/office/word/2010/wordprocessingShape" mc:Ignorable="w14 w15 w16se w16cid w16 w16cex w16sdtdh w16du wp14">
+<w:endnotes xmlns:wpc="http://schemas.microsoft.com/office/word/2010/wordprocessingCanvas" xmlns:cx="http://schemas.microsoft.com/office/drawing/2014/chartex" xmlns:cx1="http://schemas.microsoft.com/office/drawing/2015/9/8/chartex" xmlns:cx2="http://schemas.microsoft.com/office/drawing/2015/10/21/chartex" xmlns:cx3="http://schemas.microsoft.com/office/drawing/2016/5/9/chartex" xmlns:cx4="http://schemas.microsoft.com/office/drawing/2016/5/10/chartex" xmlns:cx5="http://schemas.microsoft.com/office/drawing/2016/5/11/chartex" xmlns:cx6="http://schemas.microsoft.com/office/drawing/2016/5/12/chartex" xmlns:cx7="http://schemas.microsoft.com/office/drawing/2016/5/13/chartex" xmlns:cx8="http://schemas.microsoft.com/office/drawing/2016/5/14/chartex" xmlns:mc="http://schemas.openxmlformats.org/markup-compatibility/2006" xmlns:aink="http://schemas.microsoft.com/office/drawing/2016/ink" xmlns:am3d="http://schemas.microsoft.com/office/drawing/2017/model3d" xmlns:o="urn:schemas-microsoft-com:office:office" xmlns:r="http://schemas.openxmlformats.org/officeDocument/2006/relationships" xmlns:m="http://schemas.openxmlformats.org/officeDocument/2006/math" xmlns:v="urn:schemas-microsoft-com:vml" xmlns:wp14="http://schemas.microsoft.com/office/word/2010/wordprocessingDrawing" xmlns:wp="http://schemas.openxmlformats.org/drawingml/2006/wordprocessingDrawing" xmlns:w10="urn:schemas-microsoft-com:office:word" xmlns:w="http://schemas.openxmlformats.org/wordprocessingml/2006/main" xmlns:w14="http://schemas.microsoft.com/office/word/2010/wordml" xmlns:w15="http://schemas.microsoft.com/office/word/2012/wordml" xmlns:w16cex="http://schemas.microsoft.com/office/word/2018/wordml/cex" xmlns:w16cid="http://schemas.microsoft.com/office/word/2016/wordml/cid" xmlns:w16="http://schemas.microsoft.com/office/word/2018/wordml" xmlns:w16sdtdh="http://schemas.microsoft.com/office/word/2020/wordml/sdtdatahash" xmlns:w16se="http://schemas.microsoft.com/office/word/2015/wordml/symex" xmlns:wpg="http://schemas.microsoft.com/office/word/2010/wordprocessingGroup" xmlns:wpi="http://schemas.microsoft.com/office/word/2010/wordprocessingInk" xmlns:wne="http://schemas.microsoft.com/office/word/2006/wordml" xmlns:wps="http://schemas.microsoft.com/office/word/2010/wordprocessingShape" mc:Ignorable="w14 w15 w16se w16cid w16 w16cex w16sdtdh wp14">
   <w:endnote w:type="separator" w:id="-1">
     <w:p>
       <w:pPr>
@@ -9290,7 +10174,7 @@
 </file>
 
 <file path=word/footer1.xml><?xml version="1.0" encoding="utf-8"?>
-<w:ftr xmlns:wpc="http://schemas.microsoft.com/office/word/2010/wordprocessingCanvas" xmlns:cx="http://schemas.microsoft.com/office/drawing/2014/chartex" xmlns:cx1="http://schemas.microsoft.com/office/drawing/2015/9/8/chartex" xmlns:cx2="http://schemas.microsoft.com/office/drawing/2015/10/21/chartex" xmlns:cx3="http://schemas.microsoft.com/office/drawing/2016/5/9/chartex" xmlns:cx4="http://schemas.microsoft.com/office/drawing/2016/5/10/chartex" xmlns:cx5="http://schemas.microsoft.com/office/drawing/2016/5/11/chartex" xmlns:cx6="http://schemas.microsoft.com/office/drawing/2016/5/12/chartex" xmlns:cx7="http://schemas.microsoft.com/office/drawing/2016/5/13/chartex" xmlns:cx8="http://schemas.microsoft.com/office/drawing/2016/5/14/chartex" xmlns:mc="http://schemas.openxmlformats.org/markup-compatibility/2006" xmlns:aink="http://schemas.microsoft.com/office/drawing/2016/ink" xmlns:am3d="http://schemas.microsoft.com/office/drawing/2017/model3d" xmlns:o="urn:schemas-microsoft-com:office:office" xmlns:oel="http://schemas.microsoft.com/office/2019/extlst" xmlns:r="http://schemas.openxmlformats.org/officeDocument/2006/relationships" xmlns:m="http://schemas.openxmlformats.org/officeDocument/2006/math" xmlns:v="urn:schemas-microsoft-com:vml" xmlns:wp14="http://schemas.microsoft.com/office/word/2010/wordprocessingDrawing" xmlns:wp="http://schemas.openxmlformats.org/drawingml/2006/wordprocessingDrawing" xmlns:w10="urn:schemas-microsoft-com:office:word" xmlns:w="http://schemas.openxmlformats.org/wordprocessingml/2006/main" xmlns:w14="http://schemas.microsoft.com/office/word/2010/wordml" xmlns:w15="http://schemas.microsoft.com/office/word/2012/wordml" xmlns:w16cex="http://schemas.microsoft.com/office/word/2018/wordml/cex" xmlns:w16cid="http://schemas.microsoft.com/office/word/2016/wordml/cid" xmlns:w16="http://schemas.microsoft.com/office/word/2018/wordml" xmlns:w16du="http://schemas.microsoft.com/office/word/2023/wordml/word16du" xmlns:w16sdtdh="http://schemas.microsoft.com/office/word/2020/wordml/sdtdatahash" xmlns:w16se="http://schemas.microsoft.com/office/word/2015/wordml/symex" xmlns:wpg="http://schemas.microsoft.com/office/word/2010/wordprocessingGroup" xmlns:wpi="http://schemas.microsoft.com/office/word/2010/wordprocessingInk" xmlns:wne="http://schemas.microsoft.com/office/word/2006/wordml" xmlns:wps="http://schemas.microsoft.com/office/word/2010/wordprocessingShape" mc:Ignorable="w14 w15 w16se w16cid w16 w16cex w16sdtdh w16du wp14">
+<w:ftr xmlns:wpc="http://schemas.microsoft.com/office/word/2010/wordprocessingCanvas" xmlns:cx="http://schemas.microsoft.com/office/drawing/2014/chartex" xmlns:cx1="http://schemas.microsoft.com/office/drawing/2015/9/8/chartex" xmlns:cx2="http://schemas.microsoft.com/office/drawing/2015/10/21/chartex" xmlns:cx3="http://schemas.microsoft.com/office/drawing/2016/5/9/chartex" xmlns:cx4="http://schemas.microsoft.com/office/drawing/2016/5/10/chartex" xmlns:cx5="http://schemas.microsoft.com/office/drawing/2016/5/11/chartex" xmlns:cx6="http://schemas.microsoft.com/office/drawing/2016/5/12/chartex" xmlns:cx7="http://schemas.microsoft.com/office/drawing/2016/5/13/chartex" xmlns:cx8="http://schemas.microsoft.com/office/drawing/2016/5/14/chartex" xmlns:mc="http://schemas.openxmlformats.org/markup-compatibility/2006" xmlns:aink="http://schemas.microsoft.com/office/drawing/2016/ink" xmlns:am3d="http://schemas.microsoft.com/office/drawing/2017/model3d" xmlns:o="urn:schemas-microsoft-com:office:office" xmlns:r="http://schemas.openxmlformats.org/officeDocument/2006/relationships" xmlns:m="http://schemas.openxmlformats.org/officeDocument/2006/math" xmlns:v="urn:schemas-microsoft-com:vml" xmlns:wp14="http://schemas.microsoft.com/office/word/2010/wordprocessingDrawing" xmlns:wp="http://schemas.openxmlformats.org/drawingml/2006/wordprocessingDrawing" xmlns:w10="urn:schemas-microsoft-com:office:word" xmlns:w="http://schemas.openxmlformats.org/wordprocessingml/2006/main" xmlns:w14="http://schemas.microsoft.com/office/word/2010/wordml" xmlns:w15="http://schemas.microsoft.com/office/word/2012/wordml" xmlns:w16cex="http://schemas.microsoft.com/office/word/2018/wordml/cex" xmlns:w16cid="http://schemas.microsoft.com/office/word/2016/wordml/cid" xmlns:w16="http://schemas.microsoft.com/office/word/2018/wordml" xmlns:w16sdtdh="http://schemas.microsoft.com/office/word/2020/wordml/sdtdatahash" xmlns:w16se="http://schemas.microsoft.com/office/word/2015/wordml/symex" xmlns:wpg="http://schemas.microsoft.com/office/word/2010/wordprocessingGroup" xmlns:wpi="http://schemas.microsoft.com/office/word/2010/wordprocessingInk" xmlns:wne="http://schemas.microsoft.com/office/word/2006/wordml" xmlns:wps="http://schemas.microsoft.com/office/word/2010/wordprocessingShape" mc:Ignorable="w14 w15 w16se w16cid w16 w16cex w16sdtdh wp14">
   <w:sdt>
     <w:sdtPr>
       <w:id w:val="-701017035"/>
@@ -9299,6 +10183,7 @@
         <w:docPartUnique/>
       </w:docPartObj>
     </w:sdtPr>
+    <w:sdtEndPr/>
     <w:sdtContent>
       <w:p>
         <w:pPr>
@@ -9317,7 +10202,7 @@
 </file>
 
 <file path=word/footer2.xml><?xml version="1.0" encoding="utf-8"?>
-<w:ftr xmlns:wpc="http://schemas.microsoft.com/office/word/2010/wordprocessingCanvas" xmlns:cx="http://schemas.microsoft.com/office/drawing/2014/chartex" xmlns:cx1="http://schemas.microsoft.com/office/drawing/2015/9/8/chartex" xmlns:cx2="http://schemas.microsoft.com/office/drawing/2015/10/21/chartex" xmlns:cx3="http://schemas.microsoft.com/office/drawing/2016/5/9/chartex" xmlns:cx4="http://schemas.microsoft.com/office/drawing/2016/5/10/chartex" xmlns:cx5="http://schemas.microsoft.com/office/drawing/2016/5/11/chartex" xmlns:cx6="http://schemas.microsoft.com/office/drawing/2016/5/12/chartex" xmlns:cx7="http://schemas.microsoft.com/office/drawing/2016/5/13/chartex" xmlns:cx8="http://schemas.microsoft.com/office/drawing/2016/5/14/chartex" xmlns:mc="http://schemas.openxmlformats.org/markup-compatibility/2006" xmlns:aink="http://schemas.microsoft.com/office/drawing/2016/ink" xmlns:am3d="http://schemas.microsoft.com/office/drawing/2017/model3d" xmlns:o="urn:schemas-microsoft-com:office:office" xmlns:oel="http://schemas.microsoft.com/office/2019/extlst" xmlns:r="http://schemas.openxmlformats.org/officeDocument/2006/relationships" xmlns:m="http://schemas.openxmlformats.org/officeDocument/2006/math" xmlns:v="urn:schemas-microsoft-com:vml" xmlns:wp14="http://schemas.microsoft.com/office/word/2010/wordprocessingDrawing" xmlns:wp="http://schemas.openxmlformats.org/drawingml/2006/wordprocessingDrawing" xmlns:w10="urn:schemas-microsoft-com:office:word" xmlns:w="http://schemas.openxmlformats.org/wordprocessingml/2006/main" xmlns:w14="http://schemas.microsoft.com/office/word/2010/wordml" xmlns:w15="http://schemas.microsoft.com/office/word/2012/wordml" xmlns:w16cex="http://schemas.microsoft.com/office/word/2018/wordml/cex" xmlns:w16cid="http://schemas.microsoft.com/office/word/2016/wordml/cid" xmlns:w16="http://schemas.microsoft.com/office/word/2018/wordml" xmlns:w16du="http://schemas.microsoft.com/office/word/2023/wordml/word16du" xmlns:w16sdtdh="http://schemas.microsoft.com/office/word/2020/wordml/sdtdatahash" xmlns:w16se="http://schemas.microsoft.com/office/word/2015/wordml/symex" xmlns:wpg="http://schemas.microsoft.com/office/word/2010/wordprocessingGroup" xmlns:wpi="http://schemas.microsoft.com/office/word/2010/wordprocessingInk" xmlns:wne="http://schemas.microsoft.com/office/word/2006/wordml" xmlns:wps="http://schemas.microsoft.com/office/word/2010/wordprocessingShape" mc:Ignorable="w14 w15 w16se w16cid w16 w16cex w16sdtdh w16du wp14">
+<w:ftr xmlns:wpc="http://schemas.microsoft.com/office/word/2010/wordprocessingCanvas" xmlns:cx="http://schemas.microsoft.com/office/drawing/2014/chartex" xmlns:cx1="http://schemas.microsoft.com/office/drawing/2015/9/8/chartex" xmlns:cx2="http://schemas.microsoft.com/office/drawing/2015/10/21/chartex" xmlns:cx3="http://schemas.microsoft.com/office/drawing/2016/5/9/chartex" xmlns:cx4="http://schemas.microsoft.com/office/drawing/2016/5/10/chartex" xmlns:cx5="http://schemas.microsoft.com/office/drawing/2016/5/11/chartex" xmlns:cx6="http://schemas.microsoft.com/office/drawing/2016/5/12/chartex" xmlns:cx7="http://schemas.microsoft.com/office/drawing/2016/5/13/chartex" xmlns:cx8="http://schemas.microsoft.com/office/drawing/2016/5/14/chartex" xmlns:mc="http://schemas.openxmlformats.org/markup-compatibility/2006" xmlns:aink="http://schemas.microsoft.com/office/drawing/2016/ink" xmlns:am3d="http://schemas.microsoft.com/office/drawing/2017/model3d" xmlns:o="urn:schemas-microsoft-com:office:office" xmlns:r="http://schemas.openxmlformats.org/officeDocument/2006/relationships" xmlns:m="http://schemas.openxmlformats.org/officeDocument/2006/math" xmlns:v="urn:schemas-microsoft-com:vml" xmlns:wp14="http://schemas.microsoft.com/office/word/2010/wordprocessingDrawing" xmlns:wp="http://schemas.openxmlformats.org/drawingml/2006/wordprocessingDrawing" xmlns:w10="urn:schemas-microsoft-com:office:word" xmlns:w="http://schemas.openxmlformats.org/wordprocessingml/2006/main" xmlns:w14="http://schemas.microsoft.com/office/word/2010/wordml" xmlns:w15="http://schemas.microsoft.com/office/word/2012/wordml" xmlns:w16cex="http://schemas.microsoft.com/office/word/2018/wordml/cex" xmlns:w16cid="http://schemas.microsoft.com/office/word/2016/wordml/cid" xmlns:w16="http://schemas.microsoft.com/office/word/2018/wordml" xmlns:w16sdtdh="http://schemas.microsoft.com/office/word/2020/wordml/sdtdatahash" xmlns:w16se="http://schemas.microsoft.com/office/word/2015/wordml/symex" xmlns:wpg="http://schemas.microsoft.com/office/word/2010/wordprocessingGroup" xmlns:wpi="http://schemas.microsoft.com/office/word/2010/wordprocessingInk" xmlns:wne="http://schemas.microsoft.com/office/word/2006/wordml" xmlns:wps="http://schemas.microsoft.com/office/word/2010/wordprocessingShape" mc:Ignorable="w14 w15 w16se w16cid w16 w16cex w16sdtdh wp14">
   <w:sdt>
     <w:sdtPr>
       <w:id w:val="-1465197936"/>
@@ -9326,6 +10211,7 @@
         <w:docPartUnique/>
       </w:docPartObj>
     </w:sdtPr>
+    <w:sdtEndPr/>
     <w:sdtContent>
       <w:p>
         <w:pPr>
@@ -9426,7 +10312,7 @@
                   <v:stroke joinstyle="miter"/>
                   <v:path gradientshapeok="t" o:connecttype="rect"/>
                 </v:shapetype>
-                <v:shape id="_x0000_s1027" type="#_x0000_t202" alt="&quot;&quot;" style="position:absolute;left:0;text-align:left;margin-left:16.1pt;margin-top:.65pt;width:455.15pt;height:41.4pt;z-index:251661312;visibility:visible;mso-wrap-style:square;mso-width-percent:0;mso-height-percent:0;mso-wrap-distance-left:9pt;mso-wrap-distance-top:3.6pt;mso-wrap-distance-right:9pt;mso-wrap-distance-bottom:3.6pt;mso-position-horizontal:absolute;mso-position-horizontal-relative:text;mso-position-vertical:absolute;mso-position-vertical-relative:text;mso-width-percent:0;mso-height-percent:0;mso-width-relative:margin;mso-height-relative:margin;v-text-anchor:top" o:gfxdata="UEsDBBQABgAIAAAAIQC2gziS/gAAAOEBAAATAAAAW0NvbnRlbnRfVHlwZXNdLnhtbJSRQU7DMBBF&#10;90jcwfIWJU67QAgl6YK0S0CoHGBkTxKLZGx5TGhvj5O2G0SRWNoz/78nu9wcxkFMGNg6quQqL6RA&#10;0s5Y6ir5vt9lD1JwBDIwOMJKHpHlpr69KfdHjyxSmriSfYz+USnWPY7AufNIadK6MEJMx9ApD/oD&#10;OlTrorhX2lFEilmcO2RdNtjC5xDF9pCuTyYBB5bi6bQ4syoJ3g9WQ0ymaiLzg5KdCXlKLjvcW893&#10;SUOqXwnz5DrgnHtJTxOsQfEKIT7DmDSUCaxw7Rqn8787ZsmRM9e2VmPeBN4uqYvTtW7jvijg9N/y&#10;JsXecLq0q+WD6m8AAAD//wMAUEsDBBQABgAIAAAAIQA4/SH/1gAAAJQBAAALAAAAX3JlbHMvLnJl&#10;bHOkkMFqwzAMhu+DvYPRfXGawxijTi+j0GvpHsDYimMaW0Yy2fr2M4PBMnrbUb/Q94l/f/hMi1qR&#10;JVI2sOt6UJgd+ZiDgffL8ekFlFSbvV0oo4EbChzGx4f9GRdb25HMsYhqlCwG5lrLq9biZkxWOiqY&#10;22YiTra2kYMu1l1tQD30/bPm3wwYN0x18gb45AdQl1tp5j/sFB2T0FQ7R0nTNEV3j6o9feQzro1i&#10;OWA14Fm+Q8a1a8+Bvu/d/dMb2JY5uiPbhG/ktn4cqGU/er3pcvwCAAD//wMAUEsDBBQABgAIAAAA&#10;IQCVHvnIDAIAAPYDAAAOAAAAZHJzL2Uyb0RvYy54bWysU9tu2zAMfR+wfxD0vtgJkjYx4hRdugwD&#10;ugvQ7QNkWY6FyaJGKbGzrx+luGm2vQ3TgyCK1CF5eLS+GzrDjgq9Blvy6STnTFkJtbb7kn/7unuz&#10;5MwHYWthwKqSn5Tnd5vXr9a9K9QMWjC1QkYg1he9K3kbgiuyzMtWdcJPwClLzgawE4FM3Gc1ip7Q&#10;O5PN8vwm6wFrhyCV93T7cHbyTcJvGiXD56bxKjBTcqotpB3TXsU926xFsUfhWi3HMsQ/VNEJbSnp&#10;BepBBMEOqP+C6rRE8NCEiYQug6bRUqUeqJtp/kc3T61wKvVC5Hh3ocn/P1j56fjkviALw1sYaICp&#10;Ce8eQX73zMK2FXav7hGhb5WoKfE0Upb1zhfj00i1L3wEqfqPUNOQxSFAAhoa7CIr1CcjdBrA6UK6&#10;GgKTdLm4XeY3K3JJ8i1mi8V0mVKI4vm1Qx/eK+hYPJQcaagJXRwffYjViOI5JCbzYHS908YkA/fV&#10;1iA7ChLALq0R/bcwY1lf8hWlT8gW4vukjU4HEqjRXcmXeVxnyUQ23tk6hQShzflMlRg70hMZOXMT&#10;hmqgwEhTBfWJiEI4C5E+Dh1awJ+c9STCkvsfB4GKM/PBEtmr6XweVZuM+eJ2RgZee6prj7CSoEoe&#10;ODsftyEpPfJg4Z6G0ujE10slY60krkTj+BGieq/tFPXyXTe/AAAA//8DAFBLAwQUAAYACAAAACEA&#10;Lygdh9sAAAAHAQAADwAAAGRycy9kb3ducmV2LnhtbEyO3U6DQBCF7018h82YeGPsUkr/kKVRE423&#10;rX2AAaZAZGcJuy307R2v7OX5yTlftptspy40+NaxgfksAkVcuqrl2sDx++N5A8oH5Ao7x2TgSh52&#10;+f1dhmnlRt7T5RBqJSPsUzTQhNCnWvuyIYt+5npiyU5usBhEDrWuBhxl3HY6jqKVttiyPDTY03tD&#10;5c/hbA2cvsan5XYsPsNxvU9Wb9iuC3c15vFhen0BFWgK/2X4wxd0yIWpcGeuvOoMLOJYmuIvQEm8&#10;TeIlqMLAJpmDzjN9y5//AgAA//8DAFBLAQItABQABgAIAAAAIQC2gziS/gAAAOEBAAATAAAAAAAA&#10;AAAAAAAAAAAAAABbQ29udGVudF9UeXBlc10ueG1sUEsBAi0AFAAGAAgAAAAhADj9If/WAAAAlAEA&#10;AAsAAAAAAAAAAAAAAAAALwEAAF9yZWxzLy5yZWxzUEsBAi0AFAAGAAgAAAAhAJUe+cgMAgAA9gMA&#10;AA4AAAAAAAAAAAAAAAAALgIAAGRycy9lMm9Eb2MueG1sUEsBAi0AFAAGAAgAAAAhAC8oHYfbAAAA&#10;BwEAAA8AAAAAAAAAAAAAAAAAZgQAAGRycy9kb3ducmV2LnhtbFBLBQYAAAAABAAEAPMAAABuBQAA&#10;AAA=&#10;" stroked="f">
+                <v:shape id="_x0000_s1027" type="#_x0000_t202" alt="&quot;&quot;" style="position:absolute;left:0;text-align:left;margin-left:16.1pt;margin-top:.65pt;width:455.15pt;height:41.4pt;z-index:251661312;visibility:visible;mso-wrap-style:square;mso-width-percent:0;mso-height-percent:0;mso-wrap-distance-left:9pt;mso-wrap-distance-top:3.6pt;mso-wrap-distance-right:9pt;mso-wrap-distance-bottom:3.6pt;mso-position-horizontal:absolute;mso-position-horizontal-relative:text;mso-position-vertical:absolute;mso-position-vertical-relative:text;mso-width-percent:0;mso-height-percent:0;mso-width-relative:margin;mso-height-relative:margin;v-text-anchor:top" o:gfxdata="UEsDBBQABgAIAAAAIQC2gziS/gAAAOEBAAATAAAAW0NvbnRlbnRfVHlwZXNdLnhtbJSRQU7DMBBF&#10;90jcwfIWJU67QAgl6YK0S0CoHGBkTxKLZGx5TGhvj5O2G0SRWNoz/78nu9wcxkFMGNg6quQqL6RA&#10;0s5Y6ir5vt9lD1JwBDIwOMJKHpHlpr69KfdHjyxSmriSfYz+USnWPY7AufNIadK6MEJMx9ApD/oD&#10;OlTrorhX2lFEilmcO2RdNtjC5xDF9pCuTyYBB5bi6bQ4syoJ3g9WQ0ymaiLzg5KdCXlKLjvcW893&#10;SUOqXwnz5DrgnHtJTxOsQfEKIT7DmDSUCaxw7Rqn8787ZsmRM9e2VmPeBN4uqYvTtW7jvijg9N/y&#10;JsXecLq0q+WD6m8AAAD//wMAUEsDBBQABgAIAAAAIQA4/SH/1gAAAJQBAAALAAAAX3JlbHMvLnJl&#10;bHOkkMFqwzAMhu+DvYPRfXGawxijTi+j0GvpHsDYimMaW0Yy2fr2M4PBMnrbUb/Q94l/f/hMi1qR&#10;JVI2sOt6UJgd+ZiDgffL8ekFlFSbvV0oo4EbChzGx4f9GRdb25HMsYhqlCwG5lrLq9biZkxWOiqY&#10;22YiTra2kYMu1l1tQD30/bPm3wwYN0x18gb45AdQl1tp5j/sFB2T0FQ7R0nTNEV3j6o9feQzro1i&#10;OWA14Fm+Q8a1a8+Bvu/d/dMb2JY5uiPbhG/ktn4cqGU/er3pcvwCAAD//wMAUEsDBBQABgAIAAAA&#10;IQDL0DiEKQIAACsEAAAOAAAAZHJzL2Uyb0RvYy54bWysU9tu2zAMfR+wfxD0vjgxkjYx4hRdugwD&#10;ugvQ7QNoSY6FyaInKbGzrx8lp2m2vQ3Tg0CJ4uHhIbW+G1rDjsp5jbbks8mUM2UFSm33Jf/2dfdm&#10;yZkPYCUYtKrkJ+X53eb1q3XfFSrHBo1UjhGI9UXflbwJoSuyzItGteAn2ClLzhpdC4GObp9JBz2h&#10;tybLp9ObrEcnO4dCeU+3D6OTbxJ+XSsRPte1V4GZkhO3kHaX9iru2WYNxd5B12hxpgH/wKIFbSnp&#10;BeoBArCD039BtVo49FiHicA2w7rWQqUaqJrZ9I9qnhroVKqFxPHdRSb//2DFp+MXx7Sk3uWzxWqZ&#10;3+Ykk4WWerU9gHTIpGJBDQFZHtXqO19Q0FNHYWF4iwNFpsp994jiu2cWtw3Yvbp3DvtGgSS2sxiZ&#10;XYWOOD6CVP1HlJQNDgET0FC7NkpJ4jBCJzqnS6eIBxN0ubhdTm9W5BLkW+SLxWyZUkDxHN05H94r&#10;bFk0Su5oEhI6HB99iGygeH4Sk3k0Wu60Meng9tXWOHYEmppdWmf0354Zy/qSryh9QrYY49NAtTrQ&#10;VBvdlnw5jSuGQxHVeGdlsgNoM9rExNizPFGRUZswVAM9jJpVKE8klMNxeum3kdGg+8lZT5Nbcv/j&#10;AE5xZj5YEns1m8/jqKfDfJEa6q491bUHrCCokgfORnMb0veIfC3eU1NqnfR6YXLmShOZZDz/njjy&#10;1+f06uWPb34BAAD//wMAUEsDBBQABgAIAAAAIQAvKB2H2wAAAAcBAAAPAAAAZHJzL2Rvd25yZXYu&#10;eG1sTI7dToNAEIXvTXyHzZh4Y+xSSv+QpVETjbetfYABpkBkZwm7LfTtHa/s5fnJOV+2m2ynLjT4&#10;1rGB+SwCRVy6quXawPH743kDygfkCjvHZOBKHnb5/V2GaeVG3tPlEGolI+xTNNCE0Kda+7Ihi37m&#10;emLJTm6wGEQOta4GHGXcdjqOopW22LI8NNjTe0Plz+FsDZy+xqfldiw+w3G9T1Zv2K4LdzXm8WF6&#10;fQEVaAr/ZfjDF3TIhalwZ6686gws4lia4i9ASbxN4iWowsAmmYPOM33Ln/8CAAD//wMAUEsBAi0A&#10;FAAGAAgAAAAhALaDOJL+AAAA4QEAABMAAAAAAAAAAAAAAAAAAAAAAFtDb250ZW50X1R5cGVzXS54&#10;bWxQSwECLQAUAAYACAAAACEAOP0h/9YAAACUAQAACwAAAAAAAAAAAAAAAAAvAQAAX3JlbHMvLnJl&#10;bHNQSwECLQAUAAYACAAAACEAy9A4hCkCAAArBAAADgAAAAAAAAAAAAAAAAAuAgAAZHJzL2Uyb0Rv&#10;Yy54bWxQSwECLQAUAAYACAAAACEALygdh9sAAAAHAQAADwAAAAAAAAAAAAAAAACDBAAAZHJzL2Rv&#10;d25yZXYueG1sUEsFBgAAAAAEAAQA8wAAAIsFAAAAAA==&#10;" stroked="f">
                   <v:textbox>
                     <w:txbxContent>
                       <w:p>
@@ -9483,7 +10369,7 @@
 </file>
 
 <file path=word/footnotes.xml><?xml version="1.0" encoding="utf-8"?>
-<w:footnotes xmlns:wpc="http://schemas.microsoft.com/office/word/2010/wordprocessingCanvas" xmlns:cx="http://schemas.microsoft.com/office/drawing/2014/chartex" xmlns:cx1="http://schemas.microsoft.com/office/drawing/2015/9/8/chartex" xmlns:cx2="http://schemas.microsoft.com/office/drawing/2015/10/21/chartex" xmlns:cx3="http://schemas.microsoft.com/office/drawing/2016/5/9/chartex" xmlns:cx4="http://schemas.microsoft.com/office/drawing/2016/5/10/chartex" xmlns:cx5="http://schemas.microsoft.com/office/drawing/2016/5/11/chartex" xmlns:cx6="http://schemas.microsoft.com/office/drawing/2016/5/12/chartex" xmlns:cx7="http://schemas.microsoft.com/office/drawing/2016/5/13/chartex" xmlns:cx8="http://schemas.microsoft.com/office/drawing/2016/5/14/chartex" xmlns:mc="http://schemas.openxmlformats.org/markup-compatibility/2006" xmlns:aink="http://schemas.microsoft.com/office/drawing/2016/ink" xmlns:am3d="http://schemas.microsoft.com/office/drawing/2017/model3d" xmlns:o="urn:schemas-microsoft-com:office:office" xmlns:oel="http://schemas.microsoft.com/office/2019/extlst" xmlns:r="http://schemas.openxmlformats.org/officeDocument/2006/relationships" xmlns:m="http://schemas.openxmlformats.org/officeDocument/2006/math" xmlns:v="urn:schemas-microsoft-com:vml" xmlns:wp14="http://schemas.microsoft.com/office/word/2010/wordprocessingDrawing" xmlns:wp="http://schemas.openxmlformats.org/drawingml/2006/wordprocessingDrawing" xmlns:w10="urn:schemas-microsoft-com:office:word" xmlns:w="http://schemas.openxmlformats.org/wordprocessingml/2006/main" xmlns:w14="http://schemas.microsoft.com/office/word/2010/wordml" xmlns:w15="http://schemas.microsoft.com/office/word/2012/wordml" xmlns:w16cex="http://schemas.microsoft.com/office/word/2018/wordml/cex" xmlns:w16cid="http://schemas.microsoft.com/office/word/2016/wordml/cid" xmlns:w16="http://schemas.microsoft.com/office/word/2018/wordml" xmlns:w16du="http://schemas.microsoft.com/office/word/2023/wordml/word16du" xmlns:w16sdtdh="http://schemas.microsoft.com/office/word/2020/wordml/sdtdatahash" xmlns:w16se="http://schemas.microsoft.com/office/word/2015/wordml/symex" xmlns:wpg="http://schemas.microsoft.com/office/word/2010/wordprocessingGroup" xmlns:wpi="http://schemas.microsoft.com/office/word/2010/wordprocessingInk" xmlns:wne="http://schemas.microsoft.com/office/word/2006/wordml" xmlns:wps="http://schemas.microsoft.com/office/word/2010/wordprocessingShape" mc:Ignorable="w14 w15 w16se w16cid w16 w16cex w16sdtdh w16du wp14">
+<w:footnotes xmlns:wpc="http://schemas.microsoft.com/office/word/2010/wordprocessingCanvas" xmlns:cx="http://schemas.microsoft.com/office/drawing/2014/chartex" xmlns:cx1="http://schemas.microsoft.com/office/drawing/2015/9/8/chartex" xmlns:cx2="http://schemas.microsoft.com/office/drawing/2015/10/21/chartex" xmlns:cx3="http://schemas.microsoft.com/office/drawing/2016/5/9/chartex" xmlns:cx4="http://schemas.microsoft.com/office/drawing/2016/5/10/chartex" xmlns:cx5="http://schemas.microsoft.com/office/drawing/2016/5/11/chartex" xmlns:cx6="http://schemas.microsoft.com/office/drawing/2016/5/12/chartex" xmlns:cx7="http://schemas.microsoft.com/office/drawing/2016/5/13/chartex" xmlns:cx8="http://schemas.microsoft.com/office/drawing/2016/5/14/chartex" xmlns:mc="http://schemas.openxmlformats.org/markup-compatibility/2006" xmlns:aink="http://schemas.microsoft.com/office/drawing/2016/ink" xmlns:am3d="http://schemas.microsoft.com/office/drawing/2017/model3d" xmlns:o="urn:schemas-microsoft-com:office:office" xmlns:r="http://schemas.openxmlformats.org/officeDocument/2006/relationships" xmlns:m="http://schemas.openxmlformats.org/officeDocument/2006/math" xmlns:v="urn:schemas-microsoft-com:vml" xmlns:wp14="http://schemas.microsoft.com/office/word/2010/wordprocessingDrawing" xmlns:wp="http://schemas.openxmlformats.org/drawingml/2006/wordprocessingDrawing" xmlns:w10="urn:schemas-microsoft-com:office:word" xmlns:w="http://schemas.openxmlformats.org/wordprocessingml/2006/main" xmlns:w14="http://schemas.microsoft.com/office/word/2010/wordml" xmlns:w15="http://schemas.microsoft.com/office/word/2012/wordml" xmlns:w16cex="http://schemas.microsoft.com/office/word/2018/wordml/cex" xmlns:w16cid="http://schemas.microsoft.com/office/word/2016/wordml/cid" xmlns:w16="http://schemas.microsoft.com/office/word/2018/wordml" xmlns:w16sdtdh="http://schemas.microsoft.com/office/word/2020/wordml/sdtdatahash" xmlns:w16se="http://schemas.microsoft.com/office/word/2015/wordml/symex" xmlns:wpg="http://schemas.microsoft.com/office/word/2010/wordprocessingGroup" xmlns:wpi="http://schemas.microsoft.com/office/word/2010/wordprocessingInk" xmlns:wne="http://schemas.microsoft.com/office/word/2006/wordml" xmlns:wps="http://schemas.microsoft.com/office/word/2010/wordprocessingShape" mc:Ignorable="w14 w15 w16se w16cid w16 w16cex w16sdtdh wp14">
   <w:footnote w:type="separator" w:id="-1">
     <w:p>
       <w:pPr>
@@ -9508,7 +10394,7 @@
 </file>
 
 <file path=word/header1.xml><?xml version="1.0" encoding="utf-8"?>
-<w:hdr xmlns:wpc="http://schemas.microsoft.com/office/word/2010/wordprocessingCanvas" xmlns:cx="http://schemas.microsoft.com/office/drawing/2014/chartex" xmlns:cx1="http://schemas.microsoft.com/office/drawing/2015/9/8/chartex" xmlns:cx2="http://schemas.microsoft.com/office/drawing/2015/10/21/chartex" xmlns:cx3="http://schemas.microsoft.com/office/drawing/2016/5/9/chartex" xmlns:cx4="http://schemas.microsoft.com/office/drawing/2016/5/10/chartex" xmlns:cx5="http://schemas.microsoft.com/office/drawing/2016/5/11/chartex" xmlns:cx6="http://schemas.microsoft.com/office/drawing/2016/5/12/chartex" xmlns:cx7="http://schemas.microsoft.com/office/drawing/2016/5/13/chartex" xmlns:cx8="http://schemas.microsoft.com/office/drawing/2016/5/14/chartex" xmlns:mc="http://schemas.openxmlformats.org/markup-compatibility/2006" xmlns:aink="http://schemas.microsoft.com/office/drawing/2016/ink" xmlns:am3d="http://schemas.microsoft.com/office/drawing/2017/model3d" xmlns:o="urn:schemas-microsoft-com:office:office" xmlns:oel="http://schemas.microsoft.com/office/2019/extlst" xmlns:r="http://schemas.openxmlformats.org/officeDocument/2006/relationships" xmlns:m="http://schemas.openxmlformats.org/officeDocument/2006/math" xmlns:v="urn:schemas-microsoft-com:vml" xmlns:wp14="http://schemas.microsoft.com/office/word/2010/wordprocessingDrawing" xmlns:wp="http://schemas.openxmlformats.org/drawingml/2006/wordprocessingDrawing" xmlns:w10="urn:schemas-microsoft-com:office:word" xmlns:w="http://schemas.openxmlformats.org/wordprocessingml/2006/main" xmlns:w14="http://schemas.microsoft.com/office/word/2010/wordml" xmlns:w15="http://schemas.microsoft.com/office/word/2012/wordml" xmlns:w16cex="http://schemas.microsoft.com/office/word/2018/wordml/cex" xmlns:w16cid="http://schemas.microsoft.com/office/word/2016/wordml/cid" xmlns:w16="http://schemas.microsoft.com/office/word/2018/wordml" xmlns:w16du="http://schemas.microsoft.com/office/word/2023/wordml/word16du" xmlns:w16sdtdh="http://schemas.microsoft.com/office/word/2020/wordml/sdtdatahash" xmlns:w16se="http://schemas.microsoft.com/office/word/2015/wordml/symex" xmlns:wpg="http://schemas.microsoft.com/office/word/2010/wordprocessingGroup" xmlns:wpi="http://schemas.microsoft.com/office/word/2010/wordprocessingInk" xmlns:wne="http://schemas.microsoft.com/office/word/2006/wordml" xmlns:wps="http://schemas.microsoft.com/office/word/2010/wordprocessingShape" mc:Ignorable="w14 w15 w16se w16cid w16 w16cex w16sdtdh w16du wp14">
+<w:hdr xmlns:wpc="http://schemas.microsoft.com/office/word/2010/wordprocessingCanvas" xmlns:cx="http://schemas.microsoft.com/office/drawing/2014/chartex" xmlns:cx1="http://schemas.microsoft.com/office/drawing/2015/9/8/chartex" xmlns:cx2="http://schemas.microsoft.com/office/drawing/2015/10/21/chartex" xmlns:cx3="http://schemas.microsoft.com/office/drawing/2016/5/9/chartex" xmlns:cx4="http://schemas.microsoft.com/office/drawing/2016/5/10/chartex" xmlns:cx5="http://schemas.microsoft.com/office/drawing/2016/5/11/chartex" xmlns:cx6="http://schemas.microsoft.com/office/drawing/2016/5/12/chartex" xmlns:cx7="http://schemas.microsoft.com/office/drawing/2016/5/13/chartex" xmlns:cx8="http://schemas.microsoft.com/office/drawing/2016/5/14/chartex" xmlns:mc="http://schemas.openxmlformats.org/markup-compatibility/2006" xmlns:aink="http://schemas.microsoft.com/office/drawing/2016/ink" xmlns:am3d="http://schemas.microsoft.com/office/drawing/2017/model3d" xmlns:o="urn:schemas-microsoft-com:office:office" xmlns:r="http://schemas.openxmlformats.org/officeDocument/2006/relationships" xmlns:m="http://schemas.openxmlformats.org/officeDocument/2006/math" xmlns:v="urn:schemas-microsoft-com:vml" xmlns:wp14="http://schemas.microsoft.com/office/word/2010/wordprocessingDrawing" xmlns:wp="http://schemas.openxmlformats.org/drawingml/2006/wordprocessingDrawing" xmlns:w10="urn:schemas-microsoft-com:office:word" xmlns:w="http://schemas.openxmlformats.org/wordprocessingml/2006/main" xmlns:w14="http://schemas.microsoft.com/office/word/2010/wordml" xmlns:w15="http://schemas.microsoft.com/office/word/2012/wordml" xmlns:w16cex="http://schemas.microsoft.com/office/word/2018/wordml/cex" xmlns:w16cid="http://schemas.microsoft.com/office/word/2016/wordml/cid" xmlns:w16="http://schemas.microsoft.com/office/word/2018/wordml" xmlns:w16sdtdh="http://schemas.microsoft.com/office/word/2020/wordml/sdtdatahash" xmlns:w16se="http://schemas.microsoft.com/office/word/2015/wordml/symex" xmlns:wpg="http://schemas.microsoft.com/office/word/2010/wordprocessingGroup" xmlns:wpi="http://schemas.microsoft.com/office/word/2010/wordprocessingInk" xmlns:wne="http://schemas.microsoft.com/office/word/2006/wordml" xmlns:wps="http://schemas.microsoft.com/office/word/2010/wordprocessingShape" mc:Ignorable="w14 w15 w16se w16cid w16 w16cex w16sdtdh wp14">
   <w:p>
     <w:pPr>
       <w:pStyle w:val="Encabezado"/>
@@ -9593,7 +10479,7 @@
 </file>
 
 <file path=word/numbering.xml><?xml version="1.0" encoding="utf-8"?>
-<w:numbering xmlns:wpc="http://schemas.microsoft.com/office/word/2010/wordprocessingCanvas" xmlns:cx="http://schemas.microsoft.com/office/drawing/2014/chartex" xmlns:cx1="http://schemas.microsoft.com/office/drawing/2015/9/8/chartex" xmlns:cx2="http://schemas.microsoft.com/office/drawing/2015/10/21/chartex" xmlns:cx3="http://schemas.microsoft.com/office/drawing/2016/5/9/chartex" xmlns:cx4="http://schemas.microsoft.com/office/drawing/2016/5/10/chartex" xmlns:cx5="http://schemas.microsoft.com/office/drawing/2016/5/11/chartex" xmlns:cx6="http://schemas.microsoft.com/office/drawing/2016/5/12/chartex" xmlns:cx7="http://schemas.microsoft.com/office/drawing/2016/5/13/chartex" xmlns:cx8="http://schemas.microsoft.com/office/drawing/2016/5/14/chartex" xmlns:mc="http://schemas.openxmlformats.org/markup-compatibility/2006" xmlns:aink="http://schemas.microsoft.com/office/drawing/2016/ink" xmlns:am3d="http://schemas.microsoft.com/office/drawing/2017/model3d" xmlns:o="urn:schemas-microsoft-com:office:office" xmlns:oel="http://schemas.microsoft.com/office/2019/extlst" xmlns:r="http://schemas.openxmlformats.org/officeDocument/2006/relationships" xmlns:m="http://schemas.openxmlformats.org/officeDocument/2006/math" xmlns:v="urn:schemas-microsoft-com:vml" xmlns:wp14="http://schemas.microsoft.com/office/word/2010/wordprocessingDrawing" xmlns:wp="http://schemas.openxmlformats.org/drawingml/2006/wordprocessingDrawing" xmlns:w10="urn:schemas-microsoft-com:office:word" xmlns:w="http://schemas.openxmlformats.org/wordprocessingml/2006/main" xmlns:w14="http://schemas.microsoft.com/office/word/2010/wordml" xmlns:w15="http://schemas.microsoft.com/office/word/2012/wordml" xmlns:w16cex="http://schemas.microsoft.com/office/word/2018/wordml/cex" xmlns:w16cid="http://schemas.microsoft.com/office/word/2016/wordml/cid" xmlns:w16="http://schemas.microsoft.com/office/word/2018/wordml" xmlns:w16du="http://schemas.microsoft.com/office/word/2023/wordml/word16du" xmlns:w16sdtdh="http://schemas.microsoft.com/office/word/2020/wordml/sdtdatahash" xmlns:w16se="http://schemas.microsoft.com/office/word/2015/wordml/symex" xmlns:wpg="http://schemas.microsoft.com/office/word/2010/wordprocessingGroup" xmlns:wpi="http://schemas.microsoft.com/office/word/2010/wordprocessingInk" xmlns:wne="http://schemas.microsoft.com/office/word/2006/wordml" xmlns:wps="http://schemas.microsoft.com/office/word/2010/wordprocessingShape" mc:Ignorable="w14 w15 w16se w16cid w16 w16cex w16sdtdh w16du wp14">
+<w:numbering xmlns:wpc="http://schemas.microsoft.com/office/word/2010/wordprocessingCanvas" xmlns:cx="http://schemas.microsoft.com/office/drawing/2014/chartex" xmlns:cx1="http://schemas.microsoft.com/office/drawing/2015/9/8/chartex" xmlns:cx2="http://schemas.microsoft.com/office/drawing/2015/10/21/chartex" xmlns:cx3="http://schemas.microsoft.com/office/drawing/2016/5/9/chartex" xmlns:cx4="http://schemas.microsoft.com/office/drawing/2016/5/10/chartex" xmlns:cx5="http://schemas.microsoft.com/office/drawing/2016/5/11/chartex" xmlns:cx6="http://schemas.microsoft.com/office/drawing/2016/5/12/chartex" xmlns:cx7="http://schemas.microsoft.com/office/drawing/2016/5/13/chartex" xmlns:cx8="http://schemas.microsoft.com/office/drawing/2016/5/14/chartex" xmlns:mc="http://schemas.openxmlformats.org/markup-compatibility/2006" xmlns:aink="http://schemas.microsoft.com/office/drawing/2016/ink" xmlns:am3d="http://schemas.microsoft.com/office/drawing/2017/model3d" xmlns:o="urn:schemas-microsoft-com:office:office" xmlns:r="http://schemas.openxmlformats.org/officeDocument/2006/relationships" xmlns:m="http://schemas.openxmlformats.org/officeDocument/2006/math" xmlns:v="urn:schemas-microsoft-com:vml" xmlns:wp14="http://schemas.microsoft.com/office/word/2010/wordprocessingDrawing" xmlns:wp="http://schemas.openxmlformats.org/drawingml/2006/wordprocessingDrawing" xmlns:w10="urn:schemas-microsoft-com:office:word" xmlns:w="http://schemas.openxmlformats.org/wordprocessingml/2006/main" xmlns:w14="http://schemas.microsoft.com/office/word/2010/wordml" xmlns:w15="http://schemas.microsoft.com/office/word/2012/wordml" xmlns:w16cex="http://schemas.microsoft.com/office/word/2018/wordml/cex" xmlns:w16cid="http://schemas.microsoft.com/office/word/2016/wordml/cid" xmlns:w16="http://schemas.microsoft.com/office/word/2018/wordml" xmlns:w16sdtdh="http://schemas.microsoft.com/office/word/2020/wordml/sdtdatahash" xmlns:w16se="http://schemas.microsoft.com/office/word/2015/wordml/symex" xmlns:wpg="http://schemas.microsoft.com/office/word/2010/wordprocessingGroup" xmlns:wpi="http://schemas.microsoft.com/office/word/2010/wordprocessingInk" xmlns:wne="http://schemas.microsoft.com/office/word/2006/wordml" xmlns:wps="http://schemas.microsoft.com/office/word/2010/wordprocessingShape" mc:Ignorable="w14 w15 w16se w16cid w16 w16cex w16sdtdh wp14">
   <w:abstractNum w:abstractNumId="0" w15:restartNumberingAfterBreak="0">
     <w:nsid w:val="FFFFFF89"/>
     <w:multiLevelType w:val="singleLevel"/>
@@ -11015,49 +11901,49 @@
       </w:pPr>
     </w:lvl>
   </w:abstractNum>
-  <w:num w:numId="1" w16cid:durableId="1314217423">
+  <w:num w:numId="1">
     <w:abstractNumId w:val="14"/>
   </w:num>
-  <w:num w:numId="2" w16cid:durableId="1919438483">
+  <w:num w:numId="2">
     <w:abstractNumId w:val="0"/>
   </w:num>
-  <w:num w:numId="3" w16cid:durableId="1341156453">
+  <w:num w:numId="3">
     <w:abstractNumId w:val="6"/>
   </w:num>
-  <w:num w:numId="4" w16cid:durableId="446042633">
+  <w:num w:numId="4">
     <w:abstractNumId w:val="10"/>
   </w:num>
-  <w:num w:numId="5" w16cid:durableId="51730914">
+  <w:num w:numId="5">
     <w:abstractNumId w:val="7"/>
   </w:num>
-  <w:num w:numId="6" w16cid:durableId="682513716">
+  <w:num w:numId="6">
     <w:abstractNumId w:val="4"/>
   </w:num>
-  <w:num w:numId="7" w16cid:durableId="1324890919">
+  <w:num w:numId="7">
     <w:abstractNumId w:val="12"/>
   </w:num>
-  <w:num w:numId="8" w16cid:durableId="1771314659">
+  <w:num w:numId="8">
     <w:abstractNumId w:val="3"/>
   </w:num>
-  <w:num w:numId="9" w16cid:durableId="1343121143">
+  <w:num w:numId="9">
     <w:abstractNumId w:val="8"/>
   </w:num>
-  <w:num w:numId="10" w16cid:durableId="1418558653">
+  <w:num w:numId="10">
     <w:abstractNumId w:val="2"/>
   </w:num>
-  <w:num w:numId="11" w16cid:durableId="504591453">
+  <w:num w:numId="11">
     <w:abstractNumId w:val="9"/>
   </w:num>
-  <w:num w:numId="12" w16cid:durableId="1152478013">
+  <w:num w:numId="12">
     <w:abstractNumId w:val="5"/>
   </w:num>
-  <w:num w:numId="13" w16cid:durableId="890337523">
+  <w:num w:numId="13">
     <w:abstractNumId w:val="11"/>
   </w:num>
-  <w:num w:numId="14" w16cid:durableId="9526349">
+  <w:num w:numId="14">
     <w:abstractNumId w:val="13"/>
   </w:num>
-  <w:num w:numId="15" w16cid:durableId="1051882466">
+  <w:num w:numId="15">
     <w:abstractNumId w:val="1"/>
   </w:num>
   <w:numIdMacAtCleanup w:val="15"/>
@@ -11065,7 +11951,7 @@
 </file>
 
 <file path=word/styles.xml><?xml version="1.0" encoding="utf-8"?>
-<w:styles xmlns:mc="http://schemas.openxmlformats.org/markup-compatibility/2006" xmlns:r="http://schemas.openxmlformats.org/officeDocument/2006/relationships" xmlns:w="http://schemas.openxmlformats.org/wordprocessingml/2006/main" xmlns:w14="http://schemas.microsoft.com/office/word/2010/wordml" xmlns:w15="http://schemas.microsoft.com/office/word/2012/wordml" xmlns:w16cex="http://schemas.microsoft.com/office/word/2018/wordml/cex" xmlns:w16cid="http://schemas.microsoft.com/office/word/2016/wordml/cid" xmlns:w16="http://schemas.microsoft.com/office/word/2018/wordml" xmlns:w16du="http://schemas.microsoft.com/office/word/2023/wordml/word16du" xmlns:w16sdtdh="http://schemas.microsoft.com/office/word/2020/wordml/sdtdatahash" xmlns:w16se="http://schemas.microsoft.com/office/word/2015/wordml/symex" mc:Ignorable="w14 w15 w16se w16cid w16 w16cex w16sdtdh w16du">
+<w:styles xmlns:mc="http://schemas.openxmlformats.org/markup-compatibility/2006" xmlns:r="http://schemas.openxmlformats.org/officeDocument/2006/relationships" xmlns:w="http://schemas.openxmlformats.org/wordprocessingml/2006/main" xmlns:w14="http://schemas.microsoft.com/office/word/2010/wordml" xmlns:w15="http://schemas.microsoft.com/office/word/2012/wordml" xmlns:w16cex="http://schemas.microsoft.com/office/word/2018/wordml/cex" xmlns:w16cid="http://schemas.microsoft.com/office/word/2016/wordml/cid" xmlns:w16="http://schemas.microsoft.com/office/word/2018/wordml" xmlns:w16sdtdh="http://schemas.microsoft.com/office/word/2020/wordml/sdtdatahash" xmlns:w16se="http://schemas.microsoft.com/office/word/2015/wordml/symex" mc:Ignorable="w14 w15 w16se w16cid w16 w16cex w16sdtdh">
   <w:docDefaults>
     <w:rPrDefault>
       <w:rPr>
@@ -12676,6 +13562,30 @@
 </file>
 
 <file path=customXml/item1.xml><?xml version="1.0" encoding="utf-8"?>
+<?mso-contentType ?>
+<FormTemplates xmlns="http://schemas.microsoft.com/sharepoint/v3/contenttype/forms">
+  <Display>DocumentLibraryForm</Display>
+  <Edit>DocumentLibraryForm</Edit>
+  <New>DocumentLibraryForm</New>
+</FormTemplates>
+</file>
+
+<file path=customXml/item2.xml><?xml version="1.0" encoding="utf-8"?>
+<b:Sources xmlns:b="http://schemas.openxmlformats.org/officeDocument/2006/bibliography" xmlns="http://schemas.openxmlformats.org/officeDocument/2006/bibliography" SelectedStyle="\APASixthEditionOfficeOnline.xsl" StyleName="APA" Version="6"/>
+</file>
+
+<file path=customXml/item3.xml><?xml version="1.0" encoding="utf-8"?>
+<p:properties xmlns:p="http://schemas.microsoft.com/office/2006/metadata/properties" xmlns:xsi="http://www.w3.org/2001/XMLSchema-instance" xmlns:pc="http://schemas.microsoft.com/office/infopath/2007/PartnerControls">
+  <documentManagement>
+    <TaxCatchAll xmlns="cb45339b-ced9-4d0d-8f64-77573914d53b" xsi:nil="true"/>
+    <lcf76f155ced4ddcb4097134ff3c332f xmlns="43a3ca16-9c26-4813-b83f-4aec9927b43f">
+      <Terms xmlns="http://schemas.microsoft.com/office/infopath/2007/PartnerControls"/>
+    </lcf76f155ced4ddcb4097134ff3c332f>
+  </documentManagement>
+</p:properties>
+</file>
+
+<file path=customXml/item4.xml><?xml version="1.0" encoding="utf-8"?>
 <ct:contentTypeSchema xmlns:ct="http://schemas.microsoft.com/office/2006/metadata/contentType" xmlns:ma="http://schemas.microsoft.com/office/2006/metadata/properties/metaAttributes" ct:_="" ma:_="" ma:contentTypeName="Documento" ma:contentTypeID="0x01010049282E1EDBE9234EA9E6D38F720E265F" ma:contentTypeVersion="15" ma:contentTypeDescription="Crear nuevo documento." ma:contentTypeScope="" ma:versionID="b31c7aa9eaf043a08b87120b3c4916e3">
   <xsd:schema xmlns:xsd="http://www.w3.org/2001/XMLSchema" xmlns:xs="http://www.w3.org/2001/XMLSchema" xmlns:p="http://schemas.microsoft.com/office/2006/metadata/properties" xmlns:ns2="cb45339b-ced9-4d0d-8f64-77573914d53b" xmlns:ns3="43a3ca16-9c26-4813-b83f-4aec9927b43f" targetNamespace="http://schemas.microsoft.com/office/2006/metadata/properties" ma:root="true" ma:fieldsID="3533d065b04d75c457075bc55f1f5315" ns2:_="" ns3:_="">
     <xsd:import namespace="cb45339b-ced9-4d0d-8f64-77573914d53b"/>
@@ -12910,31 +13820,34 @@
 </ct:contentTypeSchema>
 </file>
 
-<file path=customXml/item2.xml><?xml version="1.0" encoding="utf-8"?>
-<?mso-contentType ?>
-<FormTemplates xmlns="http://schemas.microsoft.com/sharepoint/v3/contenttype/forms">
-  <Display>DocumentLibraryForm</Display>
-  <Edit>DocumentLibraryForm</Edit>
-  <New>DocumentLibraryForm</New>
-</FormTemplates>
+<file path=customXml/itemProps1.xml><?xml version="1.0" encoding="utf-8"?>
+<ds:datastoreItem xmlns:ds="http://schemas.openxmlformats.org/officeDocument/2006/customXml" ds:itemID="{A5BAEF12-43FB-47FA-B5D4-90C7C15519C3}">
+  <ds:schemaRefs>
+    <ds:schemaRef ds:uri="http://schemas.microsoft.com/sharepoint/v3/contenttype/forms"/>
+  </ds:schemaRefs>
+</ds:datastoreItem>
 </file>
 
-<file path=customXml/item3.xml><?xml version="1.0" encoding="utf-8"?>
-<b:Sources xmlns:b="http://schemas.openxmlformats.org/officeDocument/2006/bibliography" xmlns="http://schemas.openxmlformats.org/officeDocument/2006/bibliography" SelectedStyle="\APASixthEditionOfficeOnline.xsl" StyleName="APA" Version="6"/>
+<file path=customXml/itemProps2.xml><?xml version="1.0" encoding="utf-8"?>
+<ds:datastoreItem xmlns:ds="http://schemas.openxmlformats.org/officeDocument/2006/customXml" ds:itemID="{2C90657B-E173-4A75-BCA0-FF6AEEDDF864}">
+  <ds:schemaRefs>
+    <ds:schemaRef ds:uri="http://schemas.openxmlformats.org/officeDocument/2006/bibliography"/>
+  </ds:schemaRefs>
+</ds:datastoreItem>
 </file>
 
-<file path=customXml/item4.xml><?xml version="1.0" encoding="utf-8"?>
-<p:properties xmlns:p="http://schemas.microsoft.com/office/2006/metadata/properties" xmlns:xsi="http://www.w3.org/2001/XMLSchema-instance" xmlns:pc="http://schemas.microsoft.com/office/infopath/2007/PartnerControls">
-  <documentManagement>
-    <TaxCatchAll xmlns="cb45339b-ced9-4d0d-8f64-77573914d53b" xsi:nil="true"/>
-    <lcf76f155ced4ddcb4097134ff3c332f xmlns="43a3ca16-9c26-4813-b83f-4aec9927b43f">
-      <Terms xmlns="http://schemas.microsoft.com/office/infopath/2007/PartnerControls"/>
-    </lcf76f155ced4ddcb4097134ff3c332f>
-  </documentManagement>
-</p:properties>
+<file path=customXml/itemProps3.xml><?xml version="1.0" encoding="utf-8"?>
+<ds:datastoreItem xmlns:ds="http://schemas.openxmlformats.org/officeDocument/2006/customXml" ds:itemID="{5AEED715-CC2E-4342-83D9-BB8003AB97FF}">
+  <ds:schemaRefs>
+    <ds:schemaRef ds:uri="http://schemas.microsoft.com/office/2006/metadata/properties"/>
+    <ds:schemaRef ds:uri="http://schemas.microsoft.com/office/infopath/2007/PartnerControls"/>
+    <ds:schemaRef ds:uri="cb45339b-ced9-4d0d-8f64-77573914d53b"/>
+    <ds:schemaRef ds:uri="43a3ca16-9c26-4813-b83f-4aec9927b43f"/>
+  </ds:schemaRefs>
+</ds:datastoreItem>
 </file>
 
-<file path=customXml/itemProps1.xml><?xml version="1.0" encoding="utf-8"?>
+<file path=customXml/itemProps4.xml><?xml version="1.0" encoding="utf-8"?>
 <ds:datastoreItem xmlns:ds="http://schemas.openxmlformats.org/officeDocument/2006/customXml" ds:itemID="{BC43748E-18A0-45DF-A7B9-8916FDCD2B64}">
   <ds:schemaRefs>
     <ds:schemaRef ds:uri="http://schemas.microsoft.com/office/2006/metadata/contentType"/>
@@ -12951,31 +13864,4 @@
     <ds:schemaRef ds:uri="http://schemas.microsoft.com/internal/obd"/>
   </ds:schemaRefs>
 </ds:datastoreItem>
-</file>
-
-<file path=customXml/itemProps2.xml><?xml version="1.0" encoding="utf-8"?>
-<ds:datastoreItem xmlns:ds="http://schemas.openxmlformats.org/officeDocument/2006/customXml" ds:itemID="{A5BAEF12-43FB-47FA-B5D4-90C7C15519C3}">
-  <ds:schemaRefs>
-    <ds:schemaRef ds:uri="http://schemas.microsoft.com/sharepoint/v3/contenttype/forms"/>
-  </ds:schemaRefs>
-</ds:datastoreItem>
-</file>
-
-<file path=customXml/itemProps3.xml><?xml version="1.0" encoding="utf-8"?>
-<ds:datastoreItem xmlns:ds="http://schemas.openxmlformats.org/officeDocument/2006/customXml" ds:itemID="{2C90657B-E173-4A75-BCA0-FF6AEEDDF864}">
-  <ds:schemaRefs>
-    <ds:schemaRef ds:uri="http://schemas.openxmlformats.org/officeDocument/2006/bibliography"/>
-  </ds:schemaRefs>
-</ds:datastoreItem>
-</file>
-
-<file path=customXml/itemProps4.xml><?xml version="1.0" encoding="utf-8"?>
-<ds:datastoreItem xmlns:ds="http://schemas.openxmlformats.org/officeDocument/2006/customXml" ds:itemID="{5AEED715-CC2E-4342-83D9-BB8003AB97FF}">
-  <ds:schemaRefs>
-    <ds:schemaRef ds:uri="http://schemas.microsoft.com/office/2006/metadata/properties"/>
-    <ds:schemaRef ds:uri="http://schemas.microsoft.com/office/infopath/2007/PartnerControls"/>
-    <ds:schemaRef ds:uri="cb45339b-ced9-4d0d-8f64-77573914d53b"/>
-    <ds:schemaRef ds:uri="43a3ca16-9c26-4813-b83f-4aec9927b43f"/>
-  </ds:schemaRefs>
-</ds:datastoreItem>
 </file>
</xml_diff>